<commit_message>
chapter 2 of the Leadership and the rise of great powers
</commit_message>
<xml_diff>
--- a/Realism/Leadership and the rise of great powers Yan Xuetong.docx
+++ b/Realism/Leadership and the rise of great powers Yan Xuetong.docx
@@ -12,7 +12,21 @@
         <w:rPr>
           <w:lang w:val="en-US"/>
         </w:rPr>
-        <w:t>‘National interests are usually categorized under the domains of politics, security, economy and culture’ – why there is no science? Why this domain is so often left outside?</w:t>
+        <w:t xml:space="preserve">‘National interests are usually categorized under the domains of politics, security, economy and culture’ – why there is no science? Why </w:t>
+      </w:r>
+      <w:proofErr w:type="gramStart"/>
+      <w:r>
+        <w:rPr>
+          <w:lang w:val="en-US"/>
+        </w:rPr>
+        <w:t>this domain is</w:t>
+      </w:r>
+      <w:proofErr w:type="gramEnd"/>
+      <w:r>
+        <w:rPr>
+          <w:lang w:val="en-US"/>
+        </w:rPr>
+        <w:t xml:space="preserve"> so often left outside?</w:t>
       </w:r>
     </w:p>
     <w:p>
@@ -58,7 +72,147 @@
         <w:rPr>
           <w:lang w:val="en-US"/>
         </w:rPr>
-        <w:t>I would say that this is the CC(max) as in reality there is also a factor of utilization of M,E,C. You can have huge eceonimcal potential but if you are unable to force people into benefiting yours goal… it would mean nothing. You can have the biggest deposit of oil in the world, it wont benefit you if you do not untilise this resources. It is only a potential of the capability. Each of the M,E,C should be multiply by a % of utilization.</w:t>
+        <w:t xml:space="preserve">I would say that this is the </w:t>
+      </w:r>
+      <w:proofErr w:type="gramStart"/>
+      <w:r>
+        <w:rPr>
+          <w:lang w:val="en-US"/>
+        </w:rPr>
+        <w:t>CC(</w:t>
+      </w:r>
+      <w:proofErr w:type="gramEnd"/>
+      <w:r>
+        <w:rPr>
+          <w:lang w:val="en-US"/>
+        </w:rPr>
+        <w:t xml:space="preserve">max) as in reality there is also a factor of utilization of </w:t>
+      </w:r>
+      <w:proofErr w:type="gramStart"/>
+      <w:r>
+        <w:rPr>
+          <w:lang w:val="en-US"/>
+        </w:rPr>
+        <w:t>M,E</w:t>
+      </w:r>
+      <w:proofErr w:type="gramEnd"/>
+      <w:r>
+        <w:rPr>
+          <w:lang w:val="en-US"/>
+        </w:rPr>
+        <w:t xml:space="preserve">,C. You can have huge </w:t>
+      </w:r>
+      <w:proofErr w:type="spellStart"/>
+      <w:r>
+        <w:rPr>
+          <w:lang w:val="en-US"/>
+        </w:rPr>
+        <w:t>eceonimcal</w:t>
+      </w:r>
+      <w:proofErr w:type="spellEnd"/>
+      <w:r>
+        <w:rPr>
+          <w:lang w:val="en-US"/>
+        </w:rPr>
+        <w:t xml:space="preserve"> potential but if you are unable to force people into benefiting </w:t>
+      </w:r>
+      <w:proofErr w:type="gramStart"/>
+      <w:r>
+        <w:rPr>
+          <w:lang w:val="en-US"/>
+        </w:rPr>
+        <w:t>yours</w:t>
+      </w:r>
+      <w:proofErr w:type="gramEnd"/>
+      <w:r>
+        <w:rPr>
+          <w:lang w:val="en-US"/>
+        </w:rPr>
+        <w:t xml:space="preserve"> goal… it would mean nothing. You can have the biggest deposit of oil in the world, it wont benefit you if you do not </w:t>
+      </w:r>
+      <w:proofErr w:type="spellStart"/>
+      <w:r>
+        <w:rPr>
+          <w:lang w:val="en-US"/>
+        </w:rPr>
+        <w:t>untilise</w:t>
+      </w:r>
+      <w:proofErr w:type="spellEnd"/>
+      <w:r>
+        <w:rPr>
+          <w:lang w:val="en-US"/>
+        </w:rPr>
+        <w:t xml:space="preserve"> </w:t>
+      </w:r>
+      <w:proofErr w:type="gramStart"/>
+      <w:r>
+        <w:rPr>
+          <w:lang w:val="en-US"/>
+        </w:rPr>
+        <w:t>this resources</w:t>
+      </w:r>
+      <w:proofErr w:type="gramEnd"/>
+      <w:r>
+        <w:rPr>
+          <w:lang w:val="en-US"/>
+        </w:rPr>
+        <w:t xml:space="preserve">. It is only </w:t>
+      </w:r>
+      <w:proofErr w:type="gramStart"/>
+      <w:r>
+        <w:rPr>
+          <w:lang w:val="en-US"/>
+        </w:rPr>
+        <w:t>a potential</w:t>
+      </w:r>
+      <w:proofErr w:type="gramEnd"/>
+      <w:r>
+        <w:rPr>
+          <w:lang w:val="en-US"/>
+        </w:rPr>
+        <w:t xml:space="preserve"> of </w:t>
+      </w:r>
+      <w:proofErr w:type="gramStart"/>
+      <w:r>
+        <w:rPr>
+          <w:lang w:val="en-US"/>
+        </w:rPr>
+        <w:t>the capability</w:t>
+      </w:r>
+      <w:proofErr w:type="gramEnd"/>
+      <w:r>
+        <w:rPr>
+          <w:lang w:val="en-US"/>
+        </w:rPr>
+        <w:t xml:space="preserve">. Each of the </w:t>
+      </w:r>
+      <w:proofErr w:type="gramStart"/>
+      <w:r>
+        <w:rPr>
+          <w:lang w:val="en-US"/>
+        </w:rPr>
+        <w:t>M,E</w:t>
+      </w:r>
+      <w:proofErr w:type="gramEnd"/>
+      <w:r>
+        <w:rPr>
+          <w:lang w:val="en-US"/>
+        </w:rPr>
+        <w:t xml:space="preserve">,C should be </w:t>
+      </w:r>
+      <w:proofErr w:type="gramStart"/>
+      <w:r>
+        <w:rPr>
+          <w:lang w:val="en-US"/>
+        </w:rPr>
+        <w:t>multiply</w:t>
+      </w:r>
+      <w:proofErr w:type="gramEnd"/>
+      <w:r>
+        <w:rPr>
+          <w:lang w:val="en-US"/>
+        </w:rPr>
+        <w:t xml:space="preserve"> by a % of utilization.</w:t>
       </w:r>
     </w:p>
     <w:p>
@@ -98,46 +252,242 @@
         <w:rPr>
           <w:lang w:val="en-US"/>
         </w:rPr>
-        <w:t>‘country attractiveness is based on the deeds of that country’s leadership rather than on its culture and political value’ I will disagree. Japan did a lot of very unvirtous things yet is viewed as attractive.</w:t>
-      </w:r>
-    </w:p>
-    <w:p>
-      <w:pPr>
-        <w:rPr>
-          <w:lang w:val="en-US"/>
-        </w:rPr>
-      </w:pPr>
-      <w:r>
-        <w:rPr>
-          <w:lang w:val="en-US"/>
-        </w:rPr>
-        <w:t>Argument for attractivness of the s</w:t>
-      </w:r>
-      <w:r>
-        <w:rPr>
-          <w:lang w:val="en-US"/>
-        </w:rPr>
-        <w:t>tate is… Trump. US soft power diminished rapidly because of the change of leadership into extremally impotent… I can see this argument yet I think that not the leadership itself is the issiue. It is second term of Trump and he did not had such terrific effect in first term. The difference is in the actions. US Gestapo (ICE) killing people on the streats and throwing kids from state as well as detaining completely legal residents and citizens. Treathenning the annexation of European theritory… ok we can counter by counter with statement that the policy chosen to be implemented is by.. leadership. That would be a +1 for Yan.</w:t>
-      </w:r>
-    </w:p>
-    <w:p>
-      <w:pPr>
-        <w:rPr>
-          <w:lang w:val="en-US"/>
-        </w:rPr>
-      </w:pPr>
-    </w:p>
-    <w:p>
-      <w:pPr>
-        <w:rPr>
-          <w:lang w:val="en-US"/>
-        </w:rPr>
-      </w:pPr>
-      <w:r>
-        <w:rPr>
-          <w:lang w:val="en-US"/>
-        </w:rPr>
-        <w:t>Yan make shit on ‘smart power’ concept. I have seen it and smiled. Fuck this abomination.</w:t>
+        <w:t>‘</w:t>
+      </w:r>
+      <w:proofErr w:type="gramStart"/>
+      <w:r>
+        <w:rPr>
+          <w:lang w:val="en-US"/>
+        </w:rPr>
+        <w:t>country</w:t>
+      </w:r>
+      <w:proofErr w:type="gramEnd"/>
+      <w:r>
+        <w:rPr>
+          <w:lang w:val="en-US"/>
+        </w:rPr>
+        <w:t xml:space="preserve"> attractiveness is based on the deeds of that country’s leadership rather than on its culture and political value’ I will disagree. Japan did a lot of very </w:t>
+      </w:r>
+      <w:proofErr w:type="spellStart"/>
+      <w:r>
+        <w:rPr>
+          <w:lang w:val="en-US"/>
+        </w:rPr>
+        <w:t>unvirtous</w:t>
+      </w:r>
+      <w:proofErr w:type="spellEnd"/>
+      <w:r>
+        <w:rPr>
+          <w:lang w:val="en-US"/>
+        </w:rPr>
+        <w:t xml:space="preserve"> things yet is viewed as attractive.</w:t>
+      </w:r>
+    </w:p>
+    <w:p>
+      <w:pPr>
+        <w:rPr>
+          <w:lang w:val="en-US"/>
+        </w:rPr>
+      </w:pPr>
+      <w:r>
+        <w:rPr>
+          <w:lang w:val="en-US"/>
+        </w:rPr>
+        <w:t xml:space="preserve">Argument for </w:t>
+      </w:r>
+      <w:proofErr w:type="spellStart"/>
+      <w:r>
+        <w:rPr>
+          <w:lang w:val="en-US"/>
+        </w:rPr>
+        <w:t>attractivness</w:t>
+      </w:r>
+      <w:proofErr w:type="spellEnd"/>
+      <w:r>
+        <w:rPr>
+          <w:lang w:val="en-US"/>
+        </w:rPr>
+        <w:t xml:space="preserve"> of the s</w:t>
+      </w:r>
+      <w:r>
+        <w:rPr>
+          <w:lang w:val="en-US"/>
+        </w:rPr>
+        <w:t xml:space="preserve">tate is… Trump. US soft power diminished rapidly because of the change of leadership into extremally impotent… I can see this </w:t>
+      </w:r>
+      <w:proofErr w:type="gramStart"/>
+      <w:r>
+        <w:rPr>
+          <w:lang w:val="en-US"/>
+        </w:rPr>
+        <w:t>argument</w:t>
+      </w:r>
+      <w:proofErr w:type="gramEnd"/>
+      <w:r>
+        <w:rPr>
+          <w:lang w:val="en-US"/>
+        </w:rPr>
+        <w:t xml:space="preserve"> yet I think that </w:t>
+      </w:r>
+      <w:proofErr w:type="gramStart"/>
+      <w:r>
+        <w:rPr>
+          <w:lang w:val="en-US"/>
+        </w:rPr>
+        <w:t>not the leadership itself is</w:t>
+      </w:r>
+      <w:proofErr w:type="gramEnd"/>
+      <w:r>
+        <w:rPr>
+          <w:lang w:val="en-US"/>
+        </w:rPr>
+        <w:t xml:space="preserve"> the </w:t>
+      </w:r>
+      <w:proofErr w:type="spellStart"/>
+      <w:r>
+        <w:rPr>
+          <w:lang w:val="en-US"/>
+        </w:rPr>
+        <w:t>issiue</w:t>
+      </w:r>
+      <w:proofErr w:type="spellEnd"/>
+      <w:r>
+        <w:rPr>
+          <w:lang w:val="en-US"/>
+        </w:rPr>
+        <w:t xml:space="preserve">. It is second term of </w:t>
+      </w:r>
+      <w:proofErr w:type="gramStart"/>
+      <w:r>
+        <w:rPr>
+          <w:lang w:val="en-US"/>
+        </w:rPr>
+        <w:t>Trump</w:t>
+      </w:r>
+      <w:proofErr w:type="gramEnd"/>
+      <w:r>
+        <w:rPr>
+          <w:lang w:val="en-US"/>
+        </w:rPr>
+        <w:t xml:space="preserve"> and he did not </w:t>
+      </w:r>
+      <w:proofErr w:type="gramStart"/>
+      <w:r>
+        <w:rPr>
+          <w:lang w:val="en-US"/>
+        </w:rPr>
+        <w:t>had</w:t>
+      </w:r>
+      <w:proofErr w:type="gramEnd"/>
+      <w:r>
+        <w:rPr>
+          <w:lang w:val="en-US"/>
+        </w:rPr>
+        <w:t xml:space="preserve"> such terrific effect in first term. The difference is in the actions. US Gestapo (ICE) killing people on the </w:t>
+      </w:r>
+      <w:proofErr w:type="spellStart"/>
+      <w:r>
+        <w:rPr>
+          <w:lang w:val="en-US"/>
+        </w:rPr>
+        <w:t>streats</w:t>
+      </w:r>
+      <w:proofErr w:type="spellEnd"/>
+      <w:r>
+        <w:rPr>
+          <w:lang w:val="en-US"/>
+        </w:rPr>
+        <w:t xml:space="preserve"> and throwing kids from state as well as detaining completely legal residents and citizens. </w:t>
+      </w:r>
+      <w:proofErr w:type="spellStart"/>
+      <w:r>
+        <w:rPr>
+          <w:lang w:val="en-US"/>
+        </w:rPr>
+        <w:t>Treathenning</w:t>
+      </w:r>
+      <w:proofErr w:type="spellEnd"/>
+      <w:r>
+        <w:rPr>
+          <w:lang w:val="en-US"/>
+        </w:rPr>
+        <w:t xml:space="preserve"> the annexation of European </w:t>
+      </w:r>
+      <w:proofErr w:type="spellStart"/>
+      <w:r>
+        <w:rPr>
+          <w:lang w:val="en-US"/>
+        </w:rPr>
+        <w:t>theritory</w:t>
+      </w:r>
+      <w:proofErr w:type="spellEnd"/>
+      <w:r>
+        <w:rPr>
+          <w:lang w:val="en-US"/>
+        </w:rPr>
+        <w:t xml:space="preserve">… ok we can counter by counter with statement that the policy chosen to be implemented is </w:t>
+      </w:r>
+      <w:proofErr w:type="gramStart"/>
+      <w:r>
+        <w:rPr>
+          <w:lang w:val="en-US"/>
+        </w:rPr>
+        <w:t>by..</w:t>
+      </w:r>
+      <w:proofErr w:type="gramEnd"/>
+      <w:r>
+        <w:rPr>
+          <w:lang w:val="en-US"/>
+        </w:rPr>
+        <w:t xml:space="preserve"> leadership. That would be a +1 for Yan.</w:t>
+      </w:r>
+    </w:p>
+    <w:p>
+      <w:pPr>
+        <w:rPr>
+          <w:lang w:val="en-US"/>
+        </w:rPr>
+      </w:pPr>
+    </w:p>
+    <w:p>
+      <w:pPr>
+        <w:rPr>
+          <w:lang w:val="en-US"/>
+        </w:rPr>
+      </w:pPr>
+      <w:r>
+        <w:rPr>
+          <w:lang w:val="en-US"/>
+        </w:rPr>
+        <w:t xml:space="preserve">Yan </w:t>
+      </w:r>
+      <w:proofErr w:type="gramStart"/>
+      <w:r>
+        <w:rPr>
+          <w:lang w:val="en-US"/>
+        </w:rPr>
+        <w:t>make</w:t>
+      </w:r>
+      <w:proofErr w:type="gramEnd"/>
+      <w:r>
+        <w:rPr>
+          <w:lang w:val="en-US"/>
+        </w:rPr>
+        <w:t xml:space="preserve"> shit on ‘smart power’ concept. I </w:t>
+      </w:r>
+      <w:proofErr w:type="gramStart"/>
+      <w:r>
+        <w:rPr>
+          <w:lang w:val="en-US"/>
+        </w:rPr>
+        <w:t>have seen</w:t>
+      </w:r>
+      <w:proofErr w:type="gramEnd"/>
+      <w:r>
+        <w:rPr>
+          <w:lang w:val="en-US"/>
+        </w:rPr>
+        <w:t xml:space="preserve"> it and smiled. Fuck this abomination.</w:t>
       </w:r>
     </w:p>
     <w:p>
@@ -163,7 +513,49 @@
         <w:rPr>
           <w:lang w:val="en-US"/>
         </w:rPr>
-        <w:t>regional, raising and small states. (I much more prefer the status-quo vs revisionist power)</w:t>
+        <w:t xml:space="preserve">regional, </w:t>
+      </w:r>
+      <w:proofErr w:type="gramStart"/>
+      <w:r>
+        <w:rPr>
+          <w:lang w:val="en-US"/>
+        </w:rPr>
+        <w:t>raising</w:t>
+      </w:r>
+      <w:proofErr w:type="gramEnd"/>
+      <w:r>
+        <w:rPr>
+          <w:lang w:val="en-US"/>
+        </w:rPr>
+        <w:t xml:space="preserve"> and small states. (I </w:t>
+      </w:r>
+      <w:proofErr w:type="gramStart"/>
+      <w:r>
+        <w:rPr>
+          <w:lang w:val="en-US"/>
+        </w:rPr>
+        <w:t>much more</w:t>
+      </w:r>
+      <w:proofErr w:type="gramEnd"/>
+      <w:r>
+        <w:rPr>
+          <w:lang w:val="en-US"/>
+        </w:rPr>
+        <w:t xml:space="preserve"> prefer the </w:t>
+      </w:r>
+      <w:proofErr w:type="gramStart"/>
+      <w:r>
+        <w:rPr>
+          <w:lang w:val="en-US"/>
+        </w:rPr>
+        <w:t>status-quo</w:t>
+      </w:r>
+      <w:proofErr w:type="gramEnd"/>
+      <w:r>
+        <w:rPr>
+          <w:lang w:val="en-US"/>
+        </w:rPr>
+        <w:t xml:space="preserve"> vs revisionist power)</w:t>
       </w:r>
     </w:p>
     <w:p>
@@ -177,20 +569,99 @@
           <w:lang w:val="en-US"/>
         </w:rPr>
         <w:lastRenderedPageBreak/>
-        <w:t>Small states want to survive, rising power wants more power, dominant want to stay in power same as regional…. IMO it is stupid because this doesn’t follow either quo vs revisionists, doesn’t addres the problem of security (only partially), or the ‘all states seeks hegemony’ issiue which is a result of ‘if all actors wants more power than they will never be satisfy with what they have.</w:t>
-      </w:r>
-    </w:p>
-    <w:p>
-      <w:pPr>
-        <w:rPr>
-          <w:lang w:val="en-US"/>
-        </w:rPr>
-      </w:pPr>
-    </w:p>
-    <w:p>
-      <w:pPr>
-        <w:rPr>
-          <w:lang w:val="en-US"/>
+        <w:t xml:space="preserve">Small states want to survive, rising power wants more power, dominant want to stay in power same as regional…. IMO it is stupid because this doesn’t follow either quo vs revisionists, doesn’t </w:t>
+      </w:r>
+      <w:proofErr w:type="spellStart"/>
+      <w:r>
+        <w:rPr>
+          <w:lang w:val="en-US"/>
+        </w:rPr>
+        <w:t>addres</w:t>
+      </w:r>
+      <w:proofErr w:type="spellEnd"/>
+      <w:r>
+        <w:rPr>
+          <w:lang w:val="en-US"/>
+        </w:rPr>
+        <w:t xml:space="preserve"> the problem of security (only partially), or the ‘all states </w:t>
+      </w:r>
+      <w:proofErr w:type="gramStart"/>
+      <w:r>
+        <w:rPr>
+          <w:lang w:val="en-US"/>
+        </w:rPr>
+        <w:t>seeks</w:t>
+      </w:r>
+      <w:proofErr w:type="gramEnd"/>
+      <w:r>
+        <w:rPr>
+          <w:lang w:val="en-US"/>
+        </w:rPr>
+        <w:t xml:space="preserve"> </w:t>
+      </w:r>
+      <w:proofErr w:type="gramStart"/>
+      <w:r>
+        <w:rPr>
+          <w:lang w:val="en-US"/>
+        </w:rPr>
+        <w:t xml:space="preserve">hegemony’ </w:t>
+      </w:r>
+      <w:proofErr w:type="spellStart"/>
+      <w:r>
+        <w:rPr>
+          <w:lang w:val="en-US"/>
+        </w:rPr>
+        <w:t>issiue</w:t>
+      </w:r>
+      <w:proofErr w:type="spellEnd"/>
+      <w:proofErr w:type="gramEnd"/>
+      <w:r>
+        <w:rPr>
+          <w:lang w:val="en-US"/>
+        </w:rPr>
+        <w:t xml:space="preserve"> which is a result of ‘if all actors </w:t>
+      </w:r>
+      <w:proofErr w:type="gramStart"/>
+      <w:r>
+        <w:rPr>
+          <w:lang w:val="en-US"/>
+        </w:rPr>
+        <w:t>wants</w:t>
+      </w:r>
+      <w:proofErr w:type="gramEnd"/>
+      <w:r>
+        <w:rPr>
+          <w:lang w:val="en-US"/>
+        </w:rPr>
+        <w:t xml:space="preserve"> more power than they will never be </w:t>
+      </w:r>
+      <w:proofErr w:type="gramStart"/>
+      <w:r>
+        <w:rPr>
+          <w:lang w:val="en-US"/>
+        </w:rPr>
+        <w:t>satisfy</w:t>
+      </w:r>
+      <w:proofErr w:type="gramEnd"/>
+      <w:r>
+        <w:rPr>
+          <w:lang w:val="en-US"/>
+        </w:rPr>
+        <w:t xml:space="preserve"> with what they have.</w:t>
+      </w:r>
+    </w:p>
+    <w:p>
+      <w:pPr>
+        <w:rPr>
+          <w:lang w:val="en-US"/>
+        </w:rPr>
+      </w:pPr>
+    </w:p>
+    <w:p>
+      <w:pPr>
+        <w:rPr>
+          <w:rFonts w:eastAsia="Yu Mincho"/>
+          <w:lang w:val="en-US" w:eastAsia="ja-JP"/>
         </w:rPr>
       </w:pPr>
       <w:r>
@@ -239,7 +710,3745 @@
         <w:rPr>
           <w:lang w:val="en-US"/>
         </w:rPr>
-        <w:t xml:space="preserve"> Yan sees source of rational and traditional authority in power making those concept redundand and focuses only on charismatic leadership.</w:t>
+        <w:t xml:space="preserve"> Yan sees source of rational and traditional authority in power making those concept </w:t>
+      </w:r>
+      <w:proofErr w:type="spellStart"/>
+      <w:r>
+        <w:rPr>
+          <w:lang w:val="en-US"/>
+        </w:rPr>
+        <w:t>redundand</w:t>
+      </w:r>
+      <w:proofErr w:type="spellEnd"/>
+      <w:r>
+        <w:rPr>
+          <w:lang w:val="en-US"/>
+        </w:rPr>
+        <w:t xml:space="preserve"> and focuses only on charismatic leadership.</w:t>
+      </w:r>
+    </w:p>
+    <w:p>
+      <w:pPr>
+        <w:rPr>
+          <w:rFonts w:eastAsia="Yu Mincho"/>
+          <w:lang w:val="en-US" w:eastAsia="ja-JP"/>
+        </w:rPr>
+      </w:pPr>
+      <w:r>
+        <w:rPr>
+          <w:rFonts w:eastAsia="Yu Mincho" w:hint="eastAsia"/>
+          <w:lang w:val="en-US" w:eastAsia="ja-JP"/>
+        </w:rPr>
+        <w:t xml:space="preserve">Strategic credibility is the </w:t>
+      </w:r>
+      <w:proofErr w:type="gramStart"/>
+      <w:r>
+        <w:rPr>
+          <w:rFonts w:eastAsia="Yu Mincho" w:hint="eastAsia"/>
+          <w:lang w:val="en-US" w:eastAsia="ja-JP"/>
+        </w:rPr>
+        <w:t>basic</w:t>
+      </w:r>
+      <w:proofErr w:type="gramEnd"/>
+      <w:r>
+        <w:rPr>
+          <w:rFonts w:eastAsia="Yu Mincho" w:hint="eastAsia"/>
+          <w:lang w:val="en-US" w:eastAsia="ja-JP"/>
+        </w:rPr>
+        <w:t xml:space="preserve"> for international </w:t>
+      </w:r>
+      <w:proofErr w:type="gramStart"/>
+      <w:r>
+        <w:rPr>
+          <w:rFonts w:eastAsia="Yu Mincho" w:hint="eastAsia"/>
+          <w:lang w:val="en-US" w:eastAsia="ja-JP"/>
+        </w:rPr>
+        <w:t>morality,</w:t>
+      </w:r>
+      <w:proofErr w:type="gramEnd"/>
+      <w:r>
+        <w:rPr>
+          <w:rFonts w:eastAsia="Yu Mincho" w:hint="eastAsia"/>
+          <w:lang w:val="en-US" w:eastAsia="ja-JP"/>
+        </w:rPr>
+        <w:t xml:space="preserve"> thus it is a </w:t>
+      </w:r>
+      <w:r>
+        <w:rPr>
+          <w:rFonts w:eastAsia="Yu Mincho"/>
+          <w:lang w:val="en-US" w:eastAsia="ja-JP"/>
+        </w:rPr>
+        <w:t>precondition</w:t>
+      </w:r>
+      <w:r>
+        <w:rPr>
+          <w:rFonts w:eastAsia="Yu Mincho" w:hint="eastAsia"/>
+          <w:lang w:val="en-US" w:eastAsia="ja-JP"/>
+        </w:rPr>
+        <w:t xml:space="preserve"> for establishing international authority.</w:t>
+      </w:r>
+    </w:p>
+    <w:p>
+      <w:pPr>
+        <w:rPr>
+          <w:rFonts w:eastAsia="Yu Mincho"/>
+          <w:lang w:val="en-US" w:eastAsia="ja-JP"/>
+        </w:rPr>
+      </w:pPr>
+    </w:p>
+    <w:p>
+      <w:pPr>
+        <w:rPr>
+          <w:rFonts w:eastAsia="Yu Mincho"/>
+          <w:lang w:val="en-US" w:eastAsia="ja-JP"/>
+        </w:rPr>
+      </w:pPr>
+      <w:r>
+        <w:rPr>
+          <w:rFonts w:eastAsia="Yu Mincho"/>
+          <w:lang w:val="en-US" w:eastAsia="ja-JP"/>
+        </w:rPr>
+        <w:t>“</w:t>
+      </w:r>
+      <w:r>
+        <w:rPr>
+          <w:rFonts w:eastAsia="Yu Mincho"/>
+          <w:lang w:val="en-US" w:eastAsia="ja-JP"/>
+        </w:rPr>
+        <w:t xml:space="preserve">Morality can directly affect the power of states, because moral actions increase the legitimacy of a state’s leadership, thereby giving that state more </w:t>
+      </w:r>
+      <w:r>
+        <w:rPr>
+          <w:rFonts w:eastAsia="Yu Mincho"/>
+          <w:i/>
+          <w:iCs/>
+          <w:lang w:val="en-US" w:eastAsia="ja-JP"/>
+        </w:rPr>
+        <w:t>influence</w:t>
+      </w:r>
+      <w:r>
+        <w:rPr>
+          <w:rFonts w:eastAsia="Yu Mincho"/>
+          <w:lang w:val="en-US" w:eastAsia="ja-JP"/>
+        </w:rPr>
+        <w:t>.</w:t>
+      </w:r>
+      <w:r>
+        <w:rPr>
+          <w:rFonts w:eastAsia="Yu Mincho"/>
+          <w:lang w:val="en-US" w:eastAsia="ja-JP"/>
+        </w:rPr>
+        <w:t>” P.32 – how we define influence?</w:t>
+      </w:r>
+    </w:p>
+    <w:p>
+      <w:pPr>
+        <w:rPr>
+          <w:rFonts w:eastAsia="Yu Mincho"/>
+          <w:lang w:val="en-US" w:eastAsia="ja-JP"/>
+        </w:rPr>
+      </w:pPr>
+    </w:p>
+    <w:p>
+      <w:pPr>
+        <w:rPr>
+          <w:rFonts w:eastAsia="Yu Mincho"/>
+          <w:lang w:val="en-US" w:eastAsia="ja-JP"/>
+        </w:rPr>
+      </w:pPr>
+      <w:r>
+        <w:rPr>
+          <w:rFonts w:eastAsia="Yu Mincho"/>
+          <w:lang w:val="en-US" w:eastAsia="ja-JP"/>
+        </w:rPr>
+        <w:t>In the book we can see an example of Shinzo Abe lowering moral credibility of a state by visiting shrine of ‘</w:t>
+      </w:r>
+      <w:proofErr w:type="gramStart"/>
+      <w:r>
+        <w:rPr>
+          <w:rFonts w:eastAsia="Yu Mincho"/>
+          <w:lang w:val="en-US" w:eastAsia="ja-JP"/>
+        </w:rPr>
+        <w:t>world war</w:t>
+      </w:r>
+      <w:proofErr w:type="gramEnd"/>
+      <w:r>
+        <w:rPr>
+          <w:rFonts w:eastAsia="Yu Mincho"/>
+          <w:lang w:val="en-US" w:eastAsia="ja-JP"/>
+        </w:rPr>
+        <w:t xml:space="preserve"> 2 class-A war </w:t>
+      </w:r>
+      <w:proofErr w:type="gramStart"/>
+      <w:r>
+        <w:rPr>
+          <w:rFonts w:eastAsia="Yu Mincho"/>
+          <w:lang w:val="en-US" w:eastAsia="ja-JP"/>
+        </w:rPr>
+        <w:t>criminals’</w:t>
+      </w:r>
+      <w:proofErr w:type="gramEnd"/>
+      <w:r>
+        <w:rPr>
+          <w:rFonts w:eastAsia="Yu Mincho"/>
+          <w:lang w:val="en-US" w:eastAsia="ja-JP"/>
+        </w:rPr>
+        <w:t xml:space="preserve">. </w:t>
+      </w:r>
+      <w:proofErr w:type="spellStart"/>
+      <w:proofErr w:type="gramStart"/>
+      <w:r>
+        <w:rPr>
+          <w:rFonts w:eastAsia="Yu Mincho"/>
+          <w:lang w:val="en-US" w:eastAsia="ja-JP"/>
+        </w:rPr>
+        <w:t>Suposedly</w:t>
+      </w:r>
+      <w:proofErr w:type="spellEnd"/>
+      <w:proofErr w:type="gramEnd"/>
+      <w:r>
+        <w:rPr>
+          <w:rFonts w:eastAsia="Yu Mincho"/>
+          <w:lang w:val="en-US" w:eastAsia="ja-JP"/>
+        </w:rPr>
+        <w:t xml:space="preserve"> it produced an outrage in China, Sout Korea and even USA. But I never even </w:t>
+      </w:r>
+      <w:proofErr w:type="spellStart"/>
+      <w:r>
+        <w:rPr>
+          <w:rFonts w:eastAsia="Yu Mincho"/>
+          <w:lang w:val="en-US" w:eastAsia="ja-JP"/>
+        </w:rPr>
+        <w:t>heared</w:t>
+      </w:r>
+      <w:proofErr w:type="spellEnd"/>
+      <w:r>
+        <w:rPr>
+          <w:rFonts w:eastAsia="Yu Mincho"/>
+          <w:lang w:val="en-US" w:eastAsia="ja-JP"/>
+        </w:rPr>
+        <w:t xml:space="preserve"> about this event. </w:t>
+      </w:r>
+      <w:r>
+        <w:rPr>
+          <w:rFonts w:eastAsia="Yu Mincho"/>
+          <w:lang w:val="en-US" w:eastAsia="ja-JP"/>
+        </w:rPr>
+        <w:t xml:space="preserve">Thus, this action by itself did not </w:t>
+      </w:r>
+      <w:proofErr w:type="gramStart"/>
+      <w:r>
+        <w:rPr>
+          <w:rFonts w:eastAsia="Yu Mincho"/>
+          <w:lang w:val="en-US" w:eastAsia="ja-JP"/>
+        </w:rPr>
+        <w:t>affected</w:t>
+      </w:r>
+      <w:proofErr w:type="gramEnd"/>
+      <w:r>
+        <w:rPr>
+          <w:rFonts w:eastAsia="Yu Mincho"/>
+          <w:lang w:val="en-US" w:eastAsia="ja-JP"/>
+        </w:rPr>
+        <w:t xml:space="preserve"> any opinion of Japan in Europe, which points out the limits of moral behavior. </w:t>
+      </w:r>
+    </w:p>
+    <w:p>
+      <w:pPr>
+        <w:rPr>
+          <w:rFonts w:eastAsia="Yu Mincho"/>
+          <w:lang w:val="en-US" w:eastAsia="ja-JP"/>
+        </w:rPr>
+      </w:pPr>
+      <w:r>
+        <w:rPr>
+          <w:rFonts w:eastAsia="Yu Mincho"/>
+          <w:lang w:val="en-US" w:eastAsia="ja-JP"/>
+        </w:rPr>
+        <w:t xml:space="preserve">A lot of relations between states can be shaped by </w:t>
+      </w:r>
+      <w:proofErr w:type="gramStart"/>
+      <w:r>
+        <w:rPr>
+          <w:rFonts w:eastAsia="Yu Mincho"/>
+          <w:lang w:val="en-US" w:eastAsia="ja-JP"/>
+        </w:rPr>
+        <w:t>a ‘</w:t>
+      </w:r>
+      <w:proofErr w:type="gramEnd"/>
+      <w:r>
+        <w:rPr>
+          <w:rFonts w:eastAsia="Yu Mincho"/>
+          <w:lang w:val="en-US" w:eastAsia="ja-JP"/>
+        </w:rPr>
+        <w:t xml:space="preserve">wrong </w:t>
+      </w:r>
+      <w:proofErr w:type="gramStart"/>
+      <w:r>
+        <w:rPr>
+          <w:rFonts w:eastAsia="Yu Mincho"/>
+          <w:lang w:val="en-US" w:eastAsia="ja-JP"/>
+        </w:rPr>
+        <w:t>doings’</w:t>
+      </w:r>
+      <w:proofErr w:type="gramEnd"/>
+      <w:r>
+        <w:rPr>
+          <w:rFonts w:eastAsia="Yu Mincho"/>
+          <w:lang w:val="en-US" w:eastAsia="ja-JP"/>
+        </w:rPr>
+        <w:t xml:space="preserve"> to others. For </w:t>
+      </w:r>
+      <w:proofErr w:type="gramStart"/>
+      <w:r>
+        <w:rPr>
+          <w:rFonts w:eastAsia="Yu Mincho"/>
+          <w:lang w:val="en-US" w:eastAsia="ja-JP"/>
+        </w:rPr>
+        <w:t>example</w:t>
+      </w:r>
+      <w:proofErr w:type="gramEnd"/>
+      <w:r>
+        <w:rPr>
+          <w:rFonts w:eastAsia="Yu Mincho"/>
+          <w:lang w:val="en-US" w:eastAsia="ja-JP"/>
+        </w:rPr>
+        <w:t xml:space="preserve"> relations between Russia and Poland are first and foremost </w:t>
+      </w:r>
+      <w:proofErr w:type="spellStart"/>
+      <w:r>
+        <w:rPr>
+          <w:rFonts w:eastAsia="Yu Mincho"/>
+          <w:lang w:val="en-US" w:eastAsia="ja-JP"/>
+        </w:rPr>
+        <w:t>dictaited</w:t>
+      </w:r>
+      <w:proofErr w:type="spellEnd"/>
+      <w:r>
+        <w:rPr>
+          <w:rFonts w:eastAsia="Yu Mincho"/>
+          <w:lang w:val="en-US" w:eastAsia="ja-JP"/>
+        </w:rPr>
+        <w:t xml:space="preserve"> by the view of each other. Not nuclear weapons (I really believe that most poles </w:t>
+      </w:r>
+      <w:proofErr w:type="gramStart"/>
+      <w:r>
+        <w:rPr>
+          <w:rFonts w:eastAsia="Yu Mincho"/>
+          <w:lang w:val="en-US" w:eastAsia="ja-JP"/>
+        </w:rPr>
+        <w:t>doesn’t</w:t>
+      </w:r>
+      <w:proofErr w:type="gramEnd"/>
+      <w:r>
+        <w:rPr>
+          <w:rFonts w:eastAsia="Yu Mincho"/>
+          <w:lang w:val="en-US" w:eastAsia="ja-JP"/>
+        </w:rPr>
+        <w:t xml:space="preserve"> </w:t>
+      </w:r>
+      <w:proofErr w:type="spellStart"/>
+      <w:r>
+        <w:rPr>
+          <w:rFonts w:eastAsia="Yu Mincho"/>
+          <w:lang w:val="en-US" w:eastAsia="ja-JP"/>
+        </w:rPr>
+        <w:t>carre</w:t>
+      </w:r>
+      <w:proofErr w:type="spellEnd"/>
+      <w:r>
+        <w:rPr>
+          <w:rFonts w:eastAsia="Yu Mincho"/>
+          <w:lang w:val="en-US" w:eastAsia="ja-JP"/>
+        </w:rPr>
+        <w:t xml:space="preserve"> about Russian nukes, nor we believe they will use </w:t>
+      </w:r>
+      <w:proofErr w:type="spellStart"/>
+      <w:proofErr w:type="gramStart"/>
+      <w:r>
+        <w:rPr>
+          <w:rFonts w:eastAsia="Yu Mincho"/>
+          <w:lang w:val="en-US" w:eastAsia="ja-JP"/>
+        </w:rPr>
+        <w:t>tham</w:t>
+      </w:r>
+      <w:proofErr w:type="spellEnd"/>
+      <w:r>
+        <w:rPr>
+          <w:rFonts w:eastAsia="Yu Mincho"/>
+          <w:lang w:val="en-US" w:eastAsia="ja-JP"/>
+        </w:rPr>
+        <w:t>,.</w:t>
+      </w:r>
+      <w:proofErr w:type="gramEnd"/>
+      <w:r>
+        <w:rPr>
+          <w:rFonts w:eastAsia="Yu Mincho"/>
+          <w:lang w:val="en-US" w:eastAsia="ja-JP"/>
+        </w:rPr>
+        <w:t xml:space="preserve"> They are even people that do not believe those nukes are operational in any way), not potential gains from resources, not even a military </w:t>
+      </w:r>
+      <w:proofErr w:type="spellStart"/>
+      <w:r>
+        <w:rPr>
+          <w:rFonts w:eastAsia="Yu Mincho"/>
+          <w:lang w:val="en-US" w:eastAsia="ja-JP"/>
+        </w:rPr>
+        <w:t>bapabilities</w:t>
+      </w:r>
+      <w:proofErr w:type="spellEnd"/>
+      <w:r>
+        <w:rPr>
+          <w:rFonts w:eastAsia="Yu Mincho"/>
+          <w:lang w:val="en-US" w:eastAsia="ja-JP"/>
+        </w:rPr>
+        <w:t xml:space="preserve">, even though those are one of the bigger concerns and </w:t>
+      </w:r>
+      <w:proofErr w:type="spellStart"/>
+      <w:r>
+        <w:rPr>
+          <w:rFonts w:eastAsia="Yu Mincho"/>
+          <w:lang w:val="en-US" w:eastAsia="ja-JP"/>
+        </w:rPr>
+        <w:t>defenetly</w:t>
+      </w:r>
+      <w:proofErr w:type="spellEnd"/>
+      <w:r>
+        <w:rPr>
+          <w:rFonts w:eastAsia="Yu Mincho"/>
+          <w:lang w:val="en-US" w:eastAsia="ja-JP"/>
+        </w:rPr>
+        <w:t xml:space="preserve"> not the ‘very charming’ way of life and governance in Russia. BUT I would also not say that </w:t>
+      </w:r>
+      <w:proofErr w:type="gramStart"/>
+      <w:r>
+        <w:rPr>
+          <w:rFonts w:eastAsia="Yu Mincho"/>
+          <w:lang w:val="en-US" w:eastAsia="ja-JP"/>
+        </w:rPr>
+        <w:t>the morality</w:t>
+      </w:r>
+      <w:proofErr w:type="gramEnd"/>
+      <w:r>
+        <w:rPr>
+          <w:rFonts w:eastAsia="Yu Mincho"/>
+          <w:lang w:val="en-US" w:eastAsia="ja-JP"/>
+        </w:rPr>
+        <w:t xml:space="preserve"> (</w:t>
+      </w:r>
+      <w:proofErr w:type="spellStart"/>
+      <w:r>
+        <w:rPr>
+          <w:rFonts w:eastAsia="Yu Mincho"/>
+          <w:lang w:val="en-US" w:eastAsia="ja-JP"/>
+        </w:rPr>
+        <w:t>consant</w:t>
+      </w:r>
+      <w:proofErr w:type="spellEnd"/>
+      <w:r>
+        <w:rPr>
+          <w:rFonts w:eastAsia="Yu Mincho"/>
+          <w:lang w:val="en-US" w:eastAsia="ja-JP"/>
+        </w:rPr>
+        <w:t xml:space="preserve"> lies, rewriting history, war crimes etc.) are the main factor either. USA also lies and commits war crimes but they (</w:t>
+      </w:r>
+      <w:proofErr w:type="spellStart"/>
+      <w:proofErr w:type="gramStart"/>
+      <w:r>
+        <w:rPr>
+          <w:rFonts w:eastAsia="Yu Mincho"/>
+          <w:lang w:val="en-US" w:eastAsia="ja-JP"/>
+        </w:rPr>
+        <w:t>upen</w:t>
+      </w:r>
+      <w:proofErr w:type="spellEnd"/>
+      <w:proofErr w:type="gramEnd"/>
+      <w:r>
+        <w:rPr>
+          <w:rFonts w:eastAsia="Yu Mincho"/>
+          <w:lang w:val="en-US" w:eastAsia="ja-JP"/>
+        </w:rPr>
+        <w:t xml:space="preserve"> recently) </w:t>
+      </w:r>
+      <w:proofErr w:type="spellStart"/>
+      <w:r>
+        <w:rPr>
+          <w:rFonts w:eastAsia="Yu Mincho"/>
+          <w:lang w:val="en-US" w:eastAsia="ja-JP"/>
+        </w:rPr>
+        <w:t>vere</w:t>
+      </w:r>
+      <w:proofErr w:type="spellEnd"/>
+      <w:r>
+        <w:rPr>
+          <w:rFonts w:eastAsia="Yu Mincho"/>
+          <w:lang w:val="en-US" w:eastAsia="ja-JP"/>
+        </w:rPr>
+        <w:t xml:space="preserve"> viewed very favorable. The main problem in </w:t>
+      </w:r>
+      <w:proofErr w:type="gramStart"/>
+      <w:r>
+        <w:rPr>
+          <w:rFonts w:eastAsia="Yu Mincho"/>
+          <w:lang w:val="en-US" w:eastAsia="ja-JP"/>
+        </w:rPr>
+        <w:t>Polish-Russian</w:t>
+      </w:r>
+      <w:proofErr w:type="gramEnd"/>
+      <w:r>
+        <w:rPr>
+          <w:rFonts w:eastAsia="Yu Mincho"/>
+          <w:lang w:val="en-US" w:eastAsia="ja-JP"/>
+        </w:rPr>
+        <w:t xml:space="preserve"> relations is a fact that all Russian actions in some way, </w:t>
+      </w:r>
+      <w:proofErr w:type="spellStart"/>
+      <w:r>
+        <w:rPr>
+          <w:rFonts w:eastAsia="Yu Mincho"/>
+          <w:lang w:val="en-US" w:eastAsia="ja-JP"/>
+        </w:rPr>
+        <w:t>decreese</w:t>
+      </w:r>
+      <w:proofErr w:type="spellEnd"/>
+      <w:r>
+        <w:rPr>
+          <w:rFonts w:eastAsia="Yu Mincho"/>
+          <w:lang w:val="en-US" w:eastAsia="ja-JP"/>
+        </w:rPr>
+        <w:t xml:space="preserve"> or try to </w:t>
+      </w:r>
+      <w:proofErr w:type="spellStart"/>
+      <w:r>
+        <w:rPr>
+          <w:rFonts w:eastAsia="Yu Mincho"/>
+          <w:lang w:val="en-US" w:eastAsia="ja-JP"/>
+        </w:rPr>
+        <w:t>decres</w:t>
+      </w:r>
+      <w:proofErr w:type="spellEnd"/>
+      <w:r>
+        <w:rPr>
+          <w:rFonts w:eastAsia="Yu Mincho"/>
+          <w:lang w:val="en-US" w:eastAsia="ja-JP"/>
+        </w:rPr>
+        <w:t xml:space="preserve"> polish power, directly or indirectly… why this is important. Because Poland and USA are closer to each other, not geographically but in terms of influence. Same military alliance, closer institutions and culture (exported from the US, much more than vice versa) and yet, a lot of unmoral behavior did not bothered poles </w:t>
+      </w:r>
+      <w:proofErr w:type="gramStart"/>
+      <w:r>
+        <w:rPr>
+          <w:rFonts w:eastAsia="Yu Mincho"/>
+          <w:lang w:val="en-US" w:eastAsia="ja-JP"/>
+        </w:rPr>
+        <w:t>as long as</w:t>
+      </w:r>
+      <w:proofErr w:type="gramEnd"/>
+      <w:r>
+        <w:rPr>
+          <w:rFonts w:eastAsia="Yu Mincho"/>
+          <w:lang w:val="en-US" w:eastAsia="ja-JP"/>
+        </w:rPr>
+        <w:t xml:space="preserve"> they perceived US as the </w:t>
+      </w:r>
+      <w:proofErr w:type="spellStart"/>
+      <w:r>
+        <w:rPr>
+          <w:rFonts w:eastAsia="Yu Mincho"/>
+          <w:lang w:val="en-US" w:eastAsia="ja-JP"/>
+        </w:rPr>
+        <w:t>guarantator</w:t>
+      </w:r>
+      <w:proofErr w:type="spellEnd"/>
+      <w:r>
+        <w:rPr>
+          <w:rFonts w:eastAsia="Yu Mincho"/>
+          <w:lang w:val="en-US" w:eastAsia="ja-JP"/>
+        </w:rPr>
+        <w:t xml:space="preserve"> of </w:t>
+      </w:r>
+      <w:proofErr w:type="gramStart"/>
+      <w:r>
+        <w:rPr>
+          <w:rFonts w:eastAsia="Yu Mincho"/>
+          <w:lang w:val="en-US" w:eastAsia="ja-JP"/>
+        </w:rPr>
+        <w:t>theirs</w:t>
+      </w:r>
+      <w:proofErr w:type="gramEnd"/>
+      <w:r>
+        <w:rPr>
+          <w:rFonts w:eastAsia="Yu Mincho"/>
+          <w:lang w:val="en-US" w:eastAsia="ja-JP"/>
+        </w:rPr>
+        <w:t xml:space="preserve"> security.</w:t>
+      </w:r>
+    </w:p>
+    <w:p>
+      <w:pPr>
+        <w:rPr>
+          <w:rFonts w:eastAsia="Yu Mincho"/>
+          <w:lang w:val="en-US" w:eastAsia="ja-JP"/>
+        </w:rPr>
+      </w:pPr>
+    </w:p>
+    <w:p>
+      <w:pPr>
+        <w:rPr>
+          <w:rFonts w:eastAsia="Yu Mincho"/>
+          <w:lang w:val="en-US" w:eastAsia="ja-JP"/>
+        </w:rPr>
+      </w:pPr>
+      <w:r>
+        <w:rPr>
+          <w:rFonts w:eastAsia="Yu Mincho"/>
+          <w:lang w:val="en-US" w:eastAsia="ja-JP"/>
+        </w:rPr>
+        <w:t xml:space="preserve">Also, there was stated in the book that moral authority is needed to establish and maintain leadership in the world. </w:t>
+      </w:r>
+      <w:proofErr w:type="spellStart"/>
+      <w:r>
+        <w:rPr>
+          <w:rFonts w:eastAsia="Yu Mincho"/>
+          <w:lang w:val="en-US" w:eastAsia="ja-JP"/>
+        </w:rPr>
+        <w:t>Isin’t</w:t>
+      </w:r>
+      <w:proofErr w:type="spellEnd"/>
+      <w:r>
+        <w:rPr>
+          <w:rFonts w:eastAsia="Yu Mincho"/>
+          <w:lang w:val="en-US" w:eastAsia="ja-JP"/>
+        </w:rPr>
+        <w:t xml:space="preserve"> it in the opposite way? </w:t>
+      </w:r>
+      <w:proofErr w:type="spellStart"/>
+      <w:r>
+        <w:rPr>
+          <w:rFonts w:eastAsia="Yu Mincho"/>
+          <w:lang w:val="en-US" w:eastAsia="ja-JP"/>
+        </w:rPr>
+        <w:t>Isin’t</w:t>
+      </w:r>
+      <w:proofErr w:type="spellEnd"/>
+      <w:r>
+        <w:rPr>
+          <w:rFonts w:eastAsia="Yu Mincho"/>
+          <w:lang w:val="en-US" w:eastAsia="ja-JP"/>
+        </w:rPr>
+        <w:t xml:space="preserve"> the leader the one that </w:t>
+      </w:r>
+      <w:proofErr w:type="gramStart"/>
+      <w:r>
+        <w:rPr>
+          <w:rFonts w:eastAsia="Yu Mincho"/>
+          <w:lang w:val="en-US" w:eastAsia="ja-JP"/>
+        </w:rPr>
+        <w:t>establish</w:t>
+      </w:r>
+      <w:proofErr w:type="gramEnd"/>
+      <w:r>
+        <w:rPr>
+          <w:rFonts w:eastAsia="Yu Mincho"/>
+          <w:lang w:val="en-US" w:eastAsia="ja-JP"/>
+        </w:rPr>
+        <w:t xml:space="preserve"> the norms? </w:t>
+      </w:r>
+      <w:proofErr w:type="gramStart"/>
+      <w:r>
+        <w:rPr>
+          <w:rFonts w:eastAsia="Yu Mincho"/>
+          <w:lang w:val="en-US" w:eastAsia="ja-JP"/>
+        </w:rPr>
+        <w:t>Of course</w:t>
+      </w:r>
+      <w:proofErr w:type="gramEnd"/>
+      <w:r>
+        <w:rPr>
+          <w:rFonts w:eastAsia="Yu Mincho"/>
+          <w:lang w:val="en-US" w:eastAsia="ja-JP"/>
+        </w:rPr>
+        <w:t xml:space="preserve"> then they </w:t>
+      </w:r>
+      <w:proofErr w:type="gramStart"/>
+      <w:r>
+        <w:rPr>
+          <w:rFonts w:eastAsia="Yu Mincho"/>
+          <w:lang w:val="en-US" w:eastAsia="ja-JP"/>
+        </w:rPr>
+        <w:t>should do</w:t>
+      </w:r>
+      <w:proofErr w:type="gramEnd"/>
+      <w:r>
+        <w:rPr>
+          <w:rFonts w:eastAsia="Yu Mincho"/>
+          <w:lang w:val="en-US" w:eastAsia="ja-JP"/>
+        </w:rPr>
+        <w:t xml:space="preserve"> act as they established </w:t>
+      </w:r>
+      <w:proofErr w:type="gramStart"/>
+      <w:r>
+        <w:rPr>
+          <w:rFonts w:eastAsia="Yu Mincho"/>
+          <w:lang w:val="en-US" w:eastAsia="ja-JP"/>
+        </w:rPr>
+        <w:t>but..</w:t>
+      </w:r>
+      <w:proofErr w:type="gramEnd"/>
+      <w:r>
+        <w:rPr>
+          <w:rFonts w:eastAsia="Yu Mincho"/>
+          <w:lang w:val="en-US" w:eastAsia="ja-JP"/>
+        </w:rPr>
+        <w:t xml:space="preserve"> </w:t>
+      </w:r>
+      <w:proofErr w:type="gramStart"/>
+      <w:r>
+        <w:rPr>
+          <w:rFonts w:eastAsia="Yu Mincho"/>
+          <w:lang w:val="en-US" w:eastAsia="ja-JP"/>
+        </w:rPr>
+        <w:t>if</w:t>
+      </w:r>
+      <w:proofErr w:type="gramEnd"/>
+      <w:r>
+        <w:rPr>
+          <w:rFonts w:eastAsia="Yu Mincho"/>
+          <w:lang w:val="en-US" w:eastAsia="ja-JP"/>
+        </w:rPr>
+        <w:t xml:space="preserve"> there is a malicious actor that by </w:t>
+      </w:r>
+      <w:proofErr w:type="gramStart"/>
+      <w:r>
+        <w:rPr>
+          <w:rFonts w:eastAsia="Yu Mincho"/>
+          <w:lang w:val="en-US" w:eastAsia="ja-JP"/>
+        </w:rPr>
+        <w:t>wrong doing</w:t>
+      </w:r>
+      <w:proofErr w:type="gramEnd"/>
+      <w:r>
+        <w:rPr>
+          <w:rFonts w:eastAsia="Yu Mincho"/>
+          <w:lang w:val="en-US" w:eastAsia="ja-JP"/>
+        </w:rPr>
+        <w:t xml:space="preserve">, elevates themselves into the leading position, why </w:t>
+      </w:r>
+      <w:proofErr w:type="gramStart"/>
+      <w:r>
+        <w:rPr>
+          <w:rFonts w:eastAsia="Yu Mincho"/>
+          <w:lang w:val="en-US" w:eastAsia="ja-JP"/>
+        </w:rPr>
+        <w:t>they should</w:t>
+      </w:r>
+      <w:proofErr w:type="gramEnd"/>
+      <w:r>
+        <w:rPr>
+          <w:rFonts w:eastAsia="Yu Mincho"/>
+          <w:lang w:val="en-US" w:eastAsia="ja-JP"/>
+        </w:rPr>
+        <w:t xml:space="preserve"> start to work with the moral rules established by defeated opponent? </w:t>
+      </w:r>
+      <w:proofErr w:type="gramStart"/>
+      <w:r>
+        <w:rPr>
+          <w:rFonts w:eastAsia="Yu Mincho"/>
+          <w:lang w:val="en-US" w:eastAsia="ja-JP"/>
+        </w:rPr>
+        <w:t>Theirs</w:t>
+      </w:r>
+      <w:proofErr w:type="gramEnd"/>
+      <w:r>
+        <w:rPr>
+          <w:rFonts w:eastAsia="Yu Mincho"/>
+          <w:lang w:val="en-US" w:eastAsia="ja-JP"/>
+        </w:rPr>
+        <w:t xml:space="preserve"> success </w:t>
+      </w:r>
+      <w:proofErr w:type="gramStart"/>
+      <w:r>
+        <w:rPr>
+          <w:rFonts w:eastAsia="Yu Mincho"/>
+          <w:lang w:val="en-US" w:eastAsia="ja-JP"/>
+        </w:rPr>
+        <w:t>is a prove</w:t>
+      </w:r>
+      <w:proofErr w:type="gramEnd"/>
+      <w:r>
+        <w:rPr>
+          <w:rFonts w:eastAsia="Yu Mincho"/>
+          <w:lang w:val="en-US" w:eastAsia="ja-JP"/>
+        </w:rPr>
+        <w:t xml:space="preserve"> that old morality wasn’t good enough for stable world.</w:t>
+      </w:r>
+    </w:p>
+    <w:p>
+      <w:pPr>
+        <w:rPr>
+          <w:rFonts w:eastAsia="Yu Mincho"/>
+          <w:lang w:val="en-US" w:eastAsia="ja-JP"/>
+        </w:rPr>
+      </w:pPr>
+      <w:r>
+        <w:rPr>
+          <w:rFonts w:eastAsia="Yu Mincho"/>
+          <w:lang w:val="en-US" w:eastAsia="ja-JP"/>
+        </w:rPr>
+        <w:t xml:space="preserve">I have a big problem with the ‘universal’ morality because we never agreed and never will, on the </w:t>
+      </w:r>
+    </w:p>
+    <w:p>
+      <w:pPr>
+        <w:rPr>
+          <w:rFonts w:eastAsia="Yu Mincho"/>
+          <w:lang w:val="en-US" w:eastAsia="ja-JP"/>
+        </w:rPr>
+      </w:pPr>
+      <w:r>
+        <w:rPr>
+          <w:rFonts w:eastAsia="Yu Mincho"/>
+          <w:lang w:val="en-US" w:eastAsia="ja-JP"/>
+        </w:rPr>
+        <w:t>Nye says, “Soft power depends on credibility, and when governments are perceived as manipulative and information is seen as propaganda, credibility is destroyed.</w:t>
+      </w:r>
+    </w:p>
+    <w:p>
+      <w:pPr>
+        <w:rPr>
+          <w:rFonts w:eastAsia="Yu Mincho"/>
+          <w:lang w:val="en-US" w:eastAsia="ja-JP"/>
+        </w:rPr>
+      </w:pPr>
+      <w:r>
+        <w:rPr>
+          <w:rFonts w:eastAsia="Yu Mincho"/>
+          <w:lang w:val="en-US" w:eastAsia="ja-JP"/>
+        </w:rPr>
+        <w:t>‘International authority requires voluntary acceptance’</w:t>
+      </w:r>
+    </w:p>
+    <w:p>
+      <w:pPr>
+        <w:rPr>
+          <w:rFonts w:eastAsia="Yu Mincho"/>
+          <w:lang w:val="en-US" w:eastAsia="ja-JP"/>
+        </w:rPr>
+      </w:pPr>
+      <w:r>
+        <w:rPr>
+          <w:rFonts w:eastAsia="Yu Mincho"/>
+          <w:lang w:val="en-US" w:eastAsia="ja-JP"/>
+        </w:rPr>
+        <w:t>If state decides to act in virtuous way, they will act in very predictable way</w:t>
+      </w:r>
+    </w:p>
+    <w:p>
+      <w:pPr>
+        <w:rPr>
+          <w:rFonts w:eastAsia="Yu Mincho"/>
+          <w:lang w:val="en-US" w:eastAsia="ja-JP"/>
+        </w:rPr>
+      </w:pPr>
+    </w:p>
+    <w:p>
+      <w:pPr>
+        <w:pBdr>
+          <w:bottom w:val="single" w:sz="6" w:space="1" w:color="auto"/>
+        </w:pBdr>
+        <w:rPr>
+          <w:rFonts w:eastAsia="Yu Mincho"/>
+          <w:lang w:val="en-US" w:eastAsia="ja-JP"/>
+        </w:rPr>
+      </w:pPr>
+    </w:p>
+    <w:p>
+      <w:pPr>
+        <w:rPr>
+          <w:rFonts w:eastAsia="Yu Mincho"/>
+          <w:lang w:val="en-US" w:eastAsia="ja-JP"/>
+        </w:rPr>
+      </w:pPr>
+      <w:r>
+        <w:rPr>
+          <w:rFonts w:eastAsia="Yu Mincho"/>
+          <w:lang w:val="en-US" w:eastAsia="ja-JP"/>
+        </w:rPr>
+        <w:t>Chapter 2</w:t>
+      </w:r>
+    </w:p>
+    <w:p>
+      <w:pPr>
+        <w:rPr>
+          <w:rFonts w:eastAsia="Yu Mincho"/>
+          <w:lang w:val="en-US" w:eastAsia="ja-JP"/>
+        </w:rPr>
+      </w:pPr>
+      <w:r>
+        <w:rPr>
+          <w:rFonts w:eastAsia="Yu Mincho"/>
+          <w:lang w:val="en-US" w:eastAsia="ja-JP"/>
+        </w:rPr>
+        <w:t>Leadership and Strategic Preferences</w:t>
+      </w:r>
+    </w:p>
+    <w:p>
+      <w:pPr>
+        <w:rPr>
+          <w:rFonts w:eastAsia="Yu Mincho"/>
+          <w:lang w:val="en-US" w:eastAsia="ja-JP"/>
+        </w:rPr>
+      </w:pPr>
+      <w:r>
+        <w:rPr>
+          <w:rFonts w:eastAsia="Yu Mincho"/>
+          <w:lang w:val="en-US" w:eastAsia="ja-JP"/>
+        </w:rPr>
+        <w:t xml:space="preserve">(This chapter is about </w:t>
+      </w:r>
+      <w:proofErr w:type="spellStart"/>
+      <w:r>
+        <w:rPr>
+          <w:rFonts w:eastAsia="Yu Mincho"/>
+          <w:lang w:val="en-US" w:eastAsia="ja-JP"/>
+        </w:rPr>
+        <w:t>rivality</w:t>
+      </w:r>
+      <w:proofErr w:type="spellEnd"/>
+      <w:r>
+        <w:rPr>
+          <w:rFonts w:eastAsia="Yu Mincho"/>
+          <w:lang w:val="en-US" w:eastAsia="ja-JP"/>
+        </w:rPr>
+        <w:t xml:space="preserve"> between status-quo hegemon and the revisionist power. I wish to </w:t>
+      </w:r>
+      <w:proofErr w:type="spellStart"/>
+      <w:r>
+        <w:rPr>
+          <w:rFonts w:eastAsia="Yu Mincho"/>
+          <w:lang w:val="en-US" w:eastAsia="ja-JP"/>
+        </w:rPr>
+        <w:t>analyse</w:t>
+      </w:r>
+      <w:proofErr w:type="spellEnd"/>
+      <w:r>
+        <w:rPr>
+          <w:rFonts w:eastAsia="Yu Mincho"/>
+          <w:lang w:val="en-US" w:eastAsia="ja-JP"/>
+        </w:rPr>
+        <w:t xml:space="preserve"> it from 3 perspectives. 1. General replacement of the hegemon by contender (even if failed which would result in </w:t>
+      </w:r>
+      <w:proofErr w:type="spellStart"/>
+      <w:r>
+        <w:rPr>
+          <w:rFonts w:eastAsia="Yu Mincho"/>
+          <w:lang w:val="en-US" w:eastAsia="ja-JP"/>
+        </w:rPr>
+        <w:t>hegemonless</w:t>
+      </w:r>
+      <w:proofErr w:type="spellEnd"/>
+      <w:r>
+        <w:rPr>
+          <w:rFonts w:eastAsia="Yu Mincho"/>
+          <w:lang w:val="en-US" w:eastAsia="ja-JP"/>
+        </w:rPr>
+        <w:t xml:space="preserve"> system) 2. </w:t>
+      </w:r>
+      <w:r>
+        <w:rPr>
+          <w:rFonts w:eastAsia="Yu Mincho"/>
+          <w:lang w:val="en-US" w:eastAsia="ja-JP"/>
+        </w:rPr>
+        <w:t>Case when the hegemon is the revisionist power (USA vs China) and 3. When the replacement is regional with the perspective of Poland and its perspective to replace Russia as the regional power in the non-western Europe.</w:t>
+      </w:r>
+    </w:p>
+    <w:p>
+      <w:pPr>
+        <w:rPr>
+          <w:rFonts w:eastAsia="Yu Mincho"/>
+          <w:lang w:val="en-US" w:eastAsia="ja-JP"/>
+        </w:rPr>
+      </w:pPr>
+    </w:p>
+    <w:p>
+      <w:pPr>
+        <w:rPr>
+          <w:rFonts w:eastAsia="Yu Mincho"/>
+          <w:lang w:val="en-US" w:eastAsia="ja-JP"/>
+        </w:rPr>
+      </w:pPr>
+      <w:r>
+        <w:rPr>
+          <w:rFonts w:eastAsia="Yu Mincho"/>
+          <w:lang w:val="en-US" w:eastAsia="ja-JP"/>
+        </w:rPr>
+        <w:t xml:space="preserve">Leadership in this book is </w:t>
+      </w:r>
+      <w:r>
+        <w:rPr>
+          <w:rFonts w:eastAsia="Yu Mincho"/>
+          <w:lang w:val="en-US" w:eastAsia="ja-JP"/>
+        </w:rPr>
+        <w:t>classified</w:t>
+      </w:r>
+      <w:r>
+        <w:rPr>
+          <w:rFonts w:eastAsia="Yu Mincho"/>
+          <w:lang w:val="en-US" w:eastAsia="ja-JP"/>
+        </w:rPr>
+        <w:t xml:space="preserve"> by its policies and not by </w:t>
+      </w:r>
+      <w:proofErr w:type="gramStart"/>
+      <w:r>
+        <w:rPr>
+          <w:rFonts w:eastAsia="Yu Mincho"/>
+          <w:lang w:val="en-US" w:eastAsia="ja-JP"/>
+        </w:rPr>
+        <w:t>they</w:t>
+      </w:r>
+      <w:proofErr w:type="gramEnd"/>
+      <w:r>
+        <w:rPr>
+          <w:rFonts w:eastAsia="Yu Mincho"/>
+          <w:lang w:val="en-US" w:eastAsia="ja-JP"/>
+        </w:rPr>
+        <w:t xml:space="preserve"> </w:t>
+      </w:r>
+      <w:proofErr w:type="gramStart"/>
+      <w:r>
+        <w:rPr>
+          <w:rFonts w:eastAsia="Yu Mincho"/>
+          <w:lang w:val="en-US" w:eastAsia="ja-JP"/>
+        </w:rPr>
+        <w:t>believes</w:t>
+      </w:r>
+      <w:proofErr w:type="gramEnd"/>
+      <w:r>
+        <w:rPr>
+          <w:rFonts w:eastAsia="Yu Mincho"/>
+          <w:lang w:val="en-US" w:eastAsia="ja-JP"/>
+        </w:rPr>
+        <w:t xml:space="preserve"> or personalities</w:t>
+      </w:r>
+      <w:r>
+        <w:rPr>
+          <w:rFonts w:eastAsia="Yu Mincho"/>
+          <w:lang w:val="en-US" w:eastAsia="ja-JP"/>
+        </w:rPr>
+        <w:t>:</w:t>
+      </w:r>
+    </w:p>
+    <w:p>
+      <w:pPr>
+        <w:rPr>
+          <w:rFonts w:eastAsia="Yu Mincho"/>
+          <w:lang w:val="en-US" w:eastAsia="ja-JP"/>
+        </w:rPr>
+      </w:pPr>
+      <w:r>
+        <w:rPr>
+          <w:rFonts w:eastAsia="Yu Mincho"/>
+          <w:lang w:val="en-US" w:eastAsia="ja-JP"/>
+        </w:rPr>
+        <w:t>Inactive, -&gt; Irresponsible and for favoring status quo</w:t>
+      </w:r>
+      <w:r>
+        <w:rPr>
+          <w:rFonts w:eastAsia="Yu Mincho"/>
+          <w:lang w:val="en-US" w:eastAsia="ja-JP"/>
+        </w:rPr>
+        <w:t xml:space="preserve"> (Daoism</w:t>
+      </w:r>
+      <w:r>
+        <w:rPr>
+          <w:rFonts w:eastAsia="Yu Mincho"/>
+          <w:lang w:val="en-US" w:eastAsia="ja-JP"/>
+        </w:rPr>
+        <w:t>/Lesse-faire</w:t>
+      </w:r>
+      <w:r>
+        <w:rPr>
+          <w:rFonts w:eastAsia="Yu Mincho"/>
+          <w:lang w:val="en-US" w:eastAsia="ja-JP"/>
+        </w:rPr>
+        <w:t>)</w:t>
+      </w:r>
+    </w:p>
+    <w:p>
+      <w:pPr>
+        <w:rPr>
+          <w:rFonts w:eastAsia="Yu Mincho"/>
+          <w:lang w:val="en-US" w:eastAsia="ja-JP"/>
+        </w:rPr>
+      </w:pPr>
+      <w:r>
+        <w:rPr>
+          <w:rFonts w:eastAsia="Yu Mincho"/>
+          <w:lang w:val="en-US" w:eastAsia="ja-JP"/>
+        </w:rPr>
+        <w:t>Conservative -&gt; Responsible and favoring status quo</w:t>
+      </w:r>
+      <w:r>
+        <w:rPr>
+          <w:rFonts w:eastAsia="Yu Mincho"/>
+          <w:lang w:val="en-US" w:eastAsia="ja-JP"/>
+        </w:rPr>
+        <w:t xml:space="preserve"> (</w:t>
+      </w:r>
+      <w:r>
+        <w:rPr>
+          <w:rFonts w:eastAsia="Yu Mincho"/>
+          <w:lang w:val="en-US" w:eastAsia="ja-JP"/>
+        </w:rPr>
+        <w:t>Economic determinism)</w:t>
+      </w:r>
+    </w:p>
+    <w:p>
+      <w:pPr>
+        <w:rPr>
+          <w:rFonts w:eastAsia="Yu Mincho"/>
+          <w:lang w:val="en-US" w:eastAsia="ja-JP"/>
+        </w:rPr>
+      </w:pPr>
+      <w:r>
+        <w:rPr>
+          <w:rFonts w:eastAsia="Yu Mincho"/>
+          <w:lang w:val="en-US" w:eastAsia="ja-JP"/>
+        </w:rPr>
+        <w:t>Aggressive -&gt; Irresponsible and contesting status quo</w:t>
+      </w:r>
+      <w:r>
+        <w:rPr>
+          <w:rFonts w:eastAsia="Yu Mincho"/>
+          <w:lang w:val="en-US" w:eastAsia="ja-JP"/>
+        </w:rPr>
+        <w:t xml:space="preserve"> (Social </w:t>
+      </w:r>
+      <w:proofErr w:type="spellStart"/>
+      <w:r>
+        <w:rPr>
+          <w:rFonts w:eastAsia="Yu Mincho"/>
+          <w:lang w:val="en-US" w:eastAsia="ja-JP"/>
+        </w:rPr>
+        <w:t>Darvinism</w:t>
+      </w:r>
+      <w:proofErr w:type="spellEnd"/>
+      <w:r>
+        <w:rPr>
+          <w:rFonts w:eastAsia="Yu Mincho"/>
+          <w:lang w:val="en-US" w:eastAsia="ja-JP"/>
+        </w:rPr>
+        <w:t>)</w:t>
+      </w:r>
+    </w:p>
+    <w:p>
+      <w:pPr>
+        <w:rPr>
+          <w:rFonts w:eastAsia="Yu Mincho"/>
+          <w:lang w:val="en-US" w:eastAsia="ja-JP"/>
+        </w:rPr>
+      </w:pPr>
+      <w:r>
+        <w:rPr>
+          <w:rFonts w:eastAsia="Yu Mincho"/>
+          <w:lang w:val="en-US" w:eastAsia="ja-JP"/>
+        </w:rPr>
+        <w:t>Proactive -&gt; Responsible and contesting status quo</w:t>
+      </w:r>
+      <w:r>
+        <w:rPr>
+          <w:rFonts w:eastAsia="Yu Mincho"/>
+          <w:lang w:val="en-US" w:eastAsia="ja-JP"/>
+        </w:rPr>
+        <w:t xml:space="preserve"> (Political Determinism)</w:t>
+      </w:r>
+    </w:p>
+    <w:p>
+      <w:pPr>
+        <w:rPr>
+          <w:rFonts w:eastAsia="Yu Mincho"/>
+          <w:lang w:val="en-US" w:eastAsia="ja-JP"/>
+        </w:rPr>
+      </w:pPr>
+    </w:p>
+    <w:p>
+      <w:pPr>
+        <w:rPr>
+          <w:rFonts w:eastAsia="Yu Mincho"/>
+          <w:lang w:val="en-US" w:eastAsia="ja-JP"/>
+        </w:rPr>
+      </w:pPr>
+    </w:p>
+    <w:tbl>
+      <w:tblPr>
+        <w:tblStyle w:val="Tabela-Siatka"/>
+        <w:tblW w:w="0" w:type="auto"/>
+        <w:tblLook w:val="04A0" w:firstRow="1" w:lastRow="0" w:firstColumn="1" w:lastColumn="0" w:noHBand="0" w:noVBand="1"/>
+      </w:tblPr>
+      <w:tblGrid>
+        <w:gridCol w:w="1895"/>
+        <w:gridCol w:w="2495"/>
+        <w:gridCol w:w="2193"/>
+        <w:gridCol w:w="2433"/>
+      </w:tblGrid>
+      <w:tr>
+        <w:tc>
+          <w:tcPr>
+            <w:tcW w:w="4390" w:type="dxa"/>
+            <w:gridSpan w:val="2"/>
+            <w:vMerge w:val="restart"/>
+            <w:shd w:val="clear" w:color="auto" w:fill="BFBFBF" w:themeFill="background1" w:themeFillShade="BF"/>
+          </w:tcPr>
+          <w:p>
+            <w:pPr>
+              <w:rPr>
+                <w:rFonts w:eastAsia="Yu Mincho"/>
+                <w:lang w:val="en-US" w:eastAsia="ja-JP"/>
+              </w:rPr>
+            </w:pPr>
+            <w:r>
+              <w:rPr>
+                <w:rFonts w:eastAsia="Yu Mincho"/>
+                <w:sz w:val="32"/>
+                <w:szCs w:val="32"/>
+                <w:lang w:val="en-US" w:eastAsia="ja-JP"/>
+              </w:rPr>
+              <w:t>TYPES OF STATE LEADERSHIP</w:t>
+            </w:r>
+          </w:p>
+        </w:tc>
+        <w:tc>
+          <w:tcPr>
+            <w:tcW w:w="4626" w:type="dxa"/>
+            <w:gridSpan w:val="2"/>
+          </w:tcPr>
+          <w:p>
+            <w:pPr>
+              <w:jc w:val="center"/>
+              <w:rPr>
+                <w:rFonts w:eastAsia="Yu Mincho"/>
+                <w:u w:val="single"/>
+                <w:lang w:val="en-US" w:eastAsia="ja-JP"/>
+              </w:rPr>
+            </w:pPr>
+            <w:r>
+              <w:rPr>
+                <w:rFonts w:eastAsia="Yu Mincho"/>
+                <w:u w:val="single"/>
+                <w:lang w:val="en-US" w:eastAsia="ja-JP"/>
+              </w:rPr>
+              <w:t>Leadership Responsibility</w:t>
+            </w:r>
+          </w:p>
+        </w:tc>
+      </w:tr>
+      <w:tr>
+        <w:tc>
+          <w:tcPr>
+            <w:tcW w:w="4390" w:type="dxa"/>
+            <w:gridSpan w:val="2"/>
+            <w:vMerge/>
+            <w:shd w:val="clear" w:color="auto" w:fill="BFBFBF" w:themeFill="background1" w:themeFillShade="BF"/>
+          </w:tcPr>
+          <w:p>
+            <w:pPr>
+              <w:rPr>
+                <w:rFonts w:eastAsia="Yu Mincho"/>
+                <w:lang w:val="en-US" w:eastAsia="ja-JP"/>
+              </w:rPr>
+            </w:pPr>
+          </w:p>
+        </w:tc>
+        <w:tc>
+          <w:tcPr>
+            <w:tcW w:w="2193" w:type="dxa"/>
+          </w:tcPr>
+          <w:p>
+            <w:pPr>
+              <w:rPr>
+                <w:rFonts w:eastAsia="Yu Mincho"/>
+                <w:b/>
+                <w:bCs/>
+                <w:lang w:val="en-US" w:eastAsia="ja-JP"/>
+              </w:rPr>
+            </w:pPr>
+            <w:r>
+              <w:rPr>
+                <w:rFonts w:eastAsia="Yu Mincho"/>
+                <w:b/>
+                <w:bCs/>
+                <w:lang w:val="en-US" w:eastAsia="ja-JP"/>
+              </w:rPr>
+              <w:t>Responsible</w:t>
+            </w:r>
+          </w:p>
+        </w:tc>
+        <w:tc>
+          <w:tcPr>
+            <w:tcW w:w="2433" w:type="dxa"/>
+          </w:tcPr>
+          <w:p>
+            <w:pPr>
+              <w:rPr>
+                <w:rFonts w:eastAsia="Yu Mincho"/>
+                <w:b/>
+                <w:bCs/>
+                <w:lang w:val="en-US" w:eastAsia="ja-JP"/>
+              </w:rPr>
+            </w:pPr>
+            <w:r>
+              <w:rPr>
+                <w:rFonts w:eastAsia="Yu Mincho"/>
+                <w:b/>
+                <w:bCs/>
+                <w:lang w:val="en-US" w:eastAsia="ja-JP"/>
+              </w:rPr>
+              <w:t>irresponsible</w:t>
+            </w:r>
+          </w:p>
+        </w:tc>
+      </w:tr>
+      <w:tr>
+        <w:tc>
+          <w:tcPr>
+            <w:tcW w:w="1895" w:type="dxa"/>
+            <w:vMerge w:val="restart"/>
+          </w:tcPr>
+          <w:p>
+            <w:pPr>
+              <w:rPr>
+                <w:rFonts w:eastAsia="Yu Mincho"/>
+                <w:u w:val="single"/>
+                <w:lang w:val="en-US" w:eastAsia="ja-JP"/>
+              </w:rPr>
+            </w:pPr>
+            <w:r>
+              <w:rPr>
+                <w:rFonts w:eastAsia="Yu Mincho"/>
+                <w:u w:val="single"/>
+                <w:lang w:val="en-US" w:eastAsia="ja-JP"/>
+              </w:rPr>
+              <w:t>Attitude toward State’s</w:t>
+            </w:r>
+          </w:p>
+        </w:tc>
+        <w:tc>
+          <w:tcPr>
+            <w:tcW w:w="2495" w:type="dxa"/>
+          </w:tcPr>
+          <w:p>
+            <w:pPr>
+              <w:rPr>
+                <w:rFonts w:eastAsia="Yu Mincho"/>
+                <w:b/>
+                <w:bCs/>
+                <w:lang w:val="en-US" w:eastAsia="ja-JP"/>
+              </w:rPr>
+            </w:pPr>
+            <w:r>
+              <w:rPr>
+                <w:rFonts w:eastAsia="Yu Mincho"/>
+                <w:b/>
+                <w:bCs/>
+                <w:lang w:val="en-US" w:eastAsia="ja-JP"/>
+              </w:rPr>
+              <w:t>Maintain status quo</w:t>
+            </w:r>
+          </w:p>
+        </w:tc>
+        <w:tc>
+          <w:tcPr>
+            <w:tcW w:w="2193" w:type="dxa"/>
+          </w:tcPr>
+          <w:p>
+            <w:pPr>
+              <w:rPr>
+                <w:rFonts w:eastAsia="Yu Mincho"/>
+                <w:i/>
+                <w:iCs/>
+                <w:lang w:val="en-US" w:eastAsia="ja-JP"/>
+              </w:rPr>
+            </w:pPr>
+            <w:r>
+              <w:rPr>
+                <w:rFonts w:eastAsia="Yu Mincho"/>
+                <w:i/>
+                <w:iCs/>
+                <w:lang w:val="en-US" w:eastAsia="ja-JP"/>
+              </w:rPr>
+              <w:t>Conservative</w:t>
+            </w:r>
+          </w:p>
+        </w:tc>
+        <w:tc>
+          <w:tcPr>
+            <w:tcW w:w="2433" w:type="dxa"/>
+          </w:tcPr>
+          <w:p>
+            <w:pPr>
+              <w:rPr>
+                <w:rFonts w:eastAsia="Yu Mincho"/>
+                <w:i/>
+                <w:iCs/>
+                <w:lang w:val="en-US" w:eastAsia="ja-JP"/>
+              </w:rPr>
+            </w:pPr>
+            <w:r>
+              <w:rPr>
+                <w:rFonts w:eastAsia="Yu Mincho"/>
+                <w:i/>
+                <w:iCs/>
+                <w:lang w:val="en-US" w:eastAsia="ja-JP"/>
+              </w:rPr>
+              <w:t>Inactive</w:t>
+            </w:r>
+          </w:p>
+        </w:tc>
+      </w:tr>
+      <w:tr>
+        <w:tc>
+          <w:tcPr>
+            <w:tcW w:w="1895" w:type="dxa"/>
+            <w:vMerge/>
+          </w:tcPr>
+          <w:p>
+            <w:pPr>
+              <w:rPr>
+                <w:rFonts w:eastAsia="Yu Mincho"/>
+                <w:lang w:val="en-US" w:eastAsia="ja-JP"/>
+              </w:rPr>
+            </w:pPr>
+          </w:p>
+        </w:tc>
+        <w:tc>
+          <w:tcPr>
+            <w:tcW w:w="2495" w:type="dxa"/>
+          </w:tcPr>
+          <w:p>
+            <w:pPr>
+              <w:rPr>
+                <w:rFonts w:eastAsia="Yu Mincho"/>
+                <w:b/>
+                <w:bCs/>
+                <w:lang w:val="en-US" w:eastAsia="ja-JP"/>
+              </w:rPr>
+            </w:pPr>
+            <w:r>
+              <w:rPr>
+                <w:rFonts w:eastAsia="Yu Mincho"/>
+                <w:b/>
+                <w:bCs/>
+                <w:lang w:val="en-US" w:eastAsia="ja-JP"/>
+              </w:rPr>
+              <w:t>Change status quo</w:t>
+            </w:r>
+          </w:p>
+        </w:tc>
+        <w:tc>
+          <w:tcPr>
+            <w:tcW w:w="2193" w:type="dxa"/>
+          </w:tcPr>
+          <w:p>
+            <w:pPr>
+              <w:rPr>
+                <w:rFonts w:eastAsia="Yu Mincho"/>
+                <w:i/>
+                <w:iCs/>
+                <w:lang w:val="en-US" w:eastAsia="ja-JP"/>
+              </w:rPr>
+            </w:pPr>
+            <w:r>
+              <w:rPr>
+                <w:rFonts w:eastAsia="Yu Mincho"/>
+                <w:i/>
+                <w:iCs/>
+                <w:lang w:val="en-US" w:eastAsia="ja-JP"/>
+              </w:rPr>
+              <w:t>Proactive</w:t>
+            </w:r>
+          </w:p>
+        </w:tc>
+        <w:tc>
+          <w:tcPr>
+            <w:tcW w:w="2433" w:type="dxa"/>
+          </w:tcPr>
+          <w:p>
+            <w:pPr>
+              <w:rPr>
+                <w:rFonts w:eastAsia="Yu Mincho"/>
+                <w:i/>
+                <w:iCs/>
+                <w:lang w:val="en-US" w:eastAsia="ja-JP"/>
+              </w:rPr>
+            </w:pPr>
+            <w:r>
+              <w:rPr>
+                <w:rFonts w:eastAsia="Yu Mincho"/>
+                <w:i/>
+                <w:iCs/>
+                <w:lang w:val="en-US" w:eastAsia="ja-JP"/>
+              </w:rPr>
+              <w:t>Aggressive</w:t>
+            </w:r>
+          </w:p>
+        </w:tc>
+      </w:tr>
+    </w:tbl>
+    <w:p>
+      <w:pPr>
+        <w:rPr>
+          <w:rFonts w:eastAsia="Yu Mincho"/>
+          <w:lang w:val="en-US" w:eastAsia="ja-JP"/>
+        </w:rPr>
+      </w:pPr>
+    </w:p>
+    <w:p>
+      <w:pPr>
+        <w:rPr>
+          <w:rFonts w:eastAsia="Yu Mincho"/>
+          <w:lang w:val="en-US" w:eastAsia="ja-JP"/>
+        </w:rPr>
+      </w:pPr>
+    </w:p>
+    <w:p>
+      <w:pPr>
+        <w:rPr>
+          <w:rFonts w:eastAsia="Yu Mincho"/>
+          <w:lang w:val="en-US" w:eastAsia="ja-JP"/>
+        </w:rPr>
+      </w:pPr>
+      <w:r>
+        <w:rPr>
+          <w:rFonts w:eastAsia="Yu Mincho"/>
+          <w:lang w:val="en-US" w:eastAsia="ja-JP"/>
+        </w:rPr>
+        <w:t xml:space="preserve">In this sense, status quo means that there is no desire to increase a power of the state on international stage… IMO it is very strange classification as 1. All entities want to increase </w:t>
+      </w:r>
+      <w:proofErr w:type="gramStart"/>
+      <w:r>
+        <w:rPr>
+          <w:rFonts w:eastAsia="Yu Mincho"/>
+          <w:lang w:val="en-US" w:eastAsia="ja-JP"/>
+        </w:rPr>
+        <w:t>theirs</w:t>
+      </w:r>
+      <w:proofErr w:type="gramEnd"/>
+      <w:r>
+        <w:rPr>
+          <w:rFonts w:eastAsia="Yu Mincho"/>
+          <w:lang w:val="en-US" w:eastAsia="ja-JP"/>
+        </w:rPr>
+        <w:t xml:space="preserve"> power and 2. You may want to increase your power inside current system and not change the system itself.</w:t>
+      </w:r>
+    </w:p>
+    <w:p>
+      <w:pPr>
+        <w:rPr>
+          <w:rFonts w:eastAsia="Yu Mincho"/>
+          <w:lang w:val="en-US" w:eastAsia="ja-JP"/>
+        </w:rPr>
+      </w:pPr>
+      <w:r>
+        <w:rPr>
+          <w:rFonts w:eastAsia="Yu Mincho"/>
+          <w:lang w:val="en-US" w:eastAsia="ja-JP"/>
+        </w:rPr>
+        <w:t xml:space="preserve">Difference between responsible and irresponsible leadership is the one that is </w:t>
+      </w:r>
+      <w:proofErr w:type="gramStart"/>
+      <w:r>
+        <w:rPr>
+          <w:rFonts w:eastAsia="Yu Mincho"/>
+          <w:lang w:val="en-US" w:eastAsia="ja-JP"/>
+        </w:rPr>
+        <w:t>wiling</w:t>
+      </w:r>
+      <w:proofErr w:type="gramEnd"/>
+      <w:r>
+        <w:rPr>
+          <w:rFonts w:eastAsia="Yu Mincho"/>
+          <w:lang w:val="en-US" w:eastAsia="ja-JP"/>
+        </w:rPr>
+        <w:t xml:space="preserve"> to change its path and admit to wrongdoing if </w:t>
+      </w:r>
+      <w:proofErr w:type="gramStart"/>
+      <w:r>
+        <w:rPr>
+          <w:rFonts w:eastAsia="Yu Mincho"/>
+          <w:lang w:val="en-US" w:eastAsia="ja-JP"/>
+        </w:rPr>
+        <w:t>theirs</w:t>
+      </w:r>
+      <w:proofErr w:type="gramEnd"/>
+      <w:r>
+        <w:rPr>
+          <w:rFonts w:eastAsia="Yu Mincho"/>
+          <w:lang w:val="en-US" w:eastAsia="ja-JP"/>
+        </w:rPr>
+        <w:t xml:space="preserve"> policies </w:t>
+      </w:r>
+      <w:proofErr w:type="gramStart"/>
+      <w:r>
+        <w:rPr>
+          <w:rFonts w:eastAsia="Yu Mincho"/>
+          <w:lang w:val="en-US" w:eastAsia="ja-JP"/>
+        </w:rPr>
+        <w:t>fails</w:t>
+      </w:r>
+      <w:proofErr w:type="gramEnd"/>
+      <w:r>
+        <w:rPr>
+          <w:rFonts w:eastAsia="Yu Mincho"/>
+          <w:lang w:val="en-US" w:eastAsia="ja-JP"/>
+        </w:rPr>
+        <w:t>.</w:t>
+      </w:r>
+    </w:p>
+    <w:p>
+      <w:pPr>
+        <w:rPr>
+          <w:rFonts w:eastAsia="Yu Mincho"/>
+          <w:lang w:val="en-US" w:eastAsia="ja-JP"/>
+        </w:rPr>
+      </w:pPr>
+    </w:p>
+    <w:p>
+      <w:pPr>
+        <w:rPr>
+          <w:rFonts w:eastAsia="Yu Mincho"/>
+          <w:lang w:val="en-US" w:eastAsia="ja-JP"/>
+        </w:rPr>
+      </w:pPr>
+    </w:p>
+    <w:p>
+      <w:pPr>
+        <w:rPr>
+          <w:rFonts w:eastAsia="Yu Mincho"/>
+          <w:lang w:val="en-US" w:eastAsia="ja-JP"/>
+        </w:rPr>
+      </w:pPr>
+      <w:r>
+        <w:rPr>
+          <w:rFonts w:eastAsia="Yu Mincho"/>
+          <w:lang w:val="en-US" w:eastAsia="ja-JP"/>
+        </w:rPr>
+        <w:t xml:space="preserve">Inactive leadership is also explained as Daoism or </w:t>
+      </w:r>
+      <w:proofErr w:type="spellStart"/>
+      <w:r>
+        <w:rPr>
+          <w:rFonts w:eastAsia="Yu Mincho"/>
+          <w:lang w:val="en-US" w:eastAsia="ja-JP"/>
+        </w:rPr>
+        <w:t>laisez</w:t>
+      </w:r>
+      <w:proofErr w:type="spellEnd"/>
+      <w:r>
+        <w:rPr>
+          <w:rFonts w:eastAsia="Yu Mincho"/>
+          <w:lang w:val="en-US" w:eastAsia="ja-JP"/>
+        </w:rPr>
+        <w:t>-faire (</w:t>
+      </w:r>
+      <w:proofErr w:type="spellStart"/>
+      <w:r>
+        <w:rPr>
+          <w:rFonts w:eastAsia="Yu Mincho"/>
+          <w:lang w:val="en-US" w:eastAsia="ja-JP"/>
+        </w:rPr>
+        <w:t>w</w:t>
+      </w:r>
+      <w:r>
+        <w:rPr>
+          <w:rFonts w:eastAsia="Yu Mincho"/>
+          <w:lang w:val="en-US" w:eastAsia="ja-JP"/>
+        </w:rPr>
+        <w:t>u</w:t>
+      </w:r>
+      <w:proofErr w:type="spellEnd"/>
+      <w:r>
+        <w:rPr>
+          <w:rFonts w:eastAsia="Yu Mincho"/>
+          <w:lang w:val="en-US" w:eastAsia="ja-JP"/>
+        </w:rPr>
+        <w:t xml:space="preserve"> </w:t>
+      </w:r>
+      <w:proofErr w:type="spellStart"/>
+      <w:r>
+        <w:rPr>
+          <w:rFonts w:eastAsia="Yu Mincho"/>
+          <w:lang w:val="en-US" w:eastAsia="ja-JP"/>
+        </w:rPr>
+        <w:t>wei</w:t>
+      </w:r>
+      <w:proofErr w:type="spellEnd"/>
+      <w:r>
+        <w:rPr>
+          <w:rFonts w:eastAsia="Yu Mincho"/>
+          <w:lang w:val="en-US" w:eastAsia="ja-JP"/>
+        </w:rPr>
+        <w:t xml:space="preserve"> er </w:t>
+      </w:r>
+      <w:proofErr w:type="spellStart"/>
+      <w:r>
+        <w:rPr>
+          <w:rFonts w:eastAsia="Yu Mincho"/>
+          <w:lang w:val="en-US" w:eastAsia="ja-JP"/>
+        </w:rPr>
+        <w:t>z</w:t>
+      </w:r>
+      <w:r>
+        <w:rPr>
+          <w:rFonts w:eastAsia="Yu Mincho"/>
+          <w:lang w:val="en-US" w:eastAsia="ja-JP"/>
+        </w:rPr>
+        <w:t>hi</w:t>
+      </w:r>
+      <w:proofErr w:type="spellEnd"/>
+      <w:r>
+        <w:rPr>
+          <w:rFonts w:eastAsia="Yu Mincho"/>
+          <w:lang w:val="en-US" w:eastAsia="ja-JP"/>
+        </w:rPr>
+        <w:t>)</w:t>
+      </w:r>
+      <w:r>
+        <w:rPr>
+          <w:rFonts w:eastAsia="Yu Mincho"/>
+          <w:lang w:val="en-US" w:eastAsia="ja-JP"/>
+        </w:rPr>
+        <w:t xml:space="preserve">. </w:t>
+      </w:r>
+    </w:p>
+    <w:p>
+      <w:pPr>
+        <w:rPr>
+          <w:rFonts w:eastAsia="Yu Mincho"/>
+          <w:lang w:val="en-US" w:eastAsia="ja-JP"/>
+        </w:rPr>
+      </w:pPr>
+      <w:proofErr w:type="spellStart"/>
+      <w:r>
+        <w:rPr>
+          <w:rFonts w:eastAsia="Yu Mincho"/>
+          <w:lang w:val="en-US" w:eastAsia="ja-JP"/>
+        </w:rPr>
+        <w:t>Governament</w:t>
+      </w:r>
+      <w:proofErr w:type="spellEnd"/>
+      <w:r>
+        <w:rPr>
+          <w:rFonts w:eastAsia="Yu Mincho"/>
+          <w:lang w:val="en-US" w:eastAsia="ja-JP"/>
+        </w:rPr>
+        <w:t xml:space="preserve"> that use this </w:t>
+      </w:r>
+      <w:proofErr w:type="gramStart"/>
+      <w:r>
+        <w:rPr>
+          <w:rFonts w:eastAsia="Yu Mincho"/>
+          <w:lang w:val="en-US" w:eastAsia="ja-JP"/>
+        </w:rPr>
+        <w:t>strategy,</w:t>
+      </w:r>
+      <w:proofErr w:type="gramEnd"/>
+      <w:r>
+        <w:rPr>
+          <w:rFonts w:eastAsia="Yu Mincho"/>
+          <w:lang w:val="en-US" w:eastAsia="ja-JP"/>
+        </w:rPr>
+        <w:t xml:space="preserve"> usually do not </w:t>
+      </w:r>
+      <w:proofErr w:type="gramStart"/>
+      <w:r>
+        <w:rPr>
+          <w:rFonts w:eastAsia="Yu Mincho"/>
+          <w:lang w:val="en-US" w:eastAsia="ja-JP"/>
+        </w:rPr>
+        <w:t>responds</w:t>
+      </w:r>
+      <w:proofErr w:type="gramEnd"/>
+      <w:r>
+        <w:rPr>
+          <w:rFonts w:eastAsia="Yu Mincho"/>
+          <w:lang w:val="en-US" w:eastAsia="ja-JP"/>
+        </w:rPr>
+        <w:t xml:space="preserve"> at all to the changes in environment. For domestic purposes, the </w:t>
+      </w:r>
+      <w:proofErr w:type="spellStart"/>
+      <w:r>
+        <w:rPr>
+          <w:rFonts w:eastAsia="Yu Mincho"/>
+          <w:lang w:val="en-US" w:eastAsia="ja-JP"/>
+        </w:rPr>
+        <w:t>internaiotnal</w:t>
+      </w:r>
+      <w:proofErr w:type="spellEnd"/>
+      <w:r>
+        <w:rPr>
+          <w:rFonts w:eastAsia="Yu Mincho"/>
+          <w:lang w:val="en-US" w:eastAsia="ja-JP"/>
+        </w:rPr>
+        <w:t xml:space="preserve"> relations are usually traded off for </w:t>
+      </w:r>
+      <w:proofErr w:type="gramStart"/>
+      <w:r>
+        <w:rPr>
+          <w:rFonts w:eastAsia="Yu Mincho"/>
+          <w:lang w:val="en-US" w:eastAsia="ja-JP"/>
+        </w:rPr>
+        <w:t>a</w:t>
+      </w:r>
+      <w:proofErr w:type="gramEnd"/>
+      <w:r>
+        <w:rPr>
+          <w:rFonts w:eastAsia="Yu Mincho"/>
+          <w:lang w:val="en-US" w:eastAsia="ja-JP"/>
+        </w:rPr>
+        <w:t xml:space="preserve"> accommodation with the opposition. They can dictate course of it in exchange for not meddling with key aspects of </w:t>
+      </w:r>
+      <w:proofErr w:type="spellStart"/>
+      <w:r>
+        <w:rPr>
+          <w:rFonts w:eastAsia="Yu Mincho"/>
+          <w:lang w:val="en-US" w:eastAsia="ja-JP"/>
+        </w:rPr>
+        <w:t>rulling</w:t>
+      </w:r>
+      <w:proofErr w:type="spellEnd"/>
+      <w:r>
+        <w:rPr>
+          <w:rFonts w:eastAsia="Yu Mincho"/>
+          <w:lang w:val="en-US" w:eastAsia="ja-JP"/>
+        </w:rPr>
+        <w:t xml:space="preserve"> party domestic policies.</w:t>
+      </w:r>
+    </w:p>
+    <w:p>
+      <w:pPr>
+        <w:rPr>
+          <w:rFonts w:eastAsia="Yu Mincho"/>
+          <w:lang w:val="en-US" w:eastAsia="ja-JP"/>
+        </w:rPr>
+      </w:pPr>
+    </w:p>
+    <w:p>
+      <w:pPr>
+        <w:rPr>
+          <w:rFonts w:eastAsia="Yu Mincho"/>
+          <w:lang w:val="en-US" w:eastAsia="ja-JP"/>
+        </w:rPr>
+      </w:pPr>
+      <w:r>
+        <w:rPr>
+          <w:rFonts w:eastAsia="Yu Mincho"/>
+          <w:lang w:val="en-US" w:eastAsia="ja-JP"/>
+        </w:rPr>
+        <w:t>Economic determinism, in this context is the idea of increasing the power of the state only by increasing its economic capabilities. This is the most common type of policy taken by states.</w:t>
+      </w:r>
+    </w:p>
+    <w:p>
+      <w:pPr>
+        <w:rPr>
+          <w:rFonts w:eastAsia="Yu Mincho"/>
+          <w:lang w:val="en-US" w:eastAsia="ja-JP"/>
+        </w:rPr>
+      </w:pPr>
+    </w:p>
+    <w:p>
+      <w:pPr>
+        <w:rPr>
+          <w:rFonts w:eastAsia="Yu Mincho"/>
+          <w:lang w:val="en-US" w:eastAsia="ja-JP"/>
+        </w:rPr>
+      </w:pPr>
+      <w:r>
+        <w:rPr>
+          <w:rFonts w:eastAsia="Yu Mincho"/>
+          <w:lang w:val="en-US" w:eastAsia="ja-JP"/>
+        </w:rPr>
+        <w:t xml:space="preserve">Poland would be classified as the Proactive Leadership as it is forming the </w:t>
+      </w:r>
+      <w:proofErr w:type="spellStart"/>
+      <w:r>
+        <w:rPr>
+          <w:rFonts w:eastAsia="Yu Mincho"/>
+          <w:lang w:val="en-US" w:eastAsia="ja-JP"/>
+        </w:rPr>
+        <w:t>anit</w:t>
+      </w:r>
+      <w:proofErr w:type="spellEnd"/>
+      <w:r>
+        <w:rPr>
+          <w:rFonts w:eastAsia="Yu Mincho"/>
+          <w:lang w:val="en-US" w:eastAsia="ja-JP"/>
+        </w:rPr>
+        <w:t>-Russia coalition inside and outside the UE, forming (</w:t>
+      </w:r>
+      <w:proofErr w:type="spellStart"/>
+      <w:r>
+        <w:rPr>
+          <w:rFonts w:eastAsia="Yu Mincho"/>
+          <w:lang w:val="en-US" w:eastAsia="ja-JP"/>
+        </w:rPr>
+        <w:t>unnoficial</w:t>
+      </w:r>
+      <w:proofErr w:type="spellEnd"/>
+      <w:r>
+        <w:rPr>
+          <w:rFonts w:eastAsia="Yu Mincho"/>
+          <w:lang w:val="en-US" w:eastAsia="ja-JP"/>
+        </w:rPr>
+        <w:t xml:space="preserve">) </w:t>
+      </w:r>
+      <w:proofErr w:type="spellStart"/>
+      <w:r>
+        <w:rPr>
+          <w:rFonts w:eastAsia="Yu Mincho"/>
+          <w:lang w:val="en-US" w:eastAsia="ja-JP"/>
+        </w:rPr>
+        <w:t>intermarrum</w:t>
+      </w:r>
+      <w:proofErr w:type="spellEnd"/>
+    </w:p>
+    <w:p>
+      <w:pPr>
+        <w:rPr>
+          <w:rFonts w:eastAsia="Yu Mincho"/>
+          <w:lang w:val="en-US" w:eastAsia="ja-JP"/>
+        </w:rPr>
+      </w:pPr>
+    </w:p>
+    <w:p>
+      <w:pPr>
+        <w:rPr>
+          <w:rFonts w:eastAsia="Yu Mincho"/>
+          <w:lang w:val="en-US" w:eastAsia="ja-JP"/>
+        </w:rPr>
+      </w:pPr>
+    </w:p>
+    <w:tbl>
+      <w:tblPr>
+        <w:tblStyle w:val="Tabela-Siatka"/>
+        <w:tblW w:w="0" w:type="auto"/>
+        <w:tblLook w:val="04A0" w:firstRow="1" w:lastRow="0" w:firstColumn="1" w:lastColumn="0" w:noHBand="0" w:noVBand="1"/>
+      </w:tblPr>
+      <w:tblGrid>
+        <w:gridCol w:w="1895"/>
+        <w:gridCol w:w="2495"/>
+        <w:gridCol w:w="2193"/>
+        <w:gridCol w:w="2433"/>
+      </w:tblGrid>
+      <w:tr>
+        <w:tc>
+          <w:tcPr>
+            <w:tcW w:w="4390" w:type="dxa"/>
+            <w:gridSpan w:val="2"/>
+            <w:vMerge w:val="restart"/>
+          </w:tcPr>
+          <w:p>
+            <w:pPr>
+              <w:rPr>
+                <w:rFonts w:eastAsia="Yu Mincho"/>
+                <w:lang w:val="en-US" w:eastAsia="ja-JP"/>
+              </w:rPr>
+            </w:pPr>
+            <w:r>
+              <w:rPr>
+                <w:rFonts w:eastAsia="Yu Mincho"/>
+                <w:lang w:val="en-US" w:eastAsia="ja-JP"/>
+              </w:rPr>
+              <w:t>TYPES OF INTERNATIONAL LEADERSHIP</w:t>
+            </w:r>
+          </w:p>
+        </w:tc>
+        <w:tc>
+          <w:tcPr>
+            <w:tcW w:w="4626" w:type="dxa"/>
+            <w:gridSpan w:val="2"/>
+          </w:tcPr>
+          <w:p>
+            <w:pPr>
+              <w:jc w:val="center"/>
+              <w:rPr>
+                <w:rFonts w:eastAsia="Yu Mincho"/>
+                <w:u w:val="single"/>
+                <w:lang w:val="en-US" w:eastAsia="ja-JP"/>
+              </w:rPr>
+            </w:pPr>
+            <w:r>
+              <w:rPr>
+                <w:rFonts w:eastAsia="Yu Mincho"/>
+                <w:u w:val="single"/>
+                <w:lang w:val="en-US" w:eastAsia="ja-JP"/>
+              </w:rPr>
+              <w:t>Strategic Credibility</w:t>
+            </w:r>
+          </w:p>
+        </w:tc>
+      </w:tr>
+      <w:tr>
+        <w:tc>
+          <w:tcPr>
+            <w:tcW w:w="4390" w:type="dxa"/>
+            <w:gridSpan w:val="2"/>
+            <w:vMerge/>
+          </w:tcPr>
+          <w:p>
+            <w:pPr>
+              <w:rPr>
+                <w:rFonts w:eastAsia="Yu Mincho"/>
+                <w:lang w:val="en-US" w:eastAsia="ja-JP"/>
+              </w:rPr>
+            </w:pPr>
+          </w:p>
+        </w:tc>
+        <w:tc>
+          <w:tcPr>
+            <w:tcW w:w="2193" w:type="dxa"/>
+          </w:tcPr>
+          <w:p>
+            <w:pPr>
+              <w:rPr>
+                <w:rFonts w:eastAsia="Yu Mincho"/>
+                <w:b/>
+                <w:bCs/>
+                <w:lang w:val="en-US" w:eastAsia="ja-JP"/>
+              </w:rPr>
+            </w:pPr>
+            <w:proofErr w:type="spellStart"/>
+            <w:r>
+              <w:rPr>
+                <w:rFonts w:eastAsia="Yu Mincho"/>
+                <w:b/>
+                <w:bCs/>
+                <w:lang w:val="en-US" w:eastAsia="ja-JP"/>
+              </w:rPr>
+              <w:t>Trustworthly</w:t>
+            </w:r>
+            <w:proofErr w:type="spellEnd"/>
+          </w:p>
+        </w:tc>
+        <w:tc>
+          <w:tcPr>
+            <w:tcW w:w="2433" w:type="dxa"/>
+          </w:tcPr>
+          <w:p>
+            <w:pPr>
+              <w:rPr>
+                <w:rFonts w:eastAsia="Yu Mincho"/>
+                <w:b/>
+                <w:bCs/>
+                <w:lang w:val="en-US" w:eastAsia="ja-JP"/>
+              </w:rPr>
+            </w:pPr>
+            <w:proofErr w:type="spellStart"/>
+            <w:r>
+              <w:rPr>
+                <w:rFonts w:eastAsia="Yu Mincho"/>
+                <w:b/>
+                <w:bCs/>
+                <w:lang w:val="en-US" w:eastAsia="ja-JP"/>
+              </w:rPr>
+              <w:t>Untrustworthly</w:t>
+            </w:r>
+            <w:proofErr w:type="spellEnd"/>
+          </w:p>
+        </w:tc>
+      </w:tr>
+      <w:tr>
+        <w:tc>
+          <w:tcPr>
+            <w:tcW w:w="1895" w:type="dxa"/>
+            <w:vMerge w:val="restart"/>
+          </w:tcPr>
+          <w:p>
+            <w:pPr>
+              <w:rPr>
+                <w:rFonts w:eastAsia="Yu Mincho"/>
+                <w:u w:val="single"/>
+                <w:lang w:val="en-US" w:eastAsia="ja-JP"/>
+              </w:rPr>
+            </w:pPr>
+            <w:r>
+              <w:rPr>
+                <w:rFonts w:eastAsia="Yu Mincho"/>
+                <w:u w:val="single"/>
+                <w:lang w:val="en-US" w:eastAsia="ja-JP"/>
+              </w:rPr>
+              <w:t>Principle of actions</w:t>
+            </w:r>
+          </w:p>
+        </w:tc>
+        <w:tc>
+          <w:tcPr>
+            <w:tcW w:w="2495" w:type="dxa"/>
+          </w:tcPr>
+          <w:p>
+            <w:pPr>
+              <w:rPr>
+                <w:rFonts w:eastAsia="Yu Mincho"/>
+                <w:b/>
+                <w:bCs/>
+                <w:lang w:val="en-US" w:eastAsia="ja-JP"/>
+              </w:rPr>
+            </w:pPr>
+            <w:r>
+              <w:rPr>
+                <w:rFonts w:eastAsia="Yu Mincho"/>
+                <w:b/>
+                <w:bCs/>
+                <w:lang w:val="en-US" w:eastAsia="ja-JP"/>
+              </w:rPr>
+              <w:t>Consistent</w:t>
+            </w:r>
+          </w:p>
+        </w:tc>
+        <w:tc>
+          <w:tcPr>
+            <w:tcW w:w="2193" w:type="dxa"/>
+          </w:tcPr>
+          <w:p>
+            <w:pPr>
+              <w:rPr>
+                <w:rFonts w:eastAsia="Yu Mincho"/>
+                <w:i/>
+                <w:iCs/>
+                <w:lang w:val="en-US" w:eastAsia="ja-JP"/>
+              </w:rPr>
+            </w:pPr>
+            <w:r>
+              <w:rPr>
+                <w:rFonts w:eastAsia="Yu Mincho"/>
+                <w:i/>
+                <w:iCs/>
+                <w:lang w:val="en-US" w:eastAsia="ja-JP"/>
+              </w:rPr>
+              <w:t>Humane authority</w:t>
+            </w:r>
+          </w:p>
+        </w:tc>
+        <w:tc>
+          <w:tcPr>
+            <w:tcW w:w="2433" w:type="dxa"/>
+          </w:tcPr>
+          <w:p>
+            <w:pPr>
+              <w:rPr>
+                <w:rFonts w:eastAsia="Yu Mincho"/>
+                <w:i/>
+                <w:iCs/>
+                <w:lang w:val="en-US" w:eastAsia="ja-JP"/>
+              </w:rPr>
+            </w:pPr>
+            <w:r>
+              <w:rPr>
+                <w:rFonts w:eastAsia="Yu Mincho"/>
+                <w:i/>
+                <w:iCs/>
+                <w:lang w:val="en-US" w:eastAsia="ja-JP"/>
+              </w:rPr>
+              <w:t>Tyranny</w:t>
+            </w:r>
+          </w:p>
+        </w:tc>
+      </w:tr>
+      <w:tr>
+        <w:tc>
+          <w:tcPr>
+            <w:tcW w:w="1895" w:type="dxa"/>
+            <w:vMerge/>
+          </w:tcPr>
+          <w:p>
+            <w:pPr>
+              <w:rPr>
+                <w:rFonts w:eastAsia="Yu Mincho"/>
+                <w:lang w:val="en-US" w:eastAsia="ja-JP"/>
+              </w:rPr>
+            </w:pPr>
+          </w:p>
+        </w:tc>
+        <w:tc>
+          <w:tcPr>
+            <w:tcW w:w="2495" w:type="dxa"/>
+          </w:tcPr>
+          <w:p>
+            <w:pPr>
+              <w:rPr>
+                <w:rFonts w:eastAsia="Yu Mincho"/>
+                <w:b/>
+                <w:bCs/>
+                <w:lang w:val="en-US" w:eastAsia="ja-JP"/>
+              </w:rPr>
+            </w:pPr>
+            <w:r>
+              <w:rPr>
+                <w:rFonts w:eastAsia="Yu Mincho"/>
+                <w:b/>
+                <w:bCs/>
+                <w:lang w:val="en-US" w:eastAsia="ja-JP"/>
+              </w:rPr>
+              <w:t>Double Standards</w:t>
+            </w:r>
+          </w:p>
+        </w:tc>
+        <w:tc>
+          <w:tcPr>
+            <w:tcW w:w="2193" w:type="dxa"/>
+          </w:tcPr>
+          <w:p>
+            <w:pPr>
+              <w:rPr>
+                <w:rFonts w:eastAsia="Yu Mincho"/>
+                <w:i/>
+                <w:iCs/>
+                <w:lang w:val="en-US" w:eastAsia="ja-JP"/>
+              </w:rPr>
+            </w:pPr>
+            <w:r>
+              <w:rPr>
+                <w:rFonts w:eastAsia="Yu Mincho"/>
+                <w:i/>
+                <w:iCs/>
+                <w:lang w:val="en-US" w:eastAsia="ja-JP"/>
+              </w:rPr>
+              <w:t>Hegemony</w:t>
+            </w:r>
+          </w:p>
+        </w:tc>
+        <w:tc>
+          <w:tcPr>
+            <w:tcW w:w="2433" w:type="dxa"/>
+          </w:tcPr>
+          <w:p>
+            <w:pPr>
+              <w:rPr>
+                <w:rFonts w:eastAsia="Yu Mincho"/>
+                <w:i/>
+                <w:iCs/>
+                <w:lang w:val="en-US" w:eastAsia="ja-JP"/>
+              </w:rPr>
+            </w:pPr>
+            <w:proofErr w:type="spellStart"/>
+            <w:r>
+              <w:rPr>
+                <w:rFonts w:eastAsia="Yu Mincho"/>
+                <w:i/>
+                <w:iCs/>
+                <w:lang w:val="en-US" w:eastAsia="ja-JP"/>
+              </w:rPr>
+              <w:t>Anemocracy</w:t>
+            </w:r>
+            <w:proofErr w:type="spellEnd"/>
+          </w:p>
+        </w:tc>
+      </w:tr>
+    </w:tbl>
+    <w:p>
+      <w:pPr>
+        <w:rPr>
+          <w:rFonts w:eastAsia="Yu Mincho"/>
+          <w:lang w:val="en-US" w:eastAsia="ja-JP"/>
+        </w:rPr>
+      </w:pPr>
+    </w:p>
+    <w:p>
+      <w:pPr>
+        <w:rPr>
+          <w:rFonts w:eastAsia="Yu Mincho"/>
+          <w:lang w:val="en-US" w:eastAsia="ja-JP"/>
+        </w:rPr>
+      </w:pPr>
+      <w:r>
+        <w:rPr>
+          <w:rFonts w:eastAsia="Yu Mincho"/>
+          <w:lang w:val="en-US" w:eastAsia="ja-JP"/>
+        </w:rPr>
+        <w:lastRenderedPageBreak/>
+        <w:t xml:space="preserve">Leading </w:t>
+      </w:r>
+      <w:proofErr w:type="gramStart"/>
+      <w:r>
+        <w:rPr>
+          <w:rFonts w:eastAsia="Yu Mincho"/>
+          <w:lang w:val="en-US" w:eastAsia="ja-JP"/>
+        </w:rPr>
+        <w:t>state</w:t>
+      </w:r>
+      <w:proofErr w:type="gramEnd"/>
+      <w:r>
+        <w:rPr>
+          <w:rFonts w:eastAsia="Yu Mincho"/>
+          <w:lang w:val="en-US" w:eastAsia="ja-JP"/>
+        </w:rPr>
+        <w:t xml:space="preserve"> can establish and maintain </w:t>
+      </w:r>
+      <w:proofErr w:type="gramStart"/>
+      <w:r>
+        <w:rPr>
+          <w:rFonts w:eastAsia="Yu Mincho"/>
+          <w:lang w:val="en-US" w:eastAsia="ja-JP"/>
+        </w:rPr>
+        <w:t>theirs</w:t>
+      </w:r>
+      <w:proofErr w:type="gramEnd"/>
+      <w:r>
+        <w:rPr>
+          <w:rFonts w:eastAsia="Yu Mincho"/>
+          <w:lang w:val="en-US" w:eastAsia="ja-JP"/>
+        </w:rPr>
+        <w:t xml:space="preserve"> authority by 1. Giving example and following established by themselves </w:t>
+      </w:r>
+      <w:proofErr w:type="spellStart"/>
+      <w:r>
+        <w:rPr>
+          <w:rFonts w:eastAsia="Yu Mincho"/>
+          <w:lang w:val="en-US" w:eastAsia="ja-JP"/>
+        </w:rPr>
+        <w:t>internaiotnal</w:t>
+      </w:r>
+      <w:proofErr w:type="spellEnd"/>
+      <w:r>
+        <w:rPr>
+          <w:rFonts w:eastAsia="Yu Mincho"/>
+          <w:lang w:val="en-US" w:eastAsia="ja-JP"/>
+        </w:rPr>
+        <w:t xml:space="preserve"> norms 2. Rewarding other states that follow those norms 3. Punish other states that </w:t>
+      </w:r>
+      <w:proofErr w:type="gramStart"/>
+      <w:r>
+        <w:rPr>
+          <w:rFonts w:eastAsia="Yu Mincho"/>
+          <w:lang w:val="en-US" w:eastAsia="ja-JP"/>
+        </w:rPr>
+        <w:t>breaks</w:t>
+      </w:r>
+      <w:proofErr w:type="gramEnd"/>
+      <w:r>
+        <w:rPr>
+          <w:rFonts w:eastAsia="Yu Mincho"/>
+          <w:lang w:val="en-US" w:eastAsia="ja-JP"/>
+        </w:rPr>
+        <w:t xml:space="preserve"> those norms.</w:t>
+      </w:r>
+    </w:p>
+    <w:p>
+      <w:pPr>
+        <w:rPr>
+          <w:rFonts w:eastAsia="Yu Mincho"/>
+          <w:lang w:val="en-US" w:eastAsia="ja-JP"/>
+        </w:rPr>
+      </w:pPr>
+    </w:p>
+    <w:p>
+      <w:pPr>
+        <w:rPr>
+          <w:rFonts w:eastAsia="Yu Mincho"/>
+          <w:lang w:val="en-US" w:eastAsia="ja-JP"/>
+        </w:rPr>
+      </w:pPr>
+      <w:r>
+        <w:rPr>
+          <w:rFonts w:eastAsia="Yu Mincho"/>
+          <w:lang w:val="en-US" w:eastAsia="ja-JP"/>
+        </w:rPr>
+        <w:t>Human authority – Sage King</w:t>
+      </w:r>
+    </w:p>
+    <w:p>
+      <w:pPr>
+        <w:rPr>
+          <w:rFonts w:eastAsia="Yu Mincho"/>
+          <w:lang w:val="en-US" w:eastAsia="ja-JP"/>
+        </w:rPr>
+      </w:pPr>
+      <w:r>
+        <w:rPr>
+          <w:rFonts w:eastAsia="Yu Mincho"/>
+          <w:lang w:val="en-US" w:eastAsia="ja-JP"/>
+        </w:rPr>
+        <w:t>‘One able to enrich own state is a hegemon, one that ‘rectify’ wrong states is a sage king.’</w:t>
+      </w:r>
+    </w:p>
+    <w:p>
+      <w:pPr>
+        <w:rPr>
+          <w:rFonts w:eastAsia="Yu Mincho"/>
+          <w:lang w:val="en-US" w:eastAsia="ja-JP"/>
+        </w:rPr>
+      </w:pPr>
+    </w:p>
+    <w:p>
+      <w:pPr>
+        <w:rPr>
+          <w:rFonts w:eastAsia="Yu Mincho"/>
+          <w:lang w:val="en-US" w:eastAsia="ja-JP"/>
+        </w:rPr>
+      </w:pPr>
+    </w:p>
+    <w:p>
+      <w:pPr>
+        <w:rPr>
+          <w:rFonts w:eastAsia="Yu Mincho"/>
+          <w:lang w:val="en-US" w:eastAsia="ja-JP"/>
+        </w:rPr>
+      </w:pPr>
+      <w:r>
+        <w:rPr>
+          <w:rFonts w:eastAsia="Yu Mincho"/>
+          <w:lang w:val="en-US" w:eastAsia="ja-JP"/>
+        </w:rPr>
+        <w:t>Do</w:t>
+      </w:r>
+      <w:r>
+        <w:rPr>
+          <w:rFonts w:eastAsia="Yu Mincho"/>
+          <w:lang w:val="en-US" w:eastAsia="ja-JP"/>
+        </w:rPr>
+        <w:t>u</w:t>
+      </w:r>
+      <w:r>
+        <w:rPr>
+          <w:rFonts w:eastAsia="Yu Mincho"/>
+          <w:lang w:val="en-US" w:eastAsia="ja-JP"/>
+        </w:rPr>
+        <w:t xml:space="preserve">ble standards in a hegemon type of leadership </w:t>
+      </w:r>
+      <w:proofErr w:type="gramStart"/>
+      <w:r>
+        <w:rPr>
+          <w:rFonts w:eastAsia="Yu Mincho"/>
+          <w:lang w:val="en-US" w:eastAsia="ja-JP"/>
+        </w:rPr>
+        <w:t>means</w:t>
+      </w:r>
+      <w:proofErr w:type="gramEnd"/>
+      <w:r>
+        <w:rPr>
+          <w:rFonts w:eastAsia="Yu Mincho"/>
+          <w:lang w:val="en-US" w:eastAsia="ja-JP"/>
+        </w:rPr>
+        <w:t xml:space="preserve"> that they are upholding moral norms in </w:t>
+      </w:r>
+      <w:proofErr w:type="gramStart"/>
+      <w:r>
+        <w:rPr>
+          <w:rFonts w:eastAsia="Yu Mincho"/>
+          <w:lang w:val="en-US" w:eastAsia="ja-JP"/>
+        </w:rPr>
+        <w:t>a relations</w:t>
+      </w:r>
+      <w:proofErr w:type="gramEnd"/>
+      <w:r>
+        <w:rPr>
+          <w:rFonts w:eastAsia="Yu Mincho"/>
+          <w:lang w:val="en-US" w:eastAsia="ja-JP"/>
+        </w:rPr>
+        <w:t xml:space="preserve"> with </w:t>
+      </w:r>
+      <w:proofErr w:type="gramStart"/>
+      <w:r>
+        <w:rPr>
+          <w:rFonts w:eastAsia="Yu Mincho"/>
+          <w:lang w:val="en-US" w:eastAsia="ja-JP"/>
+        </w:rPr>
+        <w:t>theirs</w:t>
+      </w:r>
+      <w:proofErr w:type="gramEnd"/>
+      <w:r>
+        <w:rPr>
+          <w:rFonts w:eastAsia="Yu Mincho"/>
+          <w:lang w:val="en-US" w:eastAsia="ja-JP"/>
+        </w:rPr>
+        <w:t xml:space="preserve"> allies but they are </w:t>
+      </w:r>
+      <w:r>
+        <w:rPr>
+          <w:rFonts w:eastAsia="Yu Mincho"/>
+          <w:lang w:val="en-US" w:eastAsia="ja-JP"/>
+        </w:rPr>
+        <w:t>r</w:t>
+      </w:r>
+      <w:r>
+        <w:rPr>
+          <w:rFonts w:eastAsia="Yu Mincho"/>
+          <w:lang w:val="en-US" w:eastAsia="ja-JP"/>
+        </w:rPr>
+        <w:t>uthless in fight against rivals.</w:t>
+      </w:r>
+      <w:r>
+        <w:rPr>
+          <w:rFonts w:eastAsia="Yu Mincho"/>
+          <w:lang w:val="en-US" w:eastAsia="ja-JP"/>
+        </w:rPr>
+        <w:t xml:space="preserve"> It keeps credibility among allies.</w:t>
+      </w:r>
+      <w:r>
+        <w:rPr>
+          <w:rFonts w:eastAsia="Yu Mincho"/>
+          <w:lang w:val="en-US" w:eastAsia="ja-JP"/>
+        </w:rPr>
+        <w:t xml:space="preserve"> </w:t>
+      </w:r>
+    </w:p>
+    <w:p>
+      <w:pPr>
+        <w:rPr>
+          <w:rFonts w:eastAsia="Yu Mincho"/>
+          <w:lang w:val="en-US" w:eastAsia="ja-JP"/>
+        </w:rPr>
+      </w:pPr>
+      <w:r>
+        <w:rPr>
+          <w:rFonts w:eastAsia="Yu Mincho"/>
+          <w:lang w:val="en-US" w:eastAsia="ja-JP"/>
+        </w:rPr>
+        <w:t xml:space="preserve">Hegemony here </w:t>
+      </w:r>
+      <w:proofErr w:type="spellStart"/>
+      <w:r>
+        <w:rPr>
+          <w:rFonts w:eastAsia="Yu Mincho"/>
+          <w:lang w:val="en-US" w:eastAsia="ja-JP"/>
+        </w:rPr>
+        <w:t>doesn</w:t>
+      </w:r>
+      <w:proofErr w:type="spellEnd"/>
+      <w:r>
+        <w:rPr>
+          <w:rFonts w:eastAsia="Yu Mincho"/>
+          <w:lang w:val="en-US" w:eastAsia="ja-JP"/>
+        </w:rPr>
+        <w:t xml:space="preserve"> means the overwhelming capacity of the state to influence others but the moral standing… which is very </w:t>
+      </w:r>
+      <w:proofErr w:type="spellStart"/>
+      <w:r>
+        <w:rPr>
+          <w:rFonts w:eastAsia="Yu Mincho"/>
+          <w:lang w:val="en-US" w:eastAsia="ja-JP"/>
+        </w:rPr>
+        <w:t>unhelpfull</w:t>
+      </w:r>
+      <w:proofErr w:type="spellEnd"/>
+      <w:r>
+        <w:rPr>
+          <w:rFonts w:eastAsia="Yu Mincho"/>
+          <w:lang w:val="en-US" w:eastAsia="ja-JP"/>
+        </w:rPr>
+        <w:t xml:space="preserve">. I think we need better </w:t>
+      </w:r>
+      <w:proofErr w:type="gramStart"/>
+      <w:r>
+        <w:rPr>
+          <w:rFonts w:eastAsia="Yu Mincho"/>
+          <w:lang w:val="en-US" w:eastAsia="ja-JP"/>
+        </w:rPr>
+        <w:t>word</w:t>
+      </w:r>
+      <w:proofErr w:type="gramEnd"/>
+      <w:r>
+        <w:rPr>
+          <w:rFonts w:eastAsia="Yu Mincho"/>
+          <w:lang w:val="en-US" w:eastAsia="ja-JP"/>
+        </w:rPr>
+        <w:t xml:space="preserve"> to describe somebody that sits in between the benevolent and tyrannical ruler. </w:t>
+      </w:r>
+    </w:p>
+    <w:p>
+      <w:pPr>
+        <w:rPr>
+          <w:rFonts w:eastAsia="Yu Mincho"/>
+          <w:lang w:val="en-US" w:eastAsia="ja-JP"/>
+        </w:rPr>
+      </w:pPr>
+    </w:p>
+    <w:p>
+      <w:pPr>
+        <w:rPr>
+          <w:rFonts w:eastAsia="Yu Mincho"/>
+          <w:lang w:val="en-US" w:eastAsia="ja-JP"/>
+        </w:rPr>
+      </w:pPr>
+      <w:r>
+        <w:rPr>
+          <w:rFonts w:eastAsia="Yu Mincho"/>
+          <w:lang w:val="en-US" w:eastAsia="ja-JP"/>
+        </w:rPr>
+        <w:t xml:space="preserve">IT IS IMPORTANT TO UNDERLINE that hegemonistic behavior described here is not the same as the hegemony understood by the </w:t>
+      </w:r>
+      <w:proofErr w:type="spellStart"/>
+      <w:r>
+        <w:rPr>
+          <w:rFonts w:eastAsia="Yu Mincho"/>
+          <w:lang w:val="en-US" w:eastAsia="ja-JP"/>
+        </w:rPr>
+        <w:t>angloshpere</w:t>
+      </w:r>
+      <w:proofErr w:type="spellEnd"/>
+      <w:r>
+        <w:rPr>
+          <w:rFonts w:eastAsia="Yu Mincho"/>
+          <w:lang w:val="en-US" w:eastAsia="ja-JP"/>
+        </w:rPr>
+        <w:t xml:space="preserve"> and US strategy.</w:t>
+      </w:r>
+    </w:p>
+    <w:p>
+      <w:pPr>
+        <w:rPr>
+          <w:rFonts w:eastAsia="Yu Mincho"/>
+          <w:lang w:val="en-US" w:eastAsia="ja-JP"/>
+        </w:rPr>
+      </w:pPr>
+      <w:r>
+        <w:rPr>
+          <w:rFonts w:eastAsia="Yu Mincho"/>
+          <w:lang w:val="en-US" w:eastAsia="ja-JP"/>
+        </w:rPr>
+        <w:t xml:space="preserve">Replacement word: Stewardship instead of hegemony? Hmm maybe a little too </w:t>
+      </w:r>
+      <w:r>
+        <w:rPr>
+          <w:rFonts w:eastAsia="Yu Mincho"/>
+          <w:lang w:val="en-US" w:eastAsia="ja-JP"/>
+        </w:rPr>
+        <w:t xml:space="preserve">subservient Primacy? How does it interfere with strategy of primacy vs </w:t>
+      </w:r>
+      <w:proofErr w:type="gramStart"/>
+      <w:r>
+        <w:rPr>
+          <w:rFonts w:eastAsia="Yu Mincho"/>
+          <w:lang w:val="en-US" w:eastAsia="ja-JP"/>
+        </w:rPr>
+        <w:t>off-shore</w:t>
+      </w:r>
+      <w:proofErr w:type="gramEnd"/>
+      <w:r>
+        <w:rPr>
+          <w:rFonts w:eastAsia="Yu Mincho"/>
+          <w:lang w:val="en-US" w:eastAsia="ja-JP"/>
+        </w:rPr>
+        <w:t xml:space="preserve"> balancing vs isolationism. Suzerainty? Maybe.</w:t>
+      </w:r>
+      <w:r>
+        <w:rPr>
+          <w:rFonts w:eastAsia="Yu Mincho"/>
+          <w:lang w:val="en-US" w:eastAsia="ja-JP"/>
+        </w:rPr>
+        <w:t xml:space="preserve"> </w:t>
+      </w:r>
+      <w:proofErr w:type="spellStart"/>
+      <w:r>
+        <w:rPr>
+          <w:rFonts w:eastAsia="Yu Mincho"/>
+          <w:lang w:val="en-US" w:eastAsia="ja-JP"/>
+        </w:rPr>
+        <w:t>Archonat</w:t>
+      </w:r>
+      <w:proofErr w:type="spellEnd"/>
+      <w:r>
+        <w:rPr>
+          <w:rFonts w:eastAsia="Yu Mincho"/>
+          <w:lang w:val="en-US" w:eastAsia="ja-JP"/>
+        </w:rPr>
+        <w:t>? (from Greek archon) sounds a little fantasy-like.</w:t>
+      </w:r>
+      <w:r>
+        <w:rPr>
+          <w:rFonts w:eastAsia="Yu Mincho"/>
+          <w:lang w:val="en-US" w:eastAsia="ja-JP"/>
+        </w:rPr>
+        <w:t xml:space="preserve"> Patron?</w:t>
+      </w:r>
+      <w:r>
+        <w:rPr>
+          <w:rFonts w:eastAsia="Yu Mincho"/>
+          <w:lang w:val="en-US" w:eastAsia="ja-JP"/>
+        </w:rPr>
+        <w:t xml:space="preserve"> </w:t>
+      </w:r>
+      <w:r>
+        <w:rPr>
+          <w:rFonts w:eastAsia="Yu Mincho"/>
+          <w:lang w:eastAsia="ja-JP"/>
+        </w:rPr>
+        <w:t>霸</w:t>
+      </w:r>
+      <w:r>
+        <w:rPr>
+          <w:rFonts w:eastAsia="Yu Mincho"/>
+          <w:lang w:val="en-US" w:eastAsia="ja-JP"/>
+        </w:rPr>
+        <w:t xml:space="preserve"> (Ba)?</w:t>
+      </w:r>
+      <w:r>
+        <w:rPr>
+          <w:rFonts w:eastAsia="Yu Mincho"/>
+          <w:lang w:val="en-US" w:eastAsia="ja-JP"/>
+        </w:rPr>
+        <w:t xml:space="preserve"> (Badao, the principle (the way) of </w:t>
+      </w:r>
+      <w:proofErr w:type="gramStart"/>
+      <w:r>
+        <w:rPr>
+          <w:rFonts w:eastAsia="Yu Mincho"/>
+          <w:lang w:val="en-US" w:eastAsia="ja-JP"/>
+        </w:rPr>
+        <w:t>t</w:t>
+      </w:r>
+      <w:r>
+        <w:rPr>
+          <w:rFonts w:eastAsia="Yu Mincho"/>
+          <w:lang w:val="en-US" w:eastAsia="ja-JP"/>
+        </w:rPr>
+        <w:t>he hegemony</w:t>
+      </w:r>
+      <w:proofErr w:type="gramEnd"/>
+      <w:r>
+        <w:rPr>
+          <w:rFonts w:eastAsia="Yu Mincho"/>
+          <w:lang w:val="en-US" w:eastAsia="ja-JP"/>
+        </w:rPr>
+        <w:t>)</w:t>
+      </w:r>
+    </w:p>
+    <w:p>
+      <w:pPr>
+        <w:rPr>
+          <w:rFonts w:eastAsia="Yu Mincho"/>
+          <w:lang w:val="en-US" w:eastAsia="ja-JP"/>
+        </w:rPr>
+      </w:pPr>
+      <w:r>
+        <w:rPr>
+          <w:rFonts w:eastAsia="Yu Mincho"/>
+          <w:lang w:val="en-US" w:eastAsia="ja-JP"/>
+        </w:rPr>
+        <w:t>(</w:t>
+      </w:r>
+      <w:proofErr w:type="gramStart"/>
+      <w:r>
+        <w:rPr>
+          <w:rFonts w:eastAsia="Yu Mincho"/>
+          <w:lang w:val="en-US" w:eastAsia="ja-JP"/>
+        </w:rPr>
+        <w:t>also</w:t>
+      </w:r>
+      <w:proofErr w:type="gramEnd"/>
+      <w:r>
+        <w:rPr>
+          <w:rFonts w:eastAsia="Yu Mincho"/>
+          <w:lang w:val="en-US" w:eastAsia="ja-JP"/>
+        </w:rPr>
+        <w:t xml:space="preserve">, </w:t>
+      </w:r>
+      <w:proofErr w:type="spellStart"/>
+      <w:r>
+        <w:rPr>
+          <w:rFonts w:eastAsia="Yu Mincho"/>
+          <w:lang w:val="en-US" w:eastAsia="ja-JP"/>
+        </w:rPr>
+        <w:t>wangdao</w:t>
+      </w:r>
+      <w:proofErr w:type="spellEnd"/>
+      <w:r>
+        <w:rPr>
+          <w:rFonts w:eastAsia="Yu Mincho"/>
+          <w:lang w:val="en-US" w:eastAsia="ja-JP"/>
+        </w:rPr>
+        <w:t>, the principle of humane authority?? (isn’t wang a king?)</w:t>
+      </w:r>
+    </w:p>
+    <w:p>
+      <w:pPr>
+        <w:rPr>
+          <w:rFonts w:eastAsia="Yu Mincho"/>
+          <w:lang w:val="en-US" w:eastAsia="ja-JP"/>
+        </w:rPr>
+      </w:pPr>
+    </w:p>
+    <w:p>
+      <w:pPr>
+        <w:rPr>
+          <w:rFonts w:eastAsia="Yu Mincho"/>
+          <w:lang w:val="en-US" w:eastAsia="ja-JP"/>
+        </w:rPr>
+      </w:pPr>
+      <w:r>
+        <w:rPr>
+          <w:rFonts w:eastAsia="Yu Mincho"/>
+          <w:lang w:val="en-US" w:eastAsia="ja-JP"/>
+        </w:rPr>
+        <w:t xml:space="preserve">… omg, Chinese authors also try to replace the hegemony concept in this regard (Ba). For example, Xiong </w:t>
+      </w:r>
+      <w:proofErr w:type="spellStart"/>
+      <w:r>
+        <w:rPr>
+          <w:rFonts w:eastAsia="Yu Mincho"/>
+          <w:lang w:val="en-US" w:eastAsia="ja-JP"/>
+        </w:rPr>
+        <w:t>cai</w:t>
+      </w:r>
+      <w:proofErr w:type="spellEnd"/>
+      <w:r>
+        <w:rPr>
+          <w:rFonts w:eastAsia="Yu Mincho"/>
+          <w:lang w:val="en-US" w:eastAsia="ja-JP"/>
+        </w:rPr>
+        <w:t xml:space="preserve"> da </w:t>
+      </w:r>
+      <w:proofErr w:type="spellStart"/>
+      <w:r>
+        <w:rPr>
+          <w:rFonts w:eastAsia="Yu Mincho"/>
+          <w:lang w:val="en-US" w:eastAsia="ja-JP"/>
+        </w:rPr>
+        <w:t>lue</w:t>
+      </w:r>
+      <w:proofErr w:type="spellEnd"/>
+      <w:r>
+        <w:rPr>
+          <w:rFonts w:eastAsia="Yu Mincho"/>
+          <w:lang w:val="en-US" w:eastAsia="ja-JP"/>
+        </w:rPr>
+        <w:t xml:space="preserve"> *great talent and bold vision). It also doesn’t </w:t>
+      </w:r>
+      <w:proofErr w:type="gramStart"/>
+      <w:r>
+        <w:rPr>
+          <w:rFonts w:eastAsia="Yu Mincho"/>
+          <w:lang w:val="en-US" w:eastAsia="ja-JP"/>
+        </w:rPr>
+        <w:t>seems</w:t>
+      </w:r>
+      <w:proofErr w:type="gramEnd"/>
+      <w:r>
+        <w:rPr>
+          <w:rFonts w:eastAsia="Yu Mincho"/>
+          <w:lang w:val="en-US" w:eastAsia="ja-JP"/>
+        </w:rPr>
+        <w:t xml:space="preserve"> to be </w:t>
+      </w:r>
+      <w:proofErr w:type="gramStart"/>
+      <w:r>
+        <w:rPr>
+          <w:rFonts w:eastAsia="Yu Mincho"/>
+          <w:lang w:val="en-US" w:eastAsia="ja-JP"/>
+        </w:rPr>
+        <w:t>pretty useful</w:t>
+      </w:r>
+      <w:proofErr w:type="gramEnd"/>
+      <w:r>
+        <w:rPr>
+          <w:rFonts w:eastAsia="Yu Mincho"/>
+          <w:lang w:val="en-US" w:eastAsia="ja-JP"/>
+        </w:rPr>
+        <w:t>.</w:t>
+      </w:r>
+    </w:p>
+    <w:p>
+      <w:pPr>
+        <w:rPr>
+          <w:rFonts w:eastAsia="Yu Mincho"/>
+          <w:lang w:val="en-US" w:eastAsia="ja-JP"/>
+        </w:rPr>
+      </w:pPr>
+    </w:p>
+    <w:p>
+      <w:pPr>
+        <w:rPr>
+          <w:rFonts w:eastAsia="Yu Mincho"/>
+          <w:lang w:val="en-US" w:eastAsia="ja-JP"/>
+        </w:rPr>
+      </w:pPr>
+      <w:r>
+        <w:rPr>
+          <w:rFonts w:eastAsia="Yu Mincho"/>
+          <w:lang w:val="en-US" w:eastAsia="ja-JP"/>
+        </w:rPr>
+        <w:t xml:space="preserve">As the hegemonistic powers fall, corrode, corrupt </w:t>
+      </w:r>
+      <w:proofErr w:type="spellStart"/>
+      <w:r>
+        <w:rPr>
+          <w:rFonts w:eastAsia="Yu Mincho"/>
+          <w:lang w:val="en-US" w:eastAsia="ja-JP"/>
+        </w:rPr>
+        <w:t>themslefs</w:t>
+      </w:r>
+      <w:proofErr w:type="spellEnd"/>
+      <w:r>
+        <w:rPr>
+          <w:rFonts w:eastAsia="Yu Mincho"/>
+          <w:lang w:val="en-US" w:eastAsia="ja-JP"/>
+        </w:rPr>
+        <w:t xml:space="preserve">, </w:t>
+      </w:r>
+      <w:proofErr w:type="gramStart"/>
+      <w:r>
+        <w:rPr>
+          <w:rFonts w:eastAsia="Yu Mincho"/>
+          <w:lang w:val="en-US" w:eastAsia="ja-JP"/>
+        </w:rPr>
+        <w:t>theirs</w:t>
+      </w:r>
+      <w:proofErr w:type="gramEnd"/>
+      <w:r>
+        <w:rPr>
+          <w:rFonts w:eastAsia="Yu Mincho"/>
+          <w:lang w:val="en-US" w:eastAsia="ja-JP"/>
+        </w:rPr>
+        <w:t xml:space="preserve"> position can change. Once sage king can be replaced by ‘hegemon’ (in old classification) and then </w:t>
+      </w:r>
+      <w:proofErr w:type="spellStart"/>
+      <w:r>
+        <w:rPr>
+          <w:rFonts w:eastAsia="Yu Mincho"/>
+          <w:lang w:val="en-US" w:eastAsia="ja-JP"/>
+        </w:rPr>
+        <w:t>turnet</w:t>
+      </w:r>
+      <w:proofErr w:type="spellEnd"/>
+      <w:r>
+        <w:rPr>
+          <w:rFonts w:eastAsia="Yu Mincho"/>
+          <w:lang w:val="en-US" w:eastAsia="ja-JP"/>
+        </w:rPr>
+        <w:t xml:space="preserve"> into </w:t>
+      </w:r>
+      <w:proofErr w:type="spellStart"/>
+      <w:r>
+        <w:rPr>
+          <w:rFonts w:eastAsia="Yu Mincho"/>
+          <w:lang w:val="en-US" w:eastAsia="ja-JP"/>
+        </w:rPr>
+        <w:t>anemocrat</w:t>
+      </w:r>
+      <w:proofErr w:type="spellEnd"/>
+      <w:r>
+        <w:rPr>
+          <w:rFonts w:eastAsia="Yu Mincho"/>
+          <w:lang w:val="en-US" w:eastAsia="ja-JP"/>
+        </w:rPr>
+        <w:t xml:space="preserve"> (example of USA since end of WW2 </w:t>
+      </w:r>
+      <w:proofErr w:type="spellStart"/>
+      <w:r>
+        <w:rPr>
+          <w:rFonts w:eastAsia="Yu Mincho"/>
+          <w:lang w:val="en-US" w:eastAsia="ja-JP"/>
+        </w:rPr>
+        <w:t>untill</w:t>
+      </w:r>
+      <w:proofErr w:type="spellEnd"/>
+      <w:r>
+        <w:rPr>
+          <w:rFonts w:eastAsia="Yu Mincho"/>
+          <w:lang w:val="en-US" w:eastAsia="ja-JP"/>
+        </w:rPr>
+        <w:t xml:space="preserve"> today). What can be interesting, I do not see or know and example of the hegemon that would fall into the Tyrant category. Maybe </w:t>
+      </w:r>
+      <w:proofErr w:type="gramStart"/>
+      <w:r>
+        <w:rPr>
+          <w:rFonts w:eastAsia="Yu Mincho"/>
+          <w:lang w:val="en-US" w:eastAsia="ja-JP"/>
+        </w:rPr>
+        <w:t>the Athens</w:t>
+      </w:r>
+      <w:proofErr w:type="gramEnd"/>
+      <w:r>
+        <w:rPr>
+          <w:rFonts w:eastAsia="Yu Mincho"/>
+          <w:lang w:val="en-US" w:eastAsia="ja-JP"/>
+        </w:rPr>
+        <w:t xml:space="preserve">? But IMO the transition ends on the </w:t>
+      </w:r>
+      <w:proofErr w:type="spellStart"/>
+      <w:r>
+        <w:rPr>
+          <w:rFonts w:eastAsia="Yu Mincho"/>
+          <w:lang w:val="en-US" w:eastAsia="ja-JP"/>
+        </w:rPr>
+        <w:t>anemocracy</w:t>
+      </w:r>
+      <w:proofErr w:type="spellEnd"/>
+      <w:r>
+        <w:rPr>
+          <w:rFonts w:eastAsia="Yu Mincho"/>
+          <w:lang w:val="en-US" w:eastAsia="ja-JP"/>
+        </w:rPr>
+        <w:t>.</w:t>
+      </w:r>
+    </w:p>
+    <w:p>
+      <w:pPr>
+        <w:rPr>
+          <w:rFonts w:eastAsia="Yu Mincho"/>
+          <w:lang w:val="en-US" w:eastAsia="ja-JP"/>
+        </w:rPr>
+      </w:pPr>
+      <w:r>
+        <w:rPr>
+          <w:rFonts w:eastAsia="Yu Mincho"/>
+          <w:lang w:val="en-US" w:eastAsia="ja-JP"/>
+        </w:rPr>
+        <w:lastRenderedPageBreak/>
+        <w:t xml:space="preserve">If would not be </w:t>
+      </w:r>
+      <w:proofErr w:type="spellStart"/>
+      <w:r>
+        <w:rPr>
+          <w:rFonts w:eastAsia="Yu Mincho"/>
+          <w:lang w:val="en-US" w:eastAsia="ja-JP"/>
+        </w:rPr>
+        <w:t>preaty</w:t>
+      </w:r>
+      <w:proofErr w:type="spellEnd"/>
+      <w:r>
+        <w:rPr>
+          <w:rFonts w:eastAsia="Yu Mincho"/>
+          <w:lang w:val="en-US" w:eastAsia="ja-JP"/>
+        </w:rPr>
+        <w:t xml:space="preserve"> from matrix perspective but I would suggest dividing hegemons into 2 </w:t>
+      </w:r>
+      <w:proofErr w:type="spellStart"/>
+      <w:r>
+        <w:rPr>
+          <w:rFonts w:eastAsia="Yu Mincho"/>
+          <w:lang w:val="en-US" w:eastAsia="ja-JP"/>
+        </w:rPr>
+        <w:t>cateogires</w:t>
+      </w:r>
+      <w:proofErr w:type="spellEnd"/>
+      <w:r>
+        <w:rPr>
+          <w:rFonts w:eastAsia="Yu Mincho"/>
+          <w:lang w:val="en-US" w:eastAsia="ja-JP"/>
+        </w:rPr>
+        <w:t xml:space="preserve">. Hegemon that are mostly working on the level of legitimacy and those that replace </w:t>
+      </w:r>
+      <w:proofErr w:type="gramStart"/>
+      <w:r>
+        <w:rPr>
+          <w:rFonts w:eastAsia="Yu Mincho"/>
+          <w:lang w:val="en-US" w:eastAsia="ja-JP"/>
+        </w:rPr>
+        <w:t>theirs</w:t>
+      </w:r>
+      <w:proofErr w:type="gramEnd"/>
+      <w:r>
+        <w:rPr>
+          <w:rFonts w:eastAsia="Yu Mincho"/>
+          <w:lang w:val="en-US" w:eastAsia="ja-JP"/>
+        </w:rPr>
+        <w:t xml:space="preserve"> authority with coercion but </w:t>
+      </w:r>
+      <w:proofErr w:type="gramStart"/>
+      <w:r>
+        <w:rPr>
+          <w:rFonts w:eastAsia="Yu Mincho"/>
+          <w:lang w:val="en-US" w:eastAsia="ja-JP"/>
+        </w:rPr>
+        <w:t>doesn’t</w:t>
+      </w:r>
+      <w:proofErr w:type="gramEnd"/>
+      <w:r>
+        <w:rPr>
+          <w:rFonts w:eastAsia="Yu Mincho"/>
+          <w:lang w:val="en-US" w:eastAsia="ja-JP"/>
+        </w:rPr>
+        <w:t xml:space="preserve"> abandon yet the moral order. One could be the Suzerain (legitimacy) and </w:t>
+      </w:r>
+      <w:proofErr w:type="gramStart"/>
+      <w:r>
+        <w:rPr>
+          <w:rFonts w:eastAsia="Yu Mincho"/>
+          <w:lang w:val="en-US" w:eastAsia="ja-JP"/>
+        </w:rPr>
+        <w:t>other</w:t>
+      </w:r>
+      <w:proofErr w:type="gramEnd"/>
+      <w:r>
+        <w:rPr>
+          <w:rFonts w:eastAsia="Yu Mincho"/>
+          <w:lang w:val="en-US" w:eastAsia="ja-JP"/>
+        </w:rPr>
+        <w:t xml:space="preserve"> would be the overlord (might). </w:t>
+      </w:r>
+      <w:r>
+        <w:rPr>
+          <w:rFonts w:eastAsia="Yu Mincho"/>
+          <w:lang w:val="en-US" w:eastAsia="ja-JP"/>
+        </w:rPr>
+        <w:t xml:space="preserve"> But where is the border between them (transition stage?)</w:t>
+      </w:r>
+    </w:p>
+    <w:p>
+      <w:pPr>
+        <w:rPr>
+          <w:rFonts w:eastAsia="Yu Mincho"/>
+          <w:lang w:val="en-US" w:eastAsia="ja-JP"/>
+        </w:rPr>
+      </w:pPr>
+      <w:r>
+        <w:rPr>
+          <w:rFonts w:eastAsia="Yu Mincho"/>
+          <w:lang w:val="en-US" w:eastAsia="ja-JP"/>
+        </w:rPr>
+        <w:t xml:space="preserve">Also, I would replace the matrix with a slider, having the sage king on one side and tyrant on the other. Both ends are unsustainable for leadership as the sage would bound their hands </w:t>
+      </w:r>
+      <w:proofErr w:type="gramStart"/>
+      <w:r>
+        <w:rPr>
+          <w:rFonts w:eastAsia="Yu Mincho"/>
+          <w:lang w:val="en-US" w:eastAsia="ja-JP"/>
+        </w:rPr>
+        <w:t>to</w:t>
+      </w:r>
+      <w:proofErr w:type="gramEnd"/>
+      <w:r>
+        <w:rPr>
+          <w:rFonts w:eastAsia="Yu Mincho"/>
+          <w:lang w:val="en-US" w:eastAsia="ja-JP"/>
+        </w:rPr>
+        <w:t xml:space="preserve"> much with </w:t>
+      </w:r>
+      <w:proofErr w:type="spellStart"/>
+      <w:r>
+        <w:rPr>
+          <w:rFonts w:eastAsia="Yu Mincho"/>
+          <w:lang w:val="en-US" w:eastAsia="ja-JP"/>
+        </w:rPr>
+        <w:t>legitimical</w:t>
+      </w:r>
+      <w:proofErr w:type="spellEnd"/>
+      <w:r>
+        <w:rPr>
+          <w:rFonts w:eastAsia="Yu Mincho"/>
+          <w:lang w:val="en-US" w:eastAsia="ja-JP"/>
+        </w:rPr>
+        <w:t xml:space="preserve"> system which would be easy to exploit.</w:t>
+      </w:r>
+    </w:p>
+    <w:p>
+      <w:pPr>
+        <w:rPr>
+          <w:rFonts w:eastAsia="Yu Mincho"/>
+          <w:lang w:val="en-US" w:eastAsia="ja-JP"/>
+        </w:rPr>
+      </w:pPr>
+      <w:r>
+        <w:rPr>
+          <w:rFonts w:eastAsia="Yu Mincho"/>
+          <w:lang w:val="en-US" w:eastAsia="ja-JP"/>
+        </w:rPr>
+        <w:t xml:space="preserve">IMO leading states are becoming more prone to use of sticks (violence) because you cannot regain lost authority. Once lost is gone forever. You may trick new people into your authority or </w:t>
+      </w:r>
+      <w:proofErr w:type="spellStart"/>
+      <w:r>
+        <w:rPr>
+          <w:rFonts w:eastAsia="Yu Mincho"/>
+          <w:lang w:val="en-US" w:eastAsia="ja-JP"/>
+        </w:rPr>
+        <w:t>disiluusion</w:t>
+      </w:r>
+      <w:proofErr w:type="spellEnd"/>
+      <w:r>
+        <w:rPr>
+          <w:rFonts w:eastAsia="Yu Mincho"/>
+          <w:lang w:val="en-US" w:eastAsia="ja-JP"/>
+        </w:rPr>
+        <w:t xml:space="preserve"> older members of the system into telling them truth, that the backbone of the system is might and they can pretend that we are living in world where rules matter or they will </w:t>
+      </w:r>
+      <w:proofErr w:type="gramStart"/>
+      <w:r>
+        <w:rPr>
+          <w:rFonts w:eastAsia="Yu Mincho"/>
+          <w:lang w:val="en-US" w:eastAsia="ja-JP"/>
+        </w:rPr>
+        <w:t>became</w:t>
+      </w:r>
+      <w:proofErr w:type="gramEnd"/>
+      <w:r>
+        <w:rPr>
+          <w:rFonts w:eastAsia="Yu Mincho"/>
+          <w:lang w:val="en-US" w:eastAsia="ja-JP"/>
+        </w:rPr>
+        <w:t xml:space="preserve"> the victim of non-rules world order (blackmail).</w:t>
+      </w:r>
+      <w:r>
+        <w:rPr>
+          <w:rFonts w:eastAsia="Yu Mincho"/>
+          <w:lang w:val="en-US" w:eastAsia="ja-JP"/>
+        </w:rPr>
+        <w:t xml:space="preserve"> But you can’t get it </w:t>
+      </w:r>
+      <w:proofErr w:type="gramStart"/>
+      <w:r>
+        <w:rPr>
+          <w:rFonts w:eastAsia="Yu Mincho"/>
+          <w:lang w:val="en-US" w:eastAsia="ja-JP"/>
+        </w:rPr>
+        <w:t>a new</w:t>
+      </w:r>
+      <w:proofErr w:type="gramEnd"/>
+      <w:r>
+        <w:rPr>
+          <w:rFonts w:eastAsia="Yu Mincho"/>
+          <w:lang w:val="en-US" w:eastAsia="ja-JP"/>
+        </w:rPr>
+        <w:t>. The only way would be to create completely new world system… I am not sure if this can be done by the old hegemon.</w:t>
+      </w:r>
+    </w:p>
+    <w:p>
+      <w:pPr>
+        <w:rPr>
+          <w:rFonts w:eastAsia="Yu Mincho"/>
+          <w:lang w:val="en-US" w:eastAsia="ja-JP"/>
+        </w:rPr>
+      </w:pPr>
+      <w:proofErr w:type="spellStart"/>
+      <w:r>
+        <w:rPr>
+          <w:rFonts w:eastAsia="Yu Mincho"/>
+          <w:lang w:val="en-US" w:eastAsia="ja-JP"/>
+        </w:rPr>
+        <w:t>Anemocratic</w:t>
+      </w:r>
+      <w:proofErr w:type="spellEnd"/>
+      <w:r>
+        <w:rPr>
+          <w:rFonts w:eastAsia="Yu Mincho"/>
+          <w:lang w:val="en-US" w:eastAsia="ja-JP"/>
+        </w:rPr>
+        <w:t xml:space="preserve"> -&gt; bullies weaker states and </w:t>
+      </w:r>
+      <w:proofErr w:type="spellStart"/>
+      <w:r>
+        <w:rPr>
+          <w:rFonts w:eastAsia="Yu Mincho"/>
+          <w:lang w:val="en-US" w:eastAsia="ja-JP"/>
+        </w:rPr>
+        <w:t>yelds</w:t>
+      </w:r>
+      <w:proofErr w:type="spellEnd"/>
+      <w:r>
+        <w:rPr>
+          <w:rFonts w:eastAsia="Yu Mincho"/>
+          <w:lang w:val="en-US" w:eastAsia="ja-JP"/>
+        </w:rPr>
+        <w:t xml:space="preserve"> to stronger.</w:t>
+      </w:r>
+      <w:r>
+        <w:rPr>
+          <w:rFonts w:eastAsia="Yu Mincho"/>
+          <w:lang w:val="en-US" w:eastAsia="ja-JP"/>
+        </w:rPr>
+        <w:t xml:space="preserve"> Trump’s administration is considered to by </w:t>
+      </w:r>
+      <w:proofErr w:type="spellStart"/>
+      <w:r>
+        <w:rPr>
+          <w:rFonts w:eastAsia="Yu Mincho"/>
+          <w:lang w:val="en-US" w:eastAsia="ja-JP"/>
+        </w:rPr>
+        <w:t>Anemocratic</w:t>
+      </w:r>
+      <w:proofErr w:type="spellEnd"/>
+      <w:r>
+        <w:rPr>
+          <w:rFonts w:eastAsia="Yu Mincho"/>
+          <w:lang w:val="en-US" w:eastAsia="ja-JP"/>
+        </w:rPr>
+        <w:t xml:space="preserve">. The historical example of </w:t>
+      </w:r>
+      <w:proofErr w:type="spellStart"/>
+      <w:r>
+        <w:rPr>
+          <w:rFonts w:eastAsia="Yu Mincho"/>
+          <w:lang w:val="en-US" w:eastAsia="ja-JP"/>
+        </w:rPr>
+        <w:t>anemocratic</w:t>
+      </w:r>
+      <w:proofErr w:type="spellEnd"/>
+      <w:r>
+        <w:rPr>
+          <w:rFonts w:eastAsia="Yu Mincho"/>
+          <w:lang w:val="en-US" w:eastAsia="ja-JP"/>
+        </w:rPr>
+        <w:t xml:space="preserve"> action was the King You, </w:t>
+      </w:r>
+      <w:proofErr w:type="spellStart"/>
+      <w:r>
+        <w:rPr>
+          <w:rFonts w:eastAsia="Yu Mincho"/>
+          <w:lang w:val="en-US" w:eastAsia="ja-JP"/>
+        </w:rPr>
+        <w:t>litting</w:t>
+      </w:r>
+      <w:proofErr w:type="spellEnd"/>
+      <w:r>
+        <w:rPr>
+          <w:rFonts w:eastAsia="Yu Mincho"/>
+          <w:lang w:val="en-US" w:eastAsia="ja-JP"/>
+        </w:rPr>
+        <w:t xml:space="preserve"> </w:t>
+      </w:r>
+      <w:proofErr w:type="spellStart"/>
+      <w:r>
+        <w:rPr>
+          <w:rFonts w:eastAsia="Yu Mincho"/>
+          <w:lang w:val="en-US" w:eastAsia="ja-JP"/>
+        </w:rPr>
+        <w:t>becons</w:t>
+      </w:r>
+      <w:proofErr w:type="spellEnd"/>
+      <w:r>
+        <w:rPr>
+          <w:rFonts w:eastAsia="Yu Mincho"/>
+          <w:lang w:val="en-US" w:eastAsia="ja-JP"/>
+        </w:rPr>
+        <w:t xml:space="preserve"> to call allies for help, just to check if they would </w:t>
+      </w:r>
+      <w:proofErr w:type="gramStart"/>
+      <w:r>
+        <w:rPr>
+          <w:rFonts w:eastAsia="Yu Mincho"/>
+          <w:lang w:val="en-US" w:eastAsia="ja-JP"/>
+        </w:rPr>
+        <w:t>came</w:t>
+      </w:r>
+      <w:proofErr w:type="gramEnd"/>
+      <w:r>
+        <w:rPr>
+          <w:rFonts w:eastAsia="Yu Mincho"/>
+          <w:lang w:val="en-US" w:eastAsia="ja-JP"/>
+        </w:rPr>
+        <w:t xml:space="preserve">… When the </w:t>
+      </w:r>
+      <w:proofErr w:type="spellStart"/>
+      <w:r>
+        <w:rPr>
+          <w:rFonts w:eastAsia="Yu Mincho"/>
+          <w:lang w:val="en-US" w:eastAsia="ja-JP"/>
+        </w:rPr>
+        <w:t>reall</w:t>
+      </w:r>
+      <w:proofErr w:type="spellEnd"/>
+      <w:r>
+        <w:rPr>
+          <w:rFonts w:eastAsia="Yu Mincho"/>
+          <w:lang w:val="en-US" w:eastAsia="ja-JP"/>
+        </w:rPr>
+        <w:t xml:space="preserve"> danger occurred, nobody reacted for </w:t>
+      </w:r>
+      <w:proofErr w:type="spellStart"/>
+      <w:r>
+        <w:rPr>
+          <w:rFonts w:eastAsia="Yu Mincho"/>
+          <w:lang w:val="en-US" w:eastAsia="ja-JP"/>
+        </w:rPr>
+        <w:t>ple</w:t>
+      </w:r>
+      <w:proofErr w:type="spellEnd"/>
+      <w:r>
+        <w:rPr>
+          <w:rFonts w:eastAsia="Yu Mincho"/>
+          <w:lang w:val="en-US" w:eastAsia="ja-JP"/>
+        </w:rPr>
+        <w:t xml:space="preserve"> for help.</w:t>
+      </w:r>
+    </w:p>
+    <w:p>
+      <w:pPr>
+        <w:rPr>
+          <w:rFonts w:eastAsia="Yu Mincho"/>
+          <w:lang w:val="en-US" w:eastAsia="ja-JP"/>
+        </w:rPr>
+      </w:pPr>
+      <w:proofErr w:type="spellStart"/>
+      <w:r>
+        <w:rPr>
+          <w:rFonts w:eastAsia="Yu Mincho"/>
+          <w:lang w:val="en-US" w:eastAsia="ja-JP"/>
+        </w:rPr>
+        <w:t>Tyranical</w:t>
+      </w:r>
+      <w:proofErr w:type="spellEnd"/>
+      <w:r>
+        <w:rPr>
+          <w:rFonts w:eastAsia="Yu Mincho"/>
+          <w:lang w:val="en-US" w:eastAsia="ja-JP"/>
+        </w:rPr>
+        <w:t xml:space="preserve"> leaders are adapting a Realpolitik thus not rivals nor allies are willing to trust them</w:t>
+      </w:r>
+      <w:r>
+        <w:rPr>
+          <w:rFonts w:eastAsia="Yu Mincho"/>
+          <w:lang w:val="en-US" w:eastAsia="ja-JP"/>
+        </w:rPr>
+        <w:t>. They do not adhere to any system of norms.</w:t>
+      </w:r>
+      <w:r>
+        <w:rPr>
+          <w:rFonts w:eastAsia="Yu Mincho"/>
+          <w:lang w:val="en-US" w:eastAsia="ja-JP"/>
+        </w:rPr>
+        <w:t xml:space="preserve"> If this type of country is the world leader, </w:t>
+      </w:r>
+      <w:proofErr w:type="gramStart"/>
+      <w:r>
+        <w:rPr>
+          <w:rFonts w:eastAsia="Yu Mincho"/>
+          <w:lang w:val="en-US" w:eastAsia="ja-JP"/>
+        </w:rPr>
+        <w:t>the anarchy</w:t>
+      </w:r>
+      <w:proofErr w:type="gramEnd"/>
+      <w:r>
+        <w:rPr>
+          <w:rFonts w:eastAsia="Yu Mincho"/>
+          <w:lang w:val="en-US" w:eastAsia="ja-JP"/>
+        </w:rPr>
+        <w:t xml:space="preserve"> is </w:t>
+      </w:r>
+      <w:proofErr w:type="gramStart"/>
+      <w:r>
+        <w:rPr>
+          <w:rFonts w:eastAsia="Yu Mincho"/>
+          <w:lang w:val="en-US" w:eastAsia="ja-JP"/>
+        </w:rPr>
+        <w:t>extremally</w:t>
+      </w:r>
+      <w:proofErr w:type="gramEnd"/>
+      <w:r>
+        <w:rPr>
+          <w:rFonts w:eastAsia="Yu Mincho"/>
+          <w:lang w:val="en-US" w:eastAsia="ja-JP"/>
+        </w:rPr>
+        <w:t xml:space="preserve"> visible in the system. ‘Law of the Jungle’. Norms </w:t>
+      </w:r>
+      <w:proofErr w:type="gramStart"/>
+      <w:r>
+        <w:rPr>
+          <w:rFonts w:eastAsia="Yu Mincho"/>
+          <w:lang w:val="en-US" w:eastAsia="ja-JP"/>
+        </w:rPr>
+        <w:t>starts</w:t>
+      </w:r>
+      <w:proofErr w:type="gramEnd"/>
+      <w:r>
+        <w:rPr>
+          <w:rFonts w:eastAsia="Yu Mincho"/>
+          <w:lang w:val="en-US" w:eastAsia="ja-JP"/>
+        </w:rPr>
+        <w:t xml:space="preserve"> to perish even between states that are not tyrannical.</w:t>
+      </w:r>
+      <w:r>
+        <w:rPr>
+          <w:rFonts w:eastAsia="Yu Mincho"/>
+          <w:lang w:val="en-US" w:eastAsia="ja-JP"/>
+        </w:rPr>
+        <w:t xml:space="preserve"> The examples of </w:t>
+      </w:r>
+      <w:proofErr w:type="spellStart"/>
+      <w:r>
+        <w:rPr>
+          <w:rFonts w:eastAsia="Yu Mincho"/>
+          <w:lang w:val="en-US" w:eastAsia="ja-JP"/>
+        </w:rPr>
+        <w:t>Tyranical</w:t>
+      </w:r>
+      <w:proofErr w:type="spellEnd"/>
+      <w:r>
+        <w:rPr>
+          <w:rFonts w:eastAsia="Yu Mincho"/>
+          <w:lang w:val="en-US" w:eastAsia="ja-JP"/>
+        </w:rPr>
+        <w:t xml:space="preserve"> states are: Nazi Germany, Japan during WW2 or Qin Dynasty in China.</w:t>
+      </w:r>
+    </w:p>
+    <w:p>
+      <w:pPr>
+        <w:rPr>
+          <w:rFonts w:eastAsia="Yu Mincho"/>
+          <w:lang w:val="en-US" w:eastAsia="ja-JP"/>
+        </w:rPr>
+      </w:pPr>
+      <w:r>
+        <w:rPr>
+          <w:rFonts w:eastAsia="Yu Mincho"/>
+          <w:lang w:val="en-US" w:eastAsia="ja-JP"/>
+        </w:rPr>
+        <w:t xml:space="preserve">Other examples could be: Neo-Asyrian Empire, </w:t>
+      </w:r>
+      <w:proofErr w:type="spellStart"/>
+      <w:r>
+        <w:rPr>
+          <w:rFonts w:eastAsia="Yu Mincho"/>
+          <w:lang w:val="en-US" w:eastAsia="ja-JP"/>
+        </w:rPr>
+        <w:t>Gengis</w:t>
+      </w:r>
+      <w:proofErr w:type="spellEnd"/>
+      <w:r>
+        <w:rPr>
+          <w:rFonts w:eastAsia="Yu Mincho"/>
+          <w:lang w:val="en-US" w:eastAsia="ja-JP"/>
+        </w:rPr>
+        <w:t xml:space="preserve"> Khan</w:t>
+      </w:r>
+      <w:r>
+        <w:rPr>
+          <w:rFonts w:eastAsia="Yu Mincho"/>
+          <w:lang w:val="en-US" w:eastAsia="ja-JP"/>
+        </w:rPr>
+        <w:t xml:space="preserve"> (I would argue that they were not </w:t>
+      </w:r>
+      <w:proofErr w:type="spellStart"/>
+      <w:r>
+        <w:rPr>
+          <w:rFonts w:eastAsia="Yu Mincho"/>
+          <w:lang w:val="en-US" w:eastAsia="ja-JP"/>
+        </w:rPr>
+        <w:t>stricte</w:t>
+      </w:r>
+      <w:proofErr w:type="spellEnd"/>
+      <w:r>
+        <w:rPr>
+          <w:rFonts w:eastAsia="Yu Mincho"/>
+          <w:lang w:val="en-US" w:eastAsia="ja-JP"/>
+        </w:rPr>
+        <w:t xml:space="preserve"> tyrannical… more hegemonistic)</w:t>
+      </w:r>
+      <w:r>
+        <w:rPr>
+          <w:rFonts w:eastAsia="Yu Mincho"/>
+          <w:lang w:val="en-US" w:eastAsia="ja-JP"/>
+        </w:rPr>
+        <w:t>, Ottoman Empire during Mehmed II??? Qing Empire, Durrani (Afghanistan) Empire.</w:t>
+      </w:r>
+    </w:p>
+    <w:p>
+      <w:pPr>
+        <w:rPr>
+          <w:rFonts w:eastAsia="Yu Mincho"/>
+          <w:lang w:val="en-US" w:eastAsia="ja-JP"/>
+        </w:rPr>
+      </w:pPr>
+    </w:p>
+    <w:p>
+      <w:pPr>
+        <w:rPr>
+          <w:rFonts w:eastAsia="Yu Mincho"/>
+          <w:lang w:val="en-US" w:eastAsia="ja-JP"/>
+        </w:rPr>
+      </w:pPr>
+      <w:r>
+        <w:rPr>
+          <w:rFonts w:eastAsia="Yu Mincho"/>
+          <w:lang w:val="en-US" w:eastAsia="ja-JP"/>
+        </w:rPr>
+        <w:t xml:space="preserve">‘Most of the </w:t>
+      </w:r>
+      <w:proofErr w:type="gramStart"/>
+      <w:r>
+        <w:rPr>
+          <w:rFonts w:eastAsia="Yu Mincho"/>
+          <w:lang w:val="en-US" w:eastAsia="ja-JP"/>
+        </w:rPr>
+        <w:t>real life</w:t>
+      </w:r>
+      <w:proofErr w:type="gramEnd"/>
+      <w:r>
+        <w:rPr>
+          <w:rFonts w:eastAsia="Yu Mincho"/>
+          <w:lang w:val="en-US" w:eastAsia="ja-JP"/>
+        </w:rPr>
+        <w:t xml:space="preserve"> examples are hybrids of the selected types’ Oh and here we have a huge problem. Because if in real life we cannot use this classification then what is the point of it? The abstract idea doesn’t justify itself. </w:t>
+      </w:r>
+    </w:p>
+    <w:p>
+      <w:pPr>
+        <w:rPr>
+          <w:rFonts w:eastAsia="Yu Mincho"/>
+          <w:lang w:val="en-US" w:eastAsia="ja-JP"/>
+        </w:rPr>
+      </w:pPr>
+    </w:p>
+    <w:p>
+      <w:pPr>
+        <w:rPr>
+          <w:rFonts w:eastAsia="Yu Mincho"/>
+          <w:lang w:val="en-US" w:eastAsia="ja-JP"/>
+        </w:rPr>
+      </w:pPr>
+      <w:r>
+        <w:rPr>
+          <w:rFonts w:eastAsia="Yu Mincho"/>
+          <w:lang w:val="en-US" w:eastAsia="ja-JP"/>
+        </w:rPr>
+        <w:t xml:space="preserve">The leadership, to be convincing, must mix </w:t>
+      </w:r>
+      <w:proofErr w:type="gramStart"/>
+      <w:r>
+        <w:rPr>
+          <w:rFonts w:eastAsia="Yu Mincho"/>
+          <w:lang w:val="en-US" w:eastAsia="ja-JP"/>
+        </w:rPr>
+        <w:t>theirs</w:t>
+      </w:r>
+      <w:proofErr w:type="gramEnd"/>
+      <w:r>
+        <w:rPr>
+          <w:rFonts w:eastAsia="Yu Mincho"/>
+          <w:lang w:val="en-US" w:eastAsia="ja-JP"/>
+        </w:rPr>
+        <w:t xml:space="preserve"> internal ideology with international one. It may be hard for China to accomplish this.</w:t>
+      </w:r>
+    </w:p>
+    <w:p>
+      <w:pPr>
+        <w:pBdr>
+          <w:bottom w:val="single" w:sz="6" w:space="1" w:color="auto"/>
+        </w:pBdr>
+        <w:rPr>
+          <w:rFonts w:eastAsia="Yu Mincho"/>
+          <w:lang w:val="en-US" w:eastAsia="ja-JP"/>
+        </w:rPr>
+      </w:pPr>
+    </w:p>
+    <w:p>
+      <w:pPr>
+        <w:rPr>
+          <w:rFonts w:eastAsia="Yu Mincho"/>
+          <w:lang w:val="en-US" w:eastAsia="ja-JP"/>
+        </w:rPr>
+      </w:pPr>
+      <w:r>
+        <w:rPr>
+          <w:rFonts w:eastAsia="Yu Mincho"/>
+          <w:lang w:val="en-US" w:eastAsia="ja-JP"/>
+        </w:rPr>
+        <w:lastRenderedPageBreak/>
+        <w:t>Chapter 3 Corollaries of International Change</w:t>
+      </w:r>
+    </w:p>
+    <w:p>
+      <w:pPr>
+        <w:rPr>
+          <w:rFonts w:eastAsia="Yu Mincho"/>
+          <w:lang w:val="en-US" w:eastAsia="ja-JP"/>
+        </w:rPr>
+      </w:pPr>
+    </w:p>
+    <w:p>
+      <w:pPr>
+        <w:rPr>
+          <w:rFonts w:eastAsia="Yu Mincho"/>
+          <w:lang w:val="en-US" w:eastAsia="ja-JP"/>
+        </w:rPr>
+      </w:pPr>
+      <w:r>
+        <w:rPr>
+          <w:rFonts w:eastAsia="Yu Mincho"/>
+          <w:lang w:val="en-US" w:eastAsia="ja-JP"/>
+        </w:rPr>
+        <w:t>‘</w:t>
+      </w:r>
+      <w:r>
+        <w:rPr>
+          <w:rFonts w:eastAsia="Yu Mincho"/>
+          <w:lang w:val="en-US" w:eastAsia="ja-JP"/>
+        </w:rPr>
+        <w:t xml:space="preserve">Different types of state leadership result in the uneven growth of the </w:t>
+      </w:r>
+      <w:r>
+        <w:rPr>
+          <w:rFonts w:eastAsia="Yu Mincho"/>
+          <w:lang w:val="en-US" w:eastAsia="ja-JP"/>
+        </w:rPr>
+        <w:t>capacity</w:t>
+      </w:r>
+      <w:r>
+        <w:rPr>
+          <w:rFonts w:eastAsia="Yu Mincho"/>
+          <w:lang w:val="en-US" w:eastAsia="ja-JP"/>
+        </w:rPr>
+        <w:t xml:space="preserve"> of major powers</w:t>
+      </w:r>
+      <w:r>
+        <w:rPr>
+          <w:rFonts w:eastAsia="Yu Mincho"/>
+          <w:lang w:val="en-US" w:eastAsia="ja-JP"/>
+        </w:rPr>
+        <w:t xml:space="preserve">, which if </w:t>
+      </w:r>
+      <w:proofErr w:type="spellStart"/>
+      <w:proofErr w:type="gramStart"/>
+      <w:r>
+        <w:rPr>
+          <w:rFonts w:eastAsia="Yu Mincho"/>
+          <w:lang w:val="en-US" w:eastAsia="ja-JP"/>
+        </w:rPr>
+        <w:t>if</w:t>
+      </w:r>
+      <w:proofErr w:type="spellEnd"/>
+      <w:proofErr w:type="gramEnd"/>
+      <w:r>
+        <w:rPr>
+          <w:rFonts w:eastAsia="Yu Mincho"/>
+          <w:lang w:val="en-US" w:eastAsia="ja-JP"/>
+        </w:rPr>
+        <w:t xml:space="preserve"> continues over decades, will lead to a change in the entire international </w:t>
+      </w:r>
+      <w:proofErr w:type="gramStart"/>
+      <w:r>
+        <w:rPr>
+          <w:rFonts w:eastAsia="Yu Mincho"/>
+          <w:lang w:val="en-US" w:eastAsia="ja-JP"/>
+        </w:rPr>
+        <w:t>configuration;.</w:t>
+      </w:r>
+      <w:proofErr w:type="gramEnd"/>
+      <w:r>
+        <w:rPr>
+          <w:rFonts w:eastAsia="Yu Mincho"/>
+          <w:lang w:val="en-US" w:eastAsia="ja-JP"/>
+        </w:rPr>
+        <w:t xml:space="preserve"> -&gt; The quality of leadership over long </w:t>
+      </w:r>
+      <w:proofErr w:type="gramStart"/>
+      <w:r>
+        <w:rPr>
+          <w:rFonts w:eastAsia="Yu Mincho"/>
+          <w:lang w:val="en-US" w:eastAsia="ja-JP"/>
+        </w:rPr>
+        <w:t>period</w:t>
+      </w:r>
+      <w:proofErr w:type="gramEnd"/>
+      <w:r>
+        <w:rPr>
+          <w:rFonts w:eastAsia="Yu Mincho"/>
+          <w:lang w:val="en-US" w:eastAsia="ja-JP"/>
+        </w:rPr>
+        <w:t xml:space="preserve"> of time/generations is the primary influence of the </w:t>
+      </w:r>
+      <w:proofErr w:type="spellStart"/>
+      <w:r>
+        <w:rPr>
+          <w:rFonts w:eastAsia="Yu Mincho"/>
+          <w:lang w:val="en-US" w:eastAsia="ja-JP"/>
+        </w:rPr>
+        <w:t>states</w:t>
+      </w:r>
+      <w:proofErr w:type="spellEnd"/>
+      <w:r>
+        <w:rPr>
+          <w:rFonts w:eastAsia="Yu Mincho"/>
+          <w:lang w:val="en-US" w:eastAsia="ja-JP"/>
+        </w:rPr>
+        <w:t xml:space="preserve"> power.</w:t>
       </w:r>
     </w:p>
     <w:sectPr>
@@ -1168,6 +5377,25 @@
       <w:spacing w:val="5"/>
     </w:rPr>
   </w:style>
+  <w:style w:type="table" w:styleId="Tabela-Siatka">
+    <w:name w:val="Table Grid"/>
+    <w:basedOn w:val="Standardowy"/>
+    <w:uiPriority w:val="39"/>
+    <w:rsid w:val="00EB4B2E"/>
+    <w:pPr>
+      <w:spacing w:after="0" w:line="240" w:lineRule="auto"/>
+    </w:pPr>
+    <w:tblPr>
+      <w:tblBorders>
+        <w:top w:val="single" w:sz="4" w:space="0" w:color="auto"/>
+        <w:left w:val="single" w:sz="4" w:space="0" w:color="auto"/>
+        <w:bottom w:val="single" w:sz="4" w:space="0" w:color="auto"/>
+        <w:right w:val="single" w:sz="4" w:space="0" w:color="auto"/>
+        <w:insideH w:val="single" w:sz="4" w:space="0" w:color="auto"/>
+        <w:insideV w:val="single" w:sz="4" w:space="0" w:color="auto"/>
+      </w:tblBorders>
+    </w:tblPr>
+  </w:style>
 </w:styles>
 </file>
 

</xml_diff>

<commit_message>
french and japan and korean doctrines
</commit_message>
<xml_diff>
--- a/Realism/Leadership and the rise of great powers Yan Xuetong.docx
+++ b/Realism/Leadership and the rise of great powers Yan Xuetong.docx
@@ -3171,6 +3171,768 @@
           <w:lang w:val="en-US" w:eastAsia="ja-JP"/>
         </w:rPr>
         <w:t>Marthas Finnemore and Kathryn Sikking created a framework for norms changes: 1. Leading states propose new norms 2. The majority of states follow the proposal 3. The norms are internalized or socialized as universal principles guiding international behavior.</w:t>
+      </w:r>
+    </w:p>
+    <w:p>
+      <w:pPr>
+        <w:rPr>
+          <w:rFonts w:eastAsia="Yu Mincho"/>
+          <w:lang w:val="en-US" w:eastAsia="ja-JP"/>
+        </w:rPr>
+      </w:pPr>
+    </w:p>
+    <w:p>
+      <w:pPr>
+        <w:rPr>
+          <w:rFonts w:eastAsia="Yu Mincho"/>
+          <w:lang w:val="en-US" w:eastAsia="ja-JP"/>
+        </w:rPr>
+      </w:pPr>
+      <w:r>
+        <w:rPr>
+          <w:rFonts w:eastAsia="Yu Mincho"/>
+          <w:lang w:val="en-US" w:eastAsia="ja-JP"/>
+        </w:rPr>
+        <w:t>They are 3 mechanisms used by dominant states to socialize new norms. Persuasion, external inducement and internal reconstruction.</w:t>
+      </w:r>
+      <w:r>
+        <w:rPr>
+          <w:rFonts w:eastAsia="Yu Mincho"/>
+          <w:lang w:val="en-US" w:eastAsia="ja-JP"/>
+        </w:rPr>
+        <w:t xml:space="preserve"> Inducement is usually connected with trys to change the internal leadership (from imperial to democratic in Japan after ww2.. but I would day that it also works for support for anti European parties I nEurope by bo</w:t>
+      </w:r>
+      <w:r>
+        <w:rPr>
+          <w:rFonts w:eastAsia="Yu Mincho"/>
+          <w:lang w:val="en-US" w:eastAsia="ja-JP"/>
+        </w:rPr>
+        <w:t>t</w:t>
+      </w:r>
+      <w:r>
+        <w:rPr>
+          <w:rFonts w:eastAsia="Yu Mincho"/>
+          <w:lang w:val="en-US" w:eastAsia="ja-JP"/>
+        </w:rPr>
+        <w:t>h US and Russia</w:t>
+      </w:r>
+      <w:r>
+        <w:rPr>
+          <w:rFonts w:eastAsia="Yu Mincho"/>
+          <w:lang w:val="en-US" w:eastAsia="ja-JP"/>
+        </w:rPr>
+        <w:t>).</w:t>
+      </w:r>
+    </w:p>
+    <w:p>
+      <w:pPr>
+        <w:rPr>
+          <w:rFonts w:eastAsia="Yu Mincho"/>
+          <w:lang w:val="en-US" w:eastAsia="ja-JP"/>
+        </w:rPr>
+      </w:pPr>
+    </w:p>
+    <w:p>
+      <w:pPr>
+        <w:rPr>
+          <w:rFonts w:eastAsia="Yu Mincho"/>
+          <w:lang w:val="en-US" w:eastAsia="ja-JP"/>
+        </w:rPr>
+      </w:pPr>
+    </w:p>
+    <w:p>
+      <w:pPr>
+        <w:rPr>
+          <w:rFonts w:eastAsia="Yu Mincho"/>
+          <w:lang w:val="en-US" w:eastAsia="ja-JP"/>
+        </w:rPr>
+      </w:pPr>
+    </w:p>
+    <w:tbl>
+      <w:tblPr>
+        <w:tblStyle w:val="Tabela-Siatka"/>
+        <w:tblW w:w="0" w:type="auto"/>
+        <w:tblLook w:val="04A0" w:firstRow="1" w:lastRow="0" w:firstColumn="1" w:lastColumn="0" w:noHBand="0" w:noVBand="1"/>
+      </w:tblPr>
+      <w:tblGrid>
+        <w:gridCol w:w="1895"/>
+        <w:gridCol w:w="2495"/>
+        <w:gridCol w:w="2193"/>
+        <w:gridCol w:w="2433"/>
+      </w:tblGrid>
+      <w:tr>
+        <w:tc>
+          <w:tcPr>
+            <w:tcW w:w="4390" w:type="dxa"/>
+            <w:gridSpan w:val="2"/>
+            <w:vMerge w:val="restart"/>
+          </w:tcPr>
+          <w:p>
+            <w:pPr>
+              <w:rPr>
+                <w:rFonts w:eastAsia="Yu Mincho"/>
+                <w:lang w:val="en-US" w:eastAsia="ja-JP"/>
+              </w:rPr>
+            </w:pPr>
+            <w:r>
+              <w:rPr>
+                <w:rFonts w:eastAsia="Yu Mincho"/>
+                <w:lang w:val="en-US" w:eastAsia="ja-JP"/>
+              </w:rPr>
+              <w:lastRenderedPageBreak/>
+              <w:t xml:space="preserve">TYPES OF INTERNATIONAL </w:t>
+            </w:r>
+            <w:r>
+              <w:rPr>
+                <w:rFonts w:eastAsia="Yu Mincho"/>
+                <w:lang w:val="en-US" w:eastAsia="ja-JP"/>
+              </w:rPr>
+              <w:t>NORMS</w:t>
+            </w:r>
+          </w:p>
+        </w:tc>
+        <w:tc>
+          <w:tcPr>
+            <w:tcW w:w="4626" w:type="dxa"/>
+            <w:gridSpan w:val="2"/>
+          </w:tcPr>
+          <w:p>
+            <w:pPr>
+              <w:jc w:val="center"/>
+              <w:rPr>
+                <w:rFonts w:eastAsia="Yu Mincho"/>
+                <w:u w:val="single"/>
+                <w:lang w:val="en-US" w:eastAsia="ja-JP"/>
+              </w:rPr>
+            </w:pPr>
+            <w:r>
+              <w:rPr>
+                <w:rFonts w:eastAsia="Yu Mincho"/>
+                <w:u w:val="single"/>
+                <w:lang w:val="en-US" w:eastAsia="ja-JP"/>
+              </w:rPr>
+              <w:t>System Characteristics</w:t>
+            </w:r>
+          </w:p>
+        </w:tc>
+      </w:tr>
+      <w:tr>
+        <w:tc>
+          <w:tcPr>
+            <w:tcW w:w="4390" w:type="dxa"/>
+            <w:gridSpan w:val="2"/>
+            <w:vMerge/>
+          </w:tcPr>
+          <w:p>
+            <w:pPr>
+              <w:rPr>
+                <w:rFonts w:eastAsia="Yu Mincho"/>
+                <w:lang w:val="en-US" w:eastAsia="ja-JP"/>
+              </w:rPr>
+            </w:pPr>
+          </w:p>
+        </w:tc>
+        <w:tc>
+          <w:tcPr>
+            <w:tcW w:w="2193" w:type="dxa"/>
+          </w:tcPr>
+          <w:p>
+            <w:pPr>
+              <w:rPr>
+                <w:rFonts w:eastAsia="Yu Mincho"/>
+                <w:b/>
+                <w:bCs/>
+                <w:lang w:val="en-US" w:eastAsia="ja-JP"/>
+              </w:rPr>
+            </w:pPr>
+            <w:r>
+              <w:rPr>
+                <w:rFonts w:eastAsia="Yu Mincho"/>
+                <w:b/>
+                <w:bCs/>
+                <w:lang w:val="en-US" w:eastAsia="ja-JP"/>
+              </w:rPr>
+              <w:t>Social</w:t>
+            </w:r>
+          </w:p>
+        </w:tc>
+        <w:tc>
+          <w:tcPr>
+            <w:tcW w:w="2433" w:type="dxa"/>
+          </w:tcPr>
+          <w:p>
+            <w:pPr>
+              <w:rPr>
+                <w:rFonts w:eastAsia="Yu Mincho"/>
+                <w:b/>
+                <w:bCs/>
+                <w:lang w:val="en-US" w:eastAsia="ja-JP"/>
+              </w:rPr>
+            </w:pPr>
+            <w:r>
+              <w:rPr>
+                <w:rFonts w:eastAsia="Yu Mincho"/>
+                <w:b/>
+                <w:bCs/>
+                <w:lang w:val="en-US" w:eastAsia="ja-JP"/>
+              </w:rPr>
+              <w:t>Natural</w:t>
+            </w:r>
+          </w:p>
+        </w:tc>
+      </w:tr>
+      <w:tr>
+        <w:tc>
+          <w:tcPr>
+            <w:tcW w:w="1895" w:type="dxa"/>
+            <w:vMerge w:val="restart"/>
+          </w:tcPr>
+          <w:p>
+            <w:pPr>
+              <w:rPr>
+                <w:rFonts w:eastAsia="Yu Mincho"/>
+                <w:u w:val="single"/>
+                <w:lang w:val="en-US" w:eastAsia="ja-JP"/>
+              </w:rPr>
+            </w:pPr>
+            <w:r>
+              <w:rPr>
+                <w:rFonts w:eastAsia="Yu Mincho"/>
+                <w:u w:val="single"/>
+                <w:lang w:val="en-US" w:eastAsia="ja-JP"/>
+              </w:rPr>
+              <w:t>Conduct</w:t>
+            </w:r>
+          </w:p>
+        </w:tc>
+        <w:tc>
+          <w:tcPr>
+            <w:tcW w:w="2495" w:type="dxa"/>
+          </w:tcPr>
+          <w:p>
+            <w:pPr>
+              <w:rPr>
+                <w:rFonts w:eastAsia="Yu Mincho"/>
+                <w:b/>
+                <w:bCs/>
+                <w:lang w:val="en-US" w:eastAsia="ja-JP"/>
+              </w:rPr>
+            </w:pPr>
+            <w:r>
+              <w:rPr>
+                <w:rFonts w:eastAsia="Yu Mincho"/>
+                <w:b/>
+                <w:bCs/>
+                <w:lang w:val="en-US" w:eastAsia="ja-JP"/>
+              </w:rPr>
+              <w:t>Consistent</w:t>
+            </w:r>
+          </w:p>
+        </w:tc>
+        <w:tc>
+          <w:tcPr>
+            <w:tcW w:w="2193" w:type="dxa"/>
+          </w:tcPr>
+          <w:p>
+            <w:pPr>
+              <w:rPr>
+                <w:rFonts w:eastAsia="Yu Mincho"/>
+                <w:i/>
+                <w:iCs/>
+                <w:lang w:val="en-US" w:eastAsia="ja-JP"/>
+              </w:rPr>
+            </w:pPr>
+            <w:r>
+              <w:rPr>
+                <w:rFonts w:eastAsia="Yu Mincho"/>
+                <w:i/>
+                <w:iCs/>
+                <w:lang w:val="en-US" w:eastAsia="ja-JP"/>
+              </w:rPr>
+              <w:t>Moral Norms</w:t>
+            </w:r>
+          </w:p>
+        </w:tc>
+        <w:tc>
+          <w:tcPr>
+            <w:tcW w:w="2433" w:type="dxa"/>
+          </w:tcPr>
+          <w:p>
+            <w:pPr>
+              <w:rPr>
+                <w:rFonts w:eastAsia="Yu Mincho"/>
+                <w:i/>
+                <w:iCs/>
+                <w:lang w:val="en-US" w:eastAsia="ja-JP"/>
+              </w:rPr>
+            </w:pPr>
+            <w:r>
+              <w:rPr>
+                <w:rFonts w:eastAsia="Yu Mincho"/>
+                <w:i/>
+                <w:iCs/>
+                <w:lang w:val="en-US" w:eastAsia="ja-JP"/>
+              </w:rPr>
+              <w:t>Realpolitik norms</w:t>
+            </w:r>
+          </w:p>
+        </w:tc>
+      </w:tr>
+      <w:tr>
+        <w:tc>
+          <w:tcPr>
+            <w:tcW w:w="1895" w:type="dxa"/>
+            <w:vMerge/>
+          </w:tcPr>
+          <w:p>
+            <w:pPr>
+              <w:rPr>
+                <w:rFonts w:eastAsia="Yu Mincho"/>
+                <w:lang w:val="en-US" w:eastAsia="ja-JP"/>
+              </w:rPr>
+            </w:pPr>
+          </w:p>
+        </w:tc>
+        <w:tc>
+          <w:tcPr>
+            <w:tcW w:w="2495" w:type="dxa"/>
+          </w:tcPr>
+          <w:p>
+            <w:pPr>
+              <w:rPr>
+                <w:rFonts w:eastAsia="Yu Mincho"/>
+                <w:b/>
+                <w:bCs/>
+                <w:lang w:val="en-US" w:eastAsia="ja-JP"/>
+              </w:rPr>
+            </w:pPr>
+            <w:r>
+              <w:rPr>
+                <w:rFonts w:eastAsia="Yu Mincho"/>
+                <w:b/>
+                <w:bCs/>
+                <w:lang w:val="en-US" w:eastAsia="ja-JP"/>
+              </w:rPr>
+              <w:t>Inconsistent</w:t>
+            </w:r>
+          </w:p>
+        </w:tc>
+        <w:tc>
+          <w:tcPr>
+            <w:tcW w:w="2193" w:type="dxa"/>
+          </w:tcPr>
+          <w:p>
+            <w:pPr>
+              <w:rPr>
+                <w:rFonts w:eastAsia="Yu Mincho"/>
+                <w:i/>
+                <w:iCs/>
+                <w:lang w:val="en-US" w:eastAsia="ja-JP"/>
+              </w:rPr>
+            </w:pPr>
+            <w:r>
+              <w:rPr>
+                <w:rFonts w:eastAsia="Yu Mincho"/>
+                <w:i/>
+                <w:iCs/>
+                <w:lang w:val="en-US" w:eastAsia="ja-JP"/>
+              </w:rPr>
+              <w:t>Double-standards norms</w:t>
+            </w:r>
+          </w:p>
+        </w:tc>
+        <w:tc>
+          <w:tcPr>
+            <w:tcW w:w="2433" w:type="dxa"/>
+          </w:tcPr>
+          <w:p>
+            <w:pPr>
+              <w:rPr>
+                <w:rFonts w:eastAsia="Yu Mincho"/>
+                <w:i/>
+                <w:iCs/>
+                <w:lang w:val="en-US" w:eastAsia="ja-JP"/>
+              </w:rPr>
+            </w:pPr>
+            <w:r>
+              <w:rPr>
+                <w:rFonts w:eastAsia="Yu Mincho"/>
+                <w:i/>
+                <w:iCs/>
+                <w:lang w:val="en-US" w:eastAsia="ja-JP"/>
+              </w:rPr>
+              <w:t>Coward-bully norms</w:t>
+            </w:r>
+          </w:p>
+        </w:tc>
+      </w:tr>
+    </w:tbl>
+    <w:p>
+      <w:pPr>
+        <w:rPr>
+          <w:rFonts w:eastAsia="Yu Mincho"/>
+          <w:lang w:val="en-US" w:eastAsia="ja-JP"/>
+        </w:rPr>
+      </w:pPr>
+      <w:r>
+        <w:rPr>
+          <w:rFonts w:eastAsia="Yu Mincho"/>
+          <w:lang w:val="en-US" w:eastAsia="ja-JP"/>
+        </w:rPr>
+        <w:t>In this table I swapped X and Y values to match the international leaders table</w:t>
+      </w:r>
+    </w:p>
+    <w:p>
+      <w:pPr>
+        <w:rPr>
+          <w:rFonts w:eastAsia="Yu Mincho"/>
+          <w:lang w:val="en-US" w:eastAsia="ja-JP"/>
+        </w:rPr>
+      </w:pPr>
+    </w:p>
+    <w:p>
+      <w:pPr>
+        <w:rPr>
+          <w:rFonts w:eastAsia="Yu Mincho"/>
+          <w:lang w:val="en-US" w:eastAsia="ja-JP"/>
+        </w:rPr>
+      </w:pPr>
+      <w:r>
+        <w:rPr>
+          <w:rFonts w:eastAsia="Yu Mincho"/>
+          <w:lang w:val="en-US" w:eastAsia="ja-JP"/>
+        </w:rPr>
+        <w:t>Tyrannical states will follow the realpolitik principle (social darvinism)</w:t>
+      </w:r>
+    </w:p>
+    <w:p>
+      <w:pPr>
+        <w:rPr>
+          <w:rFonts w:eastAsia="Yu Mincho"/>
+          <w:lang w:val="en-US" w:eastAsia="ja-JP"/>
+        </w:rPr>
+      </w:pPr>
+      <w:r>
+        <w:rPr>
+          <w:rFonts w:eastAsia="Yu Mincho"/>
+          <w:lang w:val="en-US" w:eastAsia="ja-JP"/>
+        </w:rPr>
+        <w:t xml:space="preserve">Bully-like behavior includes attacks on Syria by the US but also not attacking North Korea… at least in the example… </w:t>
+      </w:r>
+    </w:p>
+    <w:p>
+      <w:pPr>
+        <w:rPr>
+          <w:rFonts w:eastAsia="Yu Mincho"/>
+          <w:lang w:val="en-US" w:eastAsia="ja-JP"/>
+        </w:rPr>
+      </w:pPr>
+      <w:r>
+        <w:rPr>
+          <w:rFonts w:eastAsia="Yu Mincho"/>
+          <w:lang w:val="en-US" w:eastAsia="ja-JP"/>
+        </w:rPr>
+        <w:t>Moral Norms are, as the example in text, the conventions against use of the specific weaponry, for exmplae chemical. When norms are loosen, the social Darwinism replace their place.</w:t>
+      </w:r>
+      <w:r>
+        <w:rPr>
+          <w:rFonts w:eastAsia="Yu Mincho"/>
+          <w:lang w:val="en-US" w:eastAsia="ja-JP"/>
+        </w:rPr>
+        <w:t xml:space="preserve"> Why norms loose? Because state that is theirs guarantator, doesn’t have capacity to enforce them or simply doesn’t want to do that. They may be the one that breaks them in a first place.</w:t>
+      </w:r>
+    </w:p>
+    <w:p>
+      <w:pPr>
+        <w:rPr>
+          <w:rFonts w:eastAsia="Yu Mincho"/>
+          <w:lang w:val="en-US" w:eastAsia="ja-JP"/>
+        </w:rPr>
+      </w:pPr>
+      <w:r>
+        <w:rPr>
+          <w:rFonts w:eastAsia="Yu Mincho"/>
+          <w:lang w:val="en-US" w:eastAsia="ja-JP"/>
+        </w:rPr>
+        <w:t>To have a norm, leading state (in a system) needs to give example, reinforce the norm and also punish those that breaks them.</w:t>
+      </w:r>
+    </w:p>
+    <w:p>
+      <w:pPr>
+        <w:rPr>
+          <w:rFonts w:eastAsia="Yu Mincho"/>
+          <w:lang w:val="en-US" w:eastAsia="ja-JP"/>
+        </w:rPr>
+      </w:pPr>
+      <w:r>
+        <w:rPr>
+          <w:rFonts w:eastAsia="Yu Mincho"/>
+          <w:lang w:val="en-US" w:eastAsia="ja-JP"/>
+        </w:rPr>
+        <w:t>The most prelevant option is double norms, for example criticizing human rights violation all over the globe but not in Israel or Saudi Arabia.</w:t>
+      </w:r>
+    </w:p>
+    <w:p>
+      <w:pPr>
+        <w:rPr>
+          <w:rFonts w:eastAsia="Yu Mincho"/>
+          <w:lang w:val="en-US" w:eastAsia="ja-JP"/>
+        </w:rPr>
+      </w:pPr>
+      <w:r>
+        <w:rPr>
+          <w:rFonts w:eastAsia="Yu Mincho"/>
+          <w:lang w:val="en-US" w:eastAsia="ja-JP"/>
+        </w:rPr>
+        <w:t>Realpolitik will punish states that actively supports norms (if the leading state decide that this will benefit them, this it destroys support of those norms in other nations)</w:t>
+      </w:r>
+    </w:p>
+    <w:p>
+      <w:pPr>
+        <w:rPr>
+          <w:rFonts w:eastAsia="Yu Mincho"/>
+          <w:lang w:val="en-US" w:eastAsia="ja-JP"/>
+        </w:rPr>
+      </w:pPr>
+    </w:p>
+    <w:p>
+      <w:pPr>
+        <w:rPr>
+          <w:rFonts w:eastAsia="Yu Mincho"/>
+          <w:lang w:val="en-US" w:eastAsia="ja-JP"/>
+        </w:rPr>
+      </w:pPr>
+      <w:r>
+        <w:rPr>
+          <w:rFonts w:eastAsia="Yu Mincho"/>
+          <w:lang w:val="en-US" w:eastAsia="ja-JP"/>
+        </w:rPr>
+        <w:t>‘Civil war results in the anarchical system similar to the international order’</w:t>
+      </w:r>
+    </w:p>
+    <w:p>
+      <w:pPr>
+        <w:rPr>
+          <w:rFonts w:eastAsia="Yu Mincho"/>
+          <w:lang w:val="en-US" w:eastAsia="ja-JP"/>
+        </w:rPr>
+      </w:pPr>
+      <w:r>
+        <w:rPr>
+          <w:rFonts w:eastAsia="Yu Mincho"/>
+          <w:lang w:val="en-US" w:eastAsia="ja-JP"/>
+        </w:rPr>
+        <w:t>;Trust is of supreme importance to alliance’</w:t>
+      </w:r>
+    </w:p>
+    <w:p>
+      <w:pPr>
+        <w:pBdr>
+          <w:bottom w:val="single" w:sz="6" w:space="1" w:color="auto"/>
+        </w:pBdr>
+        <w:rPr>
+          <w:rFonts w:eastAsia="Yu Mincho"/>
+          <w:lang w:val="en-US" w:eastAsia="ja-JP"/>
+        </w:rPr>
+      </w:pPr>
+    </w:p>
+    <w:p>
+      <w:pPr>
+        <w:rPr>
+          <w:rFonts w:eastAsia="Yu Mincho"/>
+          <w:lang w:val="en-US" w:eastAsia="ja-JP"/>
+        </w:rPr>
+      </w:pPr>
+      <w:r>
+        <w:rPr>
+          <w:rFonts w:eastAsia="Yu Mincho"/>
+          <w:lang w:val="en-US" w:eastAsia="ja-JP"/>
+        </w:rPr>
+        <w:t>International Mainstream Values</w:t>
+      </w:r>
+    </w:p>
+    <w:p>
+      <w:pPr>
+        <w:rPr>
+          <w:rFonts w:eastAsia="Yu Mincho"/>
+          <w:lang w:val="en-US" w:eastAsia="ja-JP"/>
+        </w:rPr>
+      </w:pPr>
+      <w:r>
+        <w:rPr>
+          <w:rFonts w:eastAsia="Yu Mincho"/>
+          <w:lang w:val="en-US" w:eastAsia="ja-JP"/>
+        </w:rPr>
+        <w:t xml:space="preserve">The main values of international system can change and in XX century they changed a lot, non of the ideologies survived longer than 30 years. It was nationalism, fascism, communism, (again nationalism) and liberalism (I would disagree with that very simplified classification). </w:t>
+      </w:r>
+    </w:p>
+    <w:p>
+      <w:pPr>
+        <w:rPr>
+          <w:rFonts w:eastAsia="Yu Mincho"/>
+          <w:lang w:val="en-US" w:eastAsia="ja-JP"/>
+        </w:rPr>
+      </w:pPr>
+    </w:p>
+    <w:p>
+      <w:pPr>
+        <w:rPr>
+          <w:rFonts w:eastAsia="Yu Mincho"/>
+          <w:lang w:val="en-US" w:eastAsia="ja-JP"/>
+        </w:rPr>
+      </w:pPr>
+      <w:r>
+        <w:rPr>
+          <w:rFonts w:eastAsia="Yu Mincho"/>
+          <w:lang w:val="en-US" w:eastAsia="ja-JP"/>
+        </w:rPr>
+        <w:t>The official ideology of China is Marxism. Marxism is based on a class struggle and is very offensive from perspective of international relations, thus it doesn’t match current plans for Chineese international (peacefull order).</w:t>
+      </w:r>
+    </w:p>
+    <w:p>
+      <w:pPr>
+        <w:rPr>
+          <w:rFonts w:eastAsia="Yu Mincho"/>
+          <w:lang w:val="en-US" w:eastAsia="ja-JP"/>
+        </w:rPr>
+      </w:pPr>
+      <w:r>
+        <w:rPr>
+          <w:rFonts w:eastAsia="Yu Mincho"/>
+          <w:lang w:val="en-US" w:eastAsia="ja-JP"/>
+        </w:rPr>
+        <w:lastRenderedPageBreak/>
+        <w:t>Economic pragmatism if current, most populat and accepted idologoy.</w:t>
+      </w:r>
+      <w:r>
+        <w:rPr>
+          <w:rFonts w:eastAsia="Yu Mincho"/>
+          <w:lang w:val="en-US" w:eastAsia="ja-JP"/>
+        </w:rPr>
+        <w:t xml:space="preserve"> It is similar to American economical nationalism.</w:t>
+      </w:r>
+    </w:p>
+    <w:p>
+      <w:pPr>
+        <w:rPr>
+          <w:rFonts w:eastAsia="Yu Mincho"/>
+          <w:lang w:val="en-US" w:eastAsia="ja-JP"/>
+        </w:rPr>
+      </w:pPr>
+      <w:r>
+        <w:rPr>
+          <w:rFonts w:eastAsia="Yu Mincho"/>
+          <w:lang w:val="en-US" w:eastAsia="ja-JP"/>
+        </w:rPr>
+        <w:t>Liberalism is nowdays popular only in some circles of intellectuals</w:t>
+      </w:r>
+    </w:p>
+    <w:p>
+      <w:pPr>
+        <w:rPr>
+          <w:rFonts w:eastAsia="Yu Mincho"/>
+          <w:lang w:val="en-US" w:eastAsia="ja-JP"/>
+        </w:rPr>
+      </w:pPr>
+      <w:r>
+        <w:rPr>
+          <w:rFonts w:eastAsia="Yu Mincho"/>
+          <w:lang w:val="en-US" w:eastAsia="ja-JP"/>
+        </w:rPr>
+        <w:t>Traditionalism is getting more and more popular.</w:t>
+      </w:r>
+      <w:r>
+        <w:rPr>
+          <w:rFonts w:eastAsia="Yu Mincho"/>
+          <w:lang w:val="en-US" w:eastAsia="ja-JP"/>
+        </w:rPr>
+        <w:t xml:space="preserve"> (it is not equal with Confucianism).</w:t>
+      </w:r>
+    </w:p>
+    <w:p>
+      <w:pPr>
+        <w:rPr>
+          <w:rFonts w:eastAsia="Yu Mincho"/>
+          <w:lang w:val="en-US" w:eastAsia="ja-JP"/>
+        </w:rPr>
+      </w:pPr>
+    </w:p>
+    <w:p>
+      <w:pPr>
+        <w:rPr>
+          <w:rFonts w:eastAsia="Yu Mincho"/>
+          <w:lang w:val="en-US" w:eastAsia="ja-JP"/>
+        </w:rPr>
+      </w:pPr>
+      <w:r>
+        <w:rPr>
+          <w:rFonts w:eastAsia="Yu Mincho"/>
+          <w:lang w:val="en-US" w:eastAsia="ja-JP"/>
+        </w:rPr>
+        <w:t>Liberalism will not survive as a dominant ideology in the world especiallywhen Trumps undermine US credibility faster than he is able to affect Chinas one.</w:t>
+      </w:r>
+      <w:r>
+        <w:rPr>
+          <w:rFonts w:eastAsia="Yu Mincho"/>
+          <w:lang w:val="en-US" w:eastAsia="ja-JP"/>
+        </w:rPr>
+        <w:t xml:space="preserve"> There may be the case when no one wil be able to push new ideology as the dominant one.</w:t>
+      </w:r>
+    </w:p>
+    <w:p>
+      <w:pPr>
+        <w:rPr>
+          <w:rFonts w:eastAsia="Yu Mincho"/>
+          <w:lang w:val="en-US" w:eastAsia="ja-JP"/>
+        </w:rPr>
+      </w:pPr>
+      <w:r>
+        <w:rPr>
+          <w:rFonts w:eastAsia="Yu Mincho"/>
+          <w:lang w:val="en-US" w:eastAsia="ja-JP"/>
+        </w:rPr>
+        <w:t>“Chinese culture does not celebrate American-style individualism, which measures society by how well it protects the rights and fosters the freedom of individuals.”   However, what he does not realize is that Chinese culture advocates the recognition of rites for the sake of preventing the social violence to which individual freedom gives rise.</w:t>
+      </w:r>
+    </w:p>
+    <w:p>
+      <w:pPr>
+        <w:pBdr>
+          <w:bottom w:val="single" w:sz="6" w:space="1" w:color="auto"/>
+        </w:pBdr>
+        <w:rPr>
+          <w:rFonts w:eastAsia="Yu Mincho"/>
+          <w:lang w:val="en-US" w:eastAsia="ja-JP"/>
+        </w:rPr>
+      </w:pPr>
+    </w:p>
+    <w:p>
+      <w:pPr>
+        <w:rPr>
+          <w:rFonts w:eastAsia="Yu Mincho"/>
+          <w:lang w:val="en-US" w:eastAsia="ja-JP"/>
+        </w:rPr>
+      </w:pPr>
+      <w:r>
+        <w:rPr>
+          <w:rFonts w:eastAsia="Yu Mincho"/>
+          <w:lang w:val="en-US" w:eastAsia="ja-JP"/>
+        </w:rPr>
+        <w:t>Chapter 7</w:t>
+      </w:r>
+    </w:p>
+    <w:p>
+      <w:pPr>
+        <w:rPr>
+          <w:rFonts w:eastAsia="Yu Mincho"/>
+          <w:lang w:val="en-US" w:eastAsia="ja-JP"/>
+        </w:rPr>
+      </w:pPr>
+      <w:r>
+        <w:rPr>
+          <w:rFonts w:eastAsia="Yu Mincho"/>
+          <w:lang w:val="en-US" w:eastAsia="ja-JP"/>
+        </w:rPr>
+        <w:t>Transofrmati0on of the international System</w:t>
       </w:r>
     </w:p>
     <w:sectPr>

</xml_diff>

<commit_message>
chapter 7 and 8
</commit_message>
<xml_diff>
--- a/Realism/Leadership and the rise of great powers Yan Xuetong.docx
+++ b/Realism/Leadership and the rise of great powers Yan Xuetong.docx
@@ -3280,14 +3280,7 @@
                 <w:lang w:val="en-US" w:eastAsia="ja-JP"/>
               </w:rPr>
               <w:lastRenderedPageBreak/>
-              <w:t xml:space="preserve">TYPES OF INTERNATIONAL </w:t>
-            </w:r>
-            <w:r>
-              <w:rPr>
-                <w:rFonts w:eastAsia="Yu Mincho"/>
-                <w:lang w:val="en-US" w:eastAsia="ja-JP"/>
-              </w:rPr>
-              <w:t>NORMS</w:t>
+              <w:t>TYPES OF INTERNATIONAL NORMS</w:t>
             </w:r>
           </w:p>
         </w:tc>
@@ -3932,7 +3925,1957 @@
           <w:rFonts w:eastAsia="Yu Mincho"/>
           <w:lang w:val="en-US" w:eastAsia="ja-JP"/>
         </w:rPr>
-        <w:t>Transofrmati0on of the international System</w:t>
+        <w:t>Transformation</w:t>
+      </w:r>
+      <w:r>
+        <w:rPr>
+          <w:rFonts w:eastAsia="Yu Mincho"/>
+          <w:lang w:val="en-US" w:eastAsia="ja-JP"/>
+        </w:rPr>
+        <w:t xml:space="preserve"> of the international System</w:t>
+      </w:r>
+    </w:p>
+    <w:p>
+      <w:pPr>
+        <w:rPr>
+          <w:rFonts w:eastAsia="Yu Mincho"/>
+          <w:lang w:val="en-US" w:eastAsia="ja-JP"/>
+        </w:rPr>
+      </w:pPr>
+      <w:r>
+        <w:rPr>
+          <w:rFonts w:eastAsia="Yu Mincho"/>
+          <w:lang w:val="en-US" w:eastAsia="ja-JP"/>
+        </w:rPr>
+        <w:t>‘Transformation</w:t>
+      </w:r>
+      <w:r>
+        <w:rPr>
+          <w:rFonts w:eastAsia="Yu Mincho"/>
+          <w:lang w:val="en-US" w:eastAsia="ja-JP"/>
+        </w:rPr>
+        <w:t xml:space="preserve"> of the system</w:t>
+      </w:r>
+      <w:r>
+        <w:rPr>
+          <w:rFonts w:eastAsia="Yu Mincho"/>
+          <w:lang w:val="en-US" w:eastAsia="ja-JP"/>
+        </w:rPr>
+        <w:t>’ is usually used to liberally, to describe change in norms, actors, or</w:t>
+      </w:r>
+      <w:r>
+        <w:rPr>
+          <w:rFonts w:eastAsia="Yu Mincho"/>
+          <w:lang w:val="en-US" w:eastAsia="ja-JP"/>
+        </w:rPr>
+        <w:t>d</w:t>
+      </w:r>
+      <w:r>
+        <w:rPr>
+          <w:rFonts w:eastAsia="Yu Mincho"/>
+          <w:lang w:val="en-US" w:eastAsia="ja-JP"/>
+        </w:rPr>
+        <w:t>ers, configurations but not the system as a whole.</w:t>
+      </w:r>
+    </w:p>
+    <w:p>
+      <w:pPr>
+        <w:rPr>
+          <w:rFonts w:eastAsia="Yu Mincho"/>
+          <w:lang w:val="en-US" w:eastAsia="ja-JP"/>
+        </w:rPr>
+      </w:pPr>
+    </w:p>
+    <w:p>
+      <w:pPr>
+        <w:rPr>
+          <w:rFonts w:eastAsia="Yu Mincho"/>
+          <w:lang w:val="en-US" w:eastAsia="ja-JP"/>
+        </w:rPr>
+      </w:pPr>
+      <w:r>
+        <w:rPr>
+          <w:rFonts w:eastAsia="Yu Mincho"/>
+          <w:lang w:val="en-US" w:eastAsia="ja-JP"/>
+        </w:rPr>
+        <w:t>Success of the rising states doesn’t necesserly mean that the system will change.</w:t>
+      </w:r>
+    </w:p>
+    <w:p>
+      <w:pPr>
+        <w:rPr>
+          <w:rFonts w:eastAsia="Yu Mincho"/>
+          <w:lang w:val="en-US" w:eastAsia="ja-JP"/>
+        </w:rPr>
+      </w:pPr>
+      <w:r>
+        <w:rPr>
+          <w:rFonts w:eastAsia="Yu Mincho"/>
+          <w:lang w:val="en-US" w:eastAsia="ja-JP"/>
+        </w:rPr>
+        <w:t>After the cold war, the ony change was in the distribution of capacities which resulted in the unipolar world but the system as a whole did not changed.</w:t>
+      </w:r>
+    </w:p>
+    <w:p>
+      <w:pPr>
+        <w:rPr>
+          <w:rFonts w:eastAsia="Yu Mincho"/>
+          <w:lang w:val="en-US" w:eastAsia="ja-JP"/>
+        </w:rPr>
+      </w:pPr>
+    </w:p>
+    <w:p>
+      <w:pPr>
+        <w:rPr>
+          <w:rFonts w:eastAsia="Yu Mincho"/>
+          <w:lang w:val="en-US" w:eastAsia="ja-JP"/>
+        </w:rPr>
+      </w:pPr>
+      <w:r>
+        <w:rPr>
+          <w:rFonts w:eastAsia="Yu Mincho"/>
+          <w:lang w:val="en-US" w:eastAsia="ja-JP"/>
+        </w:rPr>
+        <w:t>Definitions of system:</w:t>
+      </w:r>
+    </w:p>
+    <w:p>
+      <w:pPr>
+        <w:rPr>
+          <w:rFonts w:eastAsia="Yu Mincho"/>
+          <w:lang w:val="en-US" w:eastAsia="ja-JP"/>
+        </w:rPr>
+      </w:pPr>
+      <w:r>
+        <w:rPr>
+          <w:rFonts w:eastAsia="Yu Mincho"/>
+          <w:lang w:val="en-US" w:eastAsia="ja-JP"/>
+        </w:rPr>
+        <w:t>Waltz – a set of interacting units. At one level, a system consists of a structure, and the structure is the systems-level component that makes it possible to think of units as forming a set as distinct from a mere collection. At another level, the system consists of interacting units.</w:t>
+      </w:r>
+    </w:p>
+    <w:p>
+      <w:pPr>
+        <w:rPr>
+          <w:rFonts w:eastAsia="Yu Mincho"/>
+          <w:lang w:val="en-US" w:eastAsia="ja-JP"/>
+        </w:rPr>
+      </w:pPr>
+    </w:p>
+    <w:p>
+      <w:pPr>
+        <w:rPr>
+          <w:rFonts w:eastAsia="Yu Mincho"/>
+          <w:lang w:val="en-US" w:eastAsia="ja-JP"/>
+        </w:rPr>
+      </w:pPr>
+      <w:r>
+        <w:rPr>
+          <w:rFonts w:eastAsia="Yu Mincho"/>
+          <w:lang w:val="en-US" w:eastAsia="ja-JP"/>
+        </w:rPr>
+        <w:t>Mundell and Swoboda – A system is an aggregation of diverse entities united by regular interaction according to a form of control</w:t>
+      </w:r>
+    </w:p>
+    <w:p>
+      <w:pPr>
+        <w:rPr>
+          <w:rFonts w:eastAsia="Yu Mincho"/>
+          <w:lang w:val="en-US" w:eastAsia="ja-JP"/>
+        </w:rPr>
+      </w:pPr>
+      <w:r>
+        <w:rPr>
+          <w:rFonts w:eastAsia="Yu Mincho"/>
+          <w:lang w:val="en-US" w:eastAsia="ja-JP"/>
+        </w:rPr>
+        <w:t>‘The character of the international system is identified by the most prominent entities: empires, nation-states or multinational corporations’ – Gilpin.</w:t>
+      </w:r>
+    </w:p>
+    <w:tbl>
+      <w:tblPr>
+        <w:tblStyle w:val="Tabela-Siatka"/>
+        <w:tblW w:w="0" w:type="auto"/>
+        <w:tblLook w:val="04A0" w:firstRow="1" w:lastRow="0" w:firstColumn="1" w:lastColumn="0" w:noHBand="0" w:noVBand="1"/>
+      </w:tblPr>
+      <w:tblGrid>
+        <w:gridCol w:w="2254"/>
+        <w:gridCol w:w="2254"/>
+        <w:gridCol w:w="2254"/>
+        <w:gridCol w:w="2254"/>
+      </w:tblGrid>
+      <w:tr>
+        <w:tc>
+          <w:tcPr>
+            <w:tcW w:w="9016" w:type="dxa"/>
+            <w:gridSpan w:val="4"/>
+          </w:tcPr>
+          <w:p>
+            <w:pPr>
+              <w:rPr>
+                <w:rFonts w:eastAsia="Yu Mincho"/>
+                <w:lang w:val="en-US" w:eastAsia="ja-JP"/>
+              </w:rPr>
+            </w:pPr>
+            <w:r>
+              <w:rPr>
+                <w:rFonts w:eastAsia="Yu Mincho"/>
+                <w:lang w:val="en-US" w:eastAsia="ja-JP"/>
+              </w:rPr>
+              <w:lastRenderedPageBreak/>
+              <w:t>THE COMPONENTS OF INTERSTATE SYSTEMS ACADEMICALLY DEFINED</w:t>
+            </w:r>
+          </w:p>
+        </w:tc>
+      </w:tr>
+      <w:tr>
+        <w:tc>
+          <w:tcPr>
+            <w:tcW w:w="2254" w:type="dxa"/>
+          </w:tcPr>
+          <w:p>
+            <w:pPr>
+              <w:rPr>
+                <w:rFonts w:eastAsia="Yu Mincho"/>
+                <w:lang w:val="en-US" w:eastAsia="ja-JP"/>
+              </w:rPr>
+            </w:pPr>
+            <w:r>
+              <w:rPr>
+                <w:rFonts w:eastAsia="Yu Mincho"/>
+                <w:lang w:val="en-US" w:eastAsia="ja-JP"/>
+              </w:rPr>
+              <w:t>Interstate Systems</w:t>
+            </w:r>
+          </w:p>
+        </w:tc>
+        <w:tc>
+          <w:tcPr>
+            <w:tcW w:w="2254" w:type="dxa"/>
+          </w:tcPr>
+          <w:p>
+            <w:pPr>
+              <w:rPr>
+                <w:rFonts w:eastAsia="Yu Mincho"/>
+                <w:lang w:val="en-US" w:eastAsia="ja-JP"/>
+              </w:rPr>
+            </w:pPr>
+            <w:r>
+              <w:rPr>
+                <w:rFonts w:eastAsia="Yu Mincho"/>
+                <w:lang w:val="en-US" w:eastAsia="ja-JP"/>
+              </w:rPr>
+              <w:t>Actors</w:t>
+            </w:r>
+          </w:p>
+        </w:tc>
+        <w:tc>
+          <w:tcPr>
+            <w:tcW w:w="2254" w:type="dxa"/>
+          </w:tcPr>
+          <w:p>
+            <w:pPr>
+              <w:rPr>
+                <w:rFonts w:eastAsia="Yu Mincho"/>
+                <w:lang w:val="en-US" w:eastAsia="ja-JP"/>
+              </w:rPr>
+            </w:pPr>
+            <w:r>
+              <w:rPr>
+                <w:rFonts w:eastAsia="Yu Mincho"/>
+                <w:lang w:val="en-US" w:eastAsia="ja-JP"/>
+              </w:rPr>
+              <w:t>Configurations</w:t>
+            </w:r>
+          </w:p>
+        </w:tc>
+        <w:tc>
+          <w:tcPr>
+            <w:tcW w:w="2254" w:type="dxa"/>
+          </w:tcPr>
+          <w:p>
+            <w:pPr>
+              <w:rPr>
+                <w:rFonts w:eastAsia="Yu Mincho"/>
+                <w:lang w:val="en-US" w:eastAsia="ja-JP"/>
+              </w:rPr>
+            </w:pPr>
+            <w:r>
+              <w:rPr>
+                <w:rFonts w:eastAsia="Yu Mincho"/>
+                <w:lang w:val="en-US" w:eastAsia="ja-JP"/>
+              </w:rPr>
+              <w:t>Norms</w:t>
+            </w:r>
+          </w:p>
+        </w:tc>
+      </w:tr>
+      <w:tr>
+        <w:tc>
+          <w:tcPr>
+            <w:tcW w:w="9016" w:type="dxa"/>
+            <w:gridSpan w:val="4"/>
+          </w:tcPr>
+          <w:p>
+            <w:pPr>
+              <w:rPr>
+                <w:rFonts w:eastAsia="Yu Mincho"/>
+                <w:lang w:val="en-US" w:eastAsia="ja-JP"/>
+              </w:rPr>
+            </w:pPr>
+            <w:r>
+              <w:rPr>
+                <w:rFonts w:eastAsia="Yu Mincho"/>
+                <w:lang w:val="en-US" w:eastAsia="ja-JP"/>
+              </w:rPr>
+              <w:t>HUAXIA REGION</w:t>
+            </w:r>
+          </w:p>
+        </w:tc>
+      </w:tr>
+      <w:tr>
+        <w:tc>
+          <w:tcPr>
+            <w:tcW w:w="2254" w:type="dxa"/>
+          </w:tcPr>
+          <w:p>
+            <w:pPr>
+              <w:rPr>
+                <w:rFonts w:eastAsia="Yu Mincho"/>
+                <w:lang w:val="en-US" w:eastAsia="ja-JP"/>
+              </w:rPr>
+            </w:pPr>
+            <w:r>
+              <w:rPr>
+                <w:rFonts w:eastAsia="Yu Mincho"/>
+                <w:lang w:val="en-US" w:eastAsia="ja-JP"/>
+              </w:rPr>
+              <w:t>Western Zhou Dynasty (1046-771 BCE)</w:t>
+            </w:r>
+          </w:p>
+        </w:tc>
+        <w:tc>
+          <w:tcPr>
+            <w:tcW w:w="2254" w:type="dxa"/>
+          </w:tcPr>
+          <w:p>
+            <w:pPr>
+              <w:rPr>
+                <w:rFonts w:eastAsia="Yu Mincho"/>
+                <w:lang w:val="en-US" w:eastAsia="ja-JP"/>
+              </w:rPr>
+            </w:pPr>
+            <w:r>
+              <w:rPr>
+                <w:rFonts w:eastAsia="Yu Mincho"/>
+                <w:lang w:val="en-US" w:eastAsia="ja-JP"/>
+              </w:rPr>
+              <w:t>Royal state and vassals</w:t>
+            </w:r>
+          </w:p>
+        </w:tc>
+        <w:tc>
+          <w:tcPr>
+            <w:tcW w:w="2254" w:type="dxa"/>
+          </w:tcPr>
+          <w:p>
+            <w:pPr>
+              <w:rPr>
+                <w:rFonts w:eastAsia="Yu Mincho"/>
+                <w:lang w:val="en-US" w:eastAsia="ja-JP"/>
+              </w:rPr>
+            </w:pPr>
+            <w:r>
+              <w:rPr>
+                <w:rFonts w:eastAsia="Yu Mincho"/>
+                <w:lang w:val="en-US" w:eastAsia="ja-JP"/>
+              </w:rPr>
+              <w:t>Unipolar</w:t>
+            </w:r>
+          </w:p>
+        </w:tc>
+        <w:tc>
+          <w:tcPr>
+            <w:tcW w:w="2254" w:type="dxa"/>
+          </w:tcPr>
+          <w:p>
+            <w:pPr>
+              <w:rPr>
+                <w:rFonts w:eastAsia="Yu Mincho"/>
+                <w:lang w:val="en-US" w:eastAsia="ja-JP"/>
+              </w:rPr>
+            </w:pPr>
+            <w:r>
+              <w:rPr>
+                <w:rFonts w:eastAsia="Yu Mincho"/>
+                <w:lang w:val="en-US" w:eastAsia="ja-JP"/>
+              </w:rPr>
+              <w:t>Enfeoffment</w:t>
+            </w:r>
+          </w:p>
+        </w:tc>
+      </w:tr>
+      <w:tr>
+        <w:tc>
+          <w:tcPr>
+            <w:tcW w:w="2254" w:type="dxa"/>
+          </w:tcPr>
+          <w:p>
+            <w:pPr>
+              <w:rPr>
+                <w:rFonts w:eastAsia="Yu Mincho"/>
+                <w:lang w:val="en-US" w:eastAsia="ja-JP"/>
+              </w:rPr>
+            </w:pPr>
+            <w:r>
+              <w:rPr>
+                <w:rFonts w:eastAsia="Yu Mincho"/>
+                <w:lang w:val="en-US" w:eastAsia="ja-JP"/>
+              </w:rPr>
+              <w:t>Spring and Autumn period (770-476 BCE)</w:t>
+            </w:r>
+          </w:p>
+        </w:tc>
+        <w:tc>
+          <w:tcPr>
+            <w:tcW w:w="2254" w:type="dxa"/>
+          </w:tcPr>
+          <w:p>
+            <w:pPr>
+              <w:rPr>
+                <w:rFonts w:eastAsia="Yu Mincho"/>
+                <w:lang w:val="en-US" w:eastAsia="ja-JP"/>
+              </w:rPr>
+            </w:pPr>
+            <w:r>
+              <w:rPr>
+                <w:rFonts w:eastAsia="Yu Mincho"/>
+                <w:lang w:val="en-US" w:eastAsia="ja-JP"/>
+              </w:rPr>
+              <w:t>Royal state and vassals</w:t>
+            </w:r>
+          </w:p>
+        </w:tc>
+        <w:tc>
+          <w:tcPr>
+            <w:tcW w:w="2254" w:type="dxa"/>
+          </w:tcPr>
+          <w:p>
+            <w:pPr>
+              <w:rPr>
+                <w:rFonts w:eastAsia="Yu Mincho"/>
+                <w:lang w:val="en-US" w:eastAsia="ja-JP"/>
+              </w:rPr>
+            </w:pPr>
+            <w:r>
+              <w:rPr>
+                <w:rFonts w:eastAsia="Yu Mincho"/>
+                <w:lang w:val="en-US" w:eastAsia="ja-JP"/>
+              </w:rPr>
+              <w:t>Bipolar, multipolar</w:t>
+            </w:r>
+          </w:p>
+        </w:tc>
+        <w:tc>
+          <w:tcPr>
+            <w:tcW w:w="2254" w:type="dxa"/>
+          </w:tcPr>
+          <w:p>
+            <w:pPr>
+              <w:rPr>
+                <w:rFonts w:eastAsia="Yu Mincho"/>
+                <w:lang w:val="en-US" w:eastAsia="ja-JP"/>
+              </w:rPr>
+            </w:pPr>
+            <w:r>
+              <w:rPr>
+                <w:rFonts w:eastAsia="Yu Mincho"/>
+                <w:lang w:val="en-US" w:eastAsia="ja-JP"/>
+              </w:rPr>
+              <w:t>Hegemonic, rivalry, annexation prohibited</w:t>
+            </w:r>
+          </w:p>
+        </w:tc>
+      </w:tr>
+      <w:tr>
+        <w:tc>
+          <w:tcPr>
+            <w:tcW w:w="2254" w:type="dxa"/>
+          </w:tcPr>
+          <w:p>
+            <w:pPr>
+              <w:rPr>
+                <w:rFonts w:eastAsia="Yu Mincho"/>
+                <w:lang w:val="en-US" w:eastAsia="ja-JP"/>
+              </w:rPr>
+            </w:pPr>
+            <w:r>
+              <w:rPr>
+                <w:rFonts w:eastAsia="Yu Mincho"/>
+                <w:lang w:val="en-US" w:eastAsia="ja-JP"/>
+              </w:rPr>
+              <w:t>Warring States era (475-221BCE)</w:t>
+            </w:r>
+          </w:p>
+        </w:tc>
+        <w:tc>
+          <w:tcPr>
+            <w:tcW w:w="2254" w:type="dxa"/>
+          </w:tcPr>
+          <w:p>
+            <w:pPr>
+              <w:rPr>
+                <w:rFonts w:eastAsia="Yu Mincho"/>
+                <w:lang w:val="en-US" w:eastAsia="ja-JP"/>
+              </w:rPr>
+            </w:pPr>
+            <w:r>
+              <w:rPr>
+                <w:rFonts w:eastAsia="Yu Mincho"/>
+                <w:lang w:val="en-US" w:eastAsia="ja-JP"/>
+              </w:rPr>
+              <w:t>Monarchies</w:t>
+            </w:r>
+          </w:p>
+        </w:tc>
+        <w:tc>
+          <w:tcPr>
+            <w:tcW w:w="2254" w:type="dxa"/>
+          </w:tcPr>
+          <w:p>
+            <w:pPr>
+              <w:rPr>
+                <w:rFonts w:eastAsia="Yu Mincho"/>
+                <w:lang w:val="en-US" w:eastAsia="ja-JP"/>
+              </w:rPr>
+            </w:pPr>
+            <w:r>
+              <w:rPr>
+                <w:rFonts w:eastAsia="Yu Mincho"/>
+                <w:lang w:val="en-US" w:eastAsia="ja-JP"/>
+              </w:rPr>
+              <w:t>Multipolar</w:t>
+            </w:r>
+          </w:p>
+        </w:tc>
+        <w:tc>
+          <w:tcPr>
+            <w:tcW w:w="2254" w:type="dxa"/>
+          </w:tcPr>
+          <w:p>
+            <w:pPr>
+              <w:rPr>
+                <w:rFonts w:eastAsia="Yu Mincho"/>
+                <w:lang w:val="en-US" w:eastAsia="ja-JP"/>
+              </w:rPr>
+            </w:pPr>
+            <w:r>
+              <w:rPr>
+                <w:rFonts w:eastAsia="Yu Mincho"/>
+                <w:lang w:val="en-US" w:eastAsia="ja-JP"/>
+              </w:rPr>
+              <w:t>Annexation</w:t>
+            </w:r>
+          </w:p>
+        </w:tc>
+      </w:tr>
+      <w:tr>
+        <w:tc>
+          <w:tcPr>
+            <w:tcW w:w="2254" w:type="dxa"/>
+          </w:tcPr>
+          <w:p>
+            <w:pPr>
+              <w:rPr>
+                <w:rFonts w:eastAsia="Yu Mincho"/>
+                <w:lang w:val="en-US" w:eastAsia="ja-JP"/>
+              </w:rPr>
+            </w:pPr>
+            <w:r>
+              <w:rPr>
+                <w:rFonts w:eastAsia="Yu Mincho"/>
+                <w:lang w:val="en-US" w:eastAsia="ja-JP"/>
+              </w:rPr>
+              <w:t>Qin Dynasty</w:t>
+            </w:r>
+          </w:p>
+        </w:tc>
+        <w:tc>
+          <w:tcPr>
+            <w:tcW w:w="2254" w:type="dxa"/>
+          </w:tcPr>
+          <w:p>
+            <w:pPr>
+              <w:rPr>
+                <w:rFonts w:eastAsia="Yu Mincho"/>
+                <w:lang w:val="en-US" w:eastAsia="ja-JP"/>
+              </w:rPr>
+            </w:pPr>
+            <w:r>
+              <w:rPr>
+                <w:rFonts w:eastAsia="Yu Mincho"/>
+                <w:lang w:val="en-US" w:eastAsia="ja-JP"/>
+              </w:rPr>
+              <w:t>Empire</w:t>
+            </w:r>
+          </w:p>
+        </w:tc>
+        <w:tc>
+          <w:tcPr>
+            <w:tcW w:w="2254" w:type="dxa"/>
+          </w:tcPr>
+          <w:p>
+            <w:pPr>
+              <w:rPr>
+                <w:rFonts w:eastAsia="Yu Mincho"/>
+                <w:lang w:val="en-US" w:eastAsia="ja-JP"/>
+              </w:rPr>
+            </w:pPr>
+            <w:r>
+              <w:rPr>
+                <w:rFonts w:eastAsia="Yu Mincho"/>
+                <w:lang w:val="en-US" w:eastAsia="ja-JP"/>
+              </w:rPr>
+              <w:t>Multipolar, bipolar</w:t>
+            </w:r>
+          </w:p>
+        </w:tc>
+        <w:tc>
+          <w:tcPr>
+            <w:tcW w:w="2254" w:type="dxa"/>
+          </w:tcPr>
+          <w:p>
+            <w:pPr>
+              <w:rPr>
+                <w:rFonts w:eastAsia="Yu Mincho"/>
+                <w:lang w:val="en-US" w:eastAsia="ja-JP"/>
+              </w:rPr>
+            </w:pPr>
+            <w:r>
+              <w:rPr>
+                <w:rFonts w:eastAsia="Yu Mincho"/>
+                <w:lang w:val="en-US" w:eastAsia="ja-JP"/>
+              </w:rPr>
+              <w:t>Annexation</w:t>
+            </w:r>
+          </w:p>
+        </w:tc>
+      </w:tr>
+      <w:tr>
+        <w:tc>
+          <w:tcPr>
+            <w:tcW w:w="9016" w:type="dxa"/>
+            <w:gridSpan w:val="4"/>
+          </w:tcPr>
+          <w:p>
+            <w:pPr>
+              <w:rPr>
+                <w:rFonts w:eastAsia="Yu Mincho"/>
+                <w:lang w:val="en-US" w:eastAsia="ja-JP"/>
+              </w:rPr>
+            </w:pPr>
+            <w:r>
+              <w:rPr>
+                <w:rFonts w:eastAsia="Yu Mincho"/>
+                <w:lang w:val="en-US" w:eastAsia="ja-JP"/>
+              </w:rPr>
+              <w:t>EUROPE</w:t>
+            </w:r>
+          </w:p>
+        </w:tc>
+      </w:tr>
+      <w:tr>
+        <w:tc>
+          <w:tcPr>
+            <w:tcW w:w="2254" w:type="dxa"/>
+          </w:tcPr>
+          <w:p>
+            <w:pPr>
+              <w:rPr>
+                <w:rFonts w:eastAsia="Yu Mincho"/>
+                <w:lang w:val="en-US" w:eastAsia="ja-JP"/>
+              </w:rPr>
+            </w:pPr>
+            <w:r>
+              <w:rPr>
+                <w:rFonts w:eastAsia="Yu Mincho"/>
+                <w:lang w:val="en-US" w:eastAsia="ja-JP"/>
+              </w:rPr>
+              <w:t>Roman Era</w:t>
+            </w:r>
+          </w:p>
+        </w:tc>
+        <w:tc>
+          <w:tcPr>
+            <w:tcW w:w="2254" w:type="dxa"/>
+          </w:tcPr>
+          <w:p>
+            <w:pPr>
+              <w:rPr>
+                <w:rFonts w:eastAsia="Yu Mincho"/>
+                <w:lang w:val="en-US" w:eastAsia="ja-JP"/>
+              </w:rPr>
+            </w:pPr>
+            <w:r>
+              <w:rPr>
+                <w:rFonts w:eastAsia="Yu Mincho"/>
+                <w:lang w:val="en-US" w:eastAsia="ja-JP"/>
+              </w:rPr>
+              <w:t>Empire</w:t>
+            </w:r>
+          </w:p>
+        </w:tc>
+        <w:tc>
+          <w:tcPr>
+            <w:tcW w:w="2254" w:type="dxa"/>
+          </w:tcPr>
+          <w:p>
+            <w:pPr>
+              <w:rPr>
+                <w:rFonts w:eastAsia="Yu Mincho"/>
+                <w:lang w:val="en-US" w:eastAsia="ja-JP"/>
+              </w:rPr>
+            </w:pPr>
+            <w:r>
+              <w:rPr>
+                <w:rFonts w:eastAsia="Yu Mincho"/>
+                <w:lang w:val="en-US" w:eastAsia="ja-JP"/>
+              </w:rPr>
+              <w:t>Multipolar,bipolar</w:t>
+            </w:r>
+          </w:p>
+        </w:tc>
+        <w:tc>
+          <w:tcPr>
+            <w:tcW w:w="2254" w:type="dxa"/>
+          </w:tcPr>
+          <w:p>
+            <w:pPr>
+              <w:rPr>
+                <w:rFonts w:eastAsia="Yu Mincho"/>
+                <w:lang w:val="en-US" w:eastAsia="ja-JP"/>
+              </w:rPr>
+            </w:pPr>
+            <w:r>
+              <w:rPr>
+                <w:rFonts w:eastAsia="Yu Mincho"/>
+                <w:lang w:val="en-US" w:eastAsia="ja-JP"/>
+              </w:rPr>
+              <w:t>Annexation</w:t>
+            </w:r>
+          </w:p>
+        </w:tc>
+      </w:tr>
+      <w:tr>
+        <w:tc>
+          <w:tcPr>
+            <w:tcW w:w="2254" w:type="dxa"/>
+          </w:tcPr>
+          <w:p>
+            <w:pPr>
+              <w:rPr>
+                <w:rFonts w:eastAsia="Yu Mincho"/>
+                <w:lang w:val="en-US" w:eastAsia="ja-JP"/>
+              </w:rPr>
+            </w:pPr>
+            <w:r>
+              <w:rPr>
+                <w:rFonts w:eastAsia="Yu Mincho"/>
+                <w:lang w:val="en-US" w:eastAsia="ja-JP"/>
+              </w:rPr>
+              <w:t>Middle Ages</w:t>
+            </w:r>
+          </w:p>
+        </w:tc>
+        <w:tc>
+          <w:tcPr>
+            <w:tcW w:w="2254" w:type="dxa"/>
+          </w:tcPr>
+          <w:p>
+            <w:pPr>
+              <w:rPr>
+                <w:rFonts w:eastAsia="Yu Mincho"/>
+                <w:lang w:val="en-US" w:eastAsia="ja-JP"/>
+              </w:rPr>
+            </w:pPr>
+            <w:r>
+              <w:rPr>
+                <w:rFonts w:eastAsia="Yu Mincho"/>
+                <w:lang w:val="en-US" w:eastAsia="ja-JP"/>
+              </w:rPr>
+              <w:t>The pope and kingdoms</w:t>
+            </w:r>
+          </w:p>
+        </w:tc>
+        <w:tc>
+          <w:tcPr>
+            <w:tcW w:w="2254" w:type="dxa"/>
+          </w:tcPr>
+          <w:p>
+            <w:pPr>
+              <w:rPr>
+                <w:rFonts w:eastAsia="Yu Mincho"/>
+                <w:lang w:val="en-US" w:eastAsia="ja-JP"/>
+              </w:rPr>
+            </w:pPr>
+            <w:r>
+              <w:rPr>
+                <w:rFonts w:eastAsia="Yu Mincho"/>
+                <w:lang w:val="en-US" w:eastAsia="ja-JP"/>
+              </w:rPr>
+              <w:t>Multipolar</w:t>
+            </w:r>
+          </w:p>
+        </w:tc>
+        <w:tc>
+          <w:tcPr>
+            <w:tcW w:w="2254" w:type="dxa"/>
+          </w:tcPr>
+          <w:p>
+            <w:pPr>
+              <w:rPr>
+                <w:rFonts w:eastAsia="Yu Mincho"/>
+                <w:lang w:val="en-US" w:eastAsia="ja-JP"/>
+              </w:rPr>
+            </w:pPr>
+            <w:r>
+              <w:rPr>
+                <w:rFonts w:eastAsia="Yu Mincho"/>
+                <w:lang w:val="en-US" w:eastAsia="ja-JP"/>
+              </w:rPr>
+              <w:t>Magisterium</w:t>
+            </w:r>
+          </w:p>
+        </w:tc>
+      </w:tr>
+      <w:tr>
+        <w:tc>
+          <w:tcPr>
+            <w:tcW w:w="2254" w:type="dxa"/>
+          </w:tcPr>
+          <w:p>
+            <w:pPr>
+              <w:rPr>
+                <w:rFonts w:eastAsia="Yu Mincho"/>
+                <w:lang w:val="en-US" w:eastAsia="ja-JP"/>
+              </w:rPr>
+            </w:pPr>
+            <w:r>
+              <w:rPr>
+                <w:rFonts w:eastAsia="Yu Mincho"/>
+                <w:lang w:val="en-US" w:eastAsia="ja-JP"/>
+              </w:rPr>
+              <w:t>Westphalia system</w:t>
+            </w:r>
+            <w:r>
+              <w:rPr>
+                <w:rFonts w:eastAsia="Yu Mincho"/>
+                <w:lang w:val="en-US" w:eastAsia="ja-JP"/>
+              </w:rPr>
+              <w:t>*</w:t>
+            </w:r>
+          </w:p>
+        </w:tc>
+        <w:tc>
+          <w:tcPr>
+            <w:tcW w:w="2254" w:type="dxa"/>
+          </w:tcPr>
+          <w:p>
+            <w:pPr>
+              <w:rPr>
+                <w:rFonts w:eastAsia="Yu Mincho"/>
+                <w:lang w:val="en-US" w:eastAsia="ja-JP"/>
+              </w:rPr>
+            </w:pPr>
+            <w:r>
+              <w:rPr>
+                <w:rFonts w:eastAsia="Yu Mincho"/>
+                <w:lang w:val="en-US" w:eastAsia="ja-JP"/>
+              </w:rPr>
+              <w:t>Empires and nation states</w:t>
+            </w:r>
+          </w:p>
+        </w:tc>
+        <w:tc>
+          <w:tcPr>
+            <w:tcW w:w="2254" w:type="dxa"/>
+          </w:tcPr>
+          <w:p>
+            <w:pPr>
+              <w:rPr>
+                <w:rFonts w:eastAsia="Yu Mincho"/>
+                <w:lang w:val="en-US" w:eastAsia="ja-JP"/>
+              </w:rPr>
+            </w:pPr>
+            <w:r>
+              <w:rPr>
+                <w:rFonts w:eastAsia="Yu Mincho"/>
+                <w:lang w:val="en-US" w:eastAsia="ja-JP"/>
+              </w:rPr>
+              <w:t>Multipolar</w:t>
+            </w:r>
+          </w:p>
+        </w:tc>
+        <w:tc>
+          <w:tcPr>
+            <w:tcW w:w="2254" w:type="dxa"/>
+          </w:tcPr>
+          <w:p>
+            <w:pPr>
+              <w:rPr>
+                <w:rFonts w:eastAsia="Yu Mincho"/>
+                <w:lang w:val="en-US" w:eastAsia="ja-JP"/>
+              </w:rPr>
+            </w:pPr>
+            <w:r>
+              <w:rPr>
+                <w:rFonts w:eastAsia="Yu Mincho"/>
+                <w:lang w:val="en-US" w:eastAsia="ja-JP"/>
+              </w:rPr>
+              <w:t>Sovereignty</w:t>
+            </w:r>
+          </w:p>
+        </w:tc>
+      </w:tr>
+      <w:tr>
+        <w:tc>
+          <w:tcPr>
+            <w:tcW w:w="2254" w:type="dxa"/>
+          </w:tcPr>
+          <w:p>
+            <w:pPr>
+              <w:rPr>
+                <w:rFonts w:eastAsia="Yu Mincho"/>
+                <w:lang w:val="en-US" w:eastAsia="ja-JP"/>
+              </w:rPr>
+            </w:pPr>
+            <w:r>
+              <w:rPr>
+                <w:rFonts w:eastAsia="Yu Mincho"/>
+                <w:lang w:val="en-US" w:eastAsia="ja-JP"/>
+              </w:rPr>
+              <w:t>Anti-France coalitions</w:t>
+            </w:r>
+            <w:r>
+              <w:rPr>
+                <w:rFonts w:eastAsia="Yu Mincho"/>
+                <w:lang w:val="en-US" w:eastAsia="ja-JP"/>
+              </w:rPr>
+              <w:t>*</w:t>
+            </w:r>
+          </w:p>
+        </w:tc>
+        <w:tc>
+          <w:tcPr>
+            <w:tcW w:w="2254" w:type="dxa"/>
+          </w:tcPr>
+          <w:p>
+            <w:pPr>
+              <w:rPr>
+                <w:rFonts w:eastAsia="Yu Mincho"/>
+                <w:lang w:val="en-US" w:eastAsia="ja-JP"/>
+              </w:rPr>
+            </w:pPr>
+            <w:r>
+              <w:rPr>
+                <w:rFonts w:eastAsia="Yu Mincho"/>
+                <w:lang w:val="en-US" w:eastAsia="ja-JP"/>
+              </w:rPr>
+              <w:t>Empire and nation-states</w:t>
+            </w:r>
+          </w:p>
+        </w:tc>
+        <w:tc>
+          <w:tcPr>
+            <w:tcW w:w="2254" w:type="dxa"/>
+          </w:tcPr>
+          <w:p>
+            <w:pPr>
+              <w:rPr>
+                <w:rFonts w:eastAsia="Yu Mincho"/>
+                <w:lang w:val="en-US" w:eastAsia="ja-JP"/>
+              </w:rPr>
+            </w:pPr>
+            <w:r>
+              <w:rPr>
+                <w:rFonts w:eastAsia="Yu Mincho"/>
+                <w:lang w:val="en-US" w:eastAsia="ja-JP"/>
+              </w:rPr>
+              <w:t>Mulipolar or bipolar</w:t>
+            </w:r>
+          </w:p>
+        </w:tc>
+        <w:tc>
+          <w:tcPr>
+            <w:tcW w:w="2254" w:type="dxa"/>
+          </w:tcPr>
+          <w:p>
+            <w:pPr>
+              <w:rPr>
+                <w:rFonts w:eastAsia="Yu Mincho"/>
+                <w:lang w:val="en-US" w:eastAsia="ja-JP"/>
+              </w:rPr>
+            </w:pPr>
+            <w:r>
+              <w:rPr>
+                <w:rFonts w:eastAsia="Yu Mincho"/>
+                <w:lang w:val="en-US" w:eastAsia="ja-JP"/>
+              </w:rPr>
+              <w:t>Interference in internal affairs</w:t>
+            </w:r>
+          </w:p>
+        </w:tc>
+      </w:tr>
+      <w:tr>
+        <w:tc>
+          <w:tcPr>
+            <w:tcW w:w="2254" w:type="dxa"/>
+          </w:tcPr>
+          <w:p>
+            <w:pPr>
+              <w:rPr>
+                <w:rFonts w:eastAsia="Yu Mincho"/>
+                <w:lang w:val="en-US" w:eastAsia="ja-JP"/>
+              </w:rPr>
+            </w:pPr>
+            <w:r>
+              <w:rPr>
+                <w:rFonts w:eastAsia="Yu Mincho"/>
+                <w:lang w:val="en-US" w:eastAsia="ja-JP"/>
+              </w:rPr>
+              <w:t>Vienna System</w:t>
+            </w:r>
+            <w:r>
+              <w:rPr>
+                <w:rFonts w:eastAsia="Yu Mincho"/>
+                <w:lang w:val="en-US" w:eastAsia="ja-JP"/>
+              </w:rPr>
+              <w:t>*</w:t>
+            </w:r>
+          </w:p>
+        </w:tc>
+        <w:tc>
+          <w:tcPr>
+            <w:tcW w:w="2254" w:type="dxa"/>
+          </w:tcPr>
+          <w:p>
+            <w:pPr>
+              <w:rPr>
+                <w:rFonts w:eastAsia="Yu Mincho"/>
+                <w:lang w:val="en-US" w:eastAsia="ja-JP"/>
+              </w:rPr>
+            </w:pPr>
+            <w:r>
+              <w:rPr>
+                <w:rFonts w:eastAsia="Yu Mincho"/>
+                <w:lang w:val="en-US" w:eastAsia="ja-JP"/>
+              </w:rPr>
+              <w:t>Empires and nation-states</w:t>
+            </w:r>
+          </w:p>
+        </w:tc>
+        <w:tc>
+          <w:tcPr>
+            <w:tcW w:w="2254" w:type="dxa"/>
+          </w:tcPr>
+          <w:p>
+            <w:pPr>
+              <w:rPr>
+                <w:rFonts w:eastAsia="Yu Mincho"/>
+                <w:lang w:val="en-US" w:eastAsia="ja-JP"/>
+              </w:rPr>
+            </w:pPr>
+            <w:r>
+              <w:rPr>
+                <w:rFonts w:eastAsia="Yu Mincho"/>
+                <w:lang w:val="en-US" w:eastAsia="ja-JP"/>
+              </w:rPr>
+              <w:t>Multipolar</w:t>
+            </w:r>
+          </w:p>
+        </w:tc>
+        <w:tc>
+          <w:tcPr>
+            <w:tcW w:w="2254" w:type="dxa"/>
+          </w:tcPr>
+          <w:p>
+            <w:pPr>
+              <w:rPr>
+                <w:rFonts w:eastAsia="Yu Mincho"/>
+                <w:lang w:val="en-US" w:eastAsia="ja-JP"/>
+              </w:rPr>
+            </w:pPr>
+            <w:r>
+              <w:rPr>
+                <w:rFonts w:eastAsia="Yu Mincho"/>
+                <w:lang w:val="en-US" w:eastAsia="ja-JP"/>
+              </w:rPr>
+              <w:t>Interference in internal affairs</w:t>
+            </w:r>
+          </w:p>
+        </w:tc>
+      </w:tr>
+      <w:tr>
+        <w:tc>
+          <w:tcPr>
+            <w:tcW w:w="9016" w:type="dxa"/>
+            <w:gridSpan w:val="4"/>
+          </w:tcPr>
+          <w:p>
+            <w:pPr>
+              <w:rPr>
+                <w:rFonts w:eastAsia="Yu Mincho"/>
+                <w:lang w:val="en-US" w:eastAsia="ja-JP"/>
+              </w:rPr>
+            </w:pPr>
+            <w:r>
+              <w:rPr>
+                <w:rFonts w:eastAsia="Yu Mincho"/>
+                <w:lang w:val="en-US" w:eastAsia="ja-JP"/>
+              </w:rPr>
+              <w:t>MUSLIM REGION</w:t>
+            </w:r>
+          </w:p>
+        </w:tc>
+      </w:tr>
+      <w:tr>
+        <w:tc>
+          <w:tcPr>
+            <w:tcW w:w="2254" w:type="dxa"/>
+          </w:tcPr>
+          <w:p>
+            <w:pPr>
+              <w:rPr>
+                <w:rFonts w:eastAsia="Yu Mincho"/>
+                <w:lang w:val="en-US" w:eastAsia="ja-JP"/>
+              </w:rPr>
+            </w:pPr>
+            <w:r>
+              <w:rPr>
+                <w:rFonts w:eastAsia="Yu Mincho"/>
+                <w:lang w:val="en-US" w:eastAsia="ja-JP"/>
+              </w:rPr>
+              <w:t>Post-Caliphate (8</w:t>
+            </w:r>
+            <w:r>
+              <w:rPr>
+                <w:rFonts w:eastAsia="Yu Mincho"/>
+                <w:vertAlign w:val="superscript"/>
+                <w:lang w:val="en-US" w:eastAsia="ja-JP"/>
+              </w:rPr>
+              <w:t>th</w:t>
+            </w:r>
+            <w:r>
+              <w:rPr>
+                <w:rFonts w:eastAsia="Yu Mincho"/>
+                <w:lang w:val="en-US" w:eastAsia="ja-JP"/>
+              </w:rPr>
+              <w:t>-14</w:t>
+            </w:r>
+            <w:r>
+              <w:rPr>
+                <w:rFonts w:eastAsia="Yu Mincho"/>
+                <w:vertAlign w:val="superscript"/>
+                <w:lang w:val="en-US" w:eastAsia="ja-JP"/>
+              </w:rPr>
+              <w:t>th</w:t>
+            </w:r>
+            <w:r>
+              <w:rPr>
+                <w:rFonts w:eastAsia="Yu Mincho"/>
+                <w:lang w:val="en-US" w:eastAsia="ja-JP"/>
+              </w:rPr>
+              <w:t xml:space="preserve"> centuries</w:t>
+            </w:r>
+          </w:p>
+        </w:tc>
+        <w:tc>
+          <w:tcPr>
+            <w:tcW w:w="2254" w:type="dxa"/>
+          </w:tcPr>
+          <w:p>
+            <w:pPr>
+              <w:rPr>
+                <w:rFonts w:eastAsia="Yu Mincho"/>
+                <w:lang w:val="en-US" w:eastAsia="ja-JP"/>
+              </w:rPr>
+            </w:pPr>
+            <w:r>
+              <w:rPr>
+                <w:rFonts w:eastAsia="Yu Mincho"/>
+                <w:lang w:val="en-US" w:eastAsia="ja-JP"/>
+              </w:rPr>
+              <w:t>City-states</w:t>
+            </w:r>
+          </w:p>
+        </w:tc>
+        <w:tc>
+          <w:tcPr>
+            <w:tcW w:w="2254" w:type="dxa"/>
+          </w:tcPr>
+          <w:p>
+            <w:pPr>
+              <w:rPr>
+                <w:rFonts w:eastAsia="Yu Mincho"/>
+                <w:lang w:val="en-US" w:eastAsia="ja-JP"/>
+              </w:rPr>
+            </w:pPr>
+            <w:r>
+              <w:rPr>
+                <w:rFonts w:eastAsia="Yu Mincho"/>
+                <w:lang w:val="en-US" w:eastAsia="ja-JP"/>
+              </w:rPr>
+              <w:t>Multipolar</w:t>
+            </w:r>
+          </w:p>
+        </w:tc>
+        <w:tc>
+          <w:tcPr>
+            <w:tcW w:w="2254" w:type="dxa"/>
+          </w:tcPr>
+          <w:p>
+            <w:pPr>
+              <w:rPr>
+                <w:rFonts w:eastAsia="Yu Mincho"/>
+                <w:lang w:val="en-US" w:eastAsia="ja-JP"/>
+              </w:rPr>
+            </w:pPr>
+            <w:r>
+              <w:rPr>
+                <w:rFonts w:eastAsia="Yu Mincho"/>
+                <w:lang w:val="en-US" w:eastAsia="ja-JP"/>
+              </w:rPr>
+              <w:t>Annexation</w:t>
+            </w:r>
+          </w:p>
+        </w:tc>
+      </w:tr>
+      <w:tr>
+        <w:tc>
+          <w:tcPr>
+            <w:tcW w:w="2254" w:type="dxa"/>
+          </w:tcPr>
+          <w:p>
+            <w:pPr>
+              <w:rPr>
+                <w:rFonts w:eastAsia="Yu Mincho"/>
+                <w:lang w:val="en-US" w:eastAsia="ja-JP"/>
+              </w:rPr>
+            </w:pPr>
+            <w:r>
+              <w:rPr>
+                <w:rFonts w:eastAsia="Yu Mincho"/>
+                <w:lang w:val="en-US" w:eastAsia="ja-JP"/>
+              </w:rPr>
+              <w:t>Ottoman period (14</w:t>
+            </w:r>
+            <w:r>
+              <w:rPr>
+                <w:rFonts w:eastAsia="Yu Mincho"/>
+                <w:vertAlign w:val="superscript"/>
+                <w:lang w:val="en-US" w:eastAsia="ja-JP"/>
+              </w:rPr>
+              <w:t>th</w:t>
+            </w:r>
+            <w:r>
+              <w:rPr>
+                <w:rFonts w:eastAsia="Yu Mincho"/>
+                <w:lang w:val="en-US" w:eastAsia="ja-JP"/>
+              </w:rPr>
+              <w:t>-16</w:t>
+            </w:r>
+            <w:r>
+              <w:rPr>
+                <w:rFonts w:eastAsia="Yu Mincho"/>
+                <w:vertAlign w:val="superscript"/>
+                <w:lang w:val="en-US" w:eastAsia="ja-JP"/>
+              </w:rPr>
+              <w:t>th</w:t>
+            </w:r>
+            <w:r>
+              <w:rPr>
+                <w:rFonts w:eastAsia="Yu Mincho"/>
+                <w:lang w:val="en-US" w:eastAsia="ja-JP"/>
+              </w:rPr>
+              <w:t xml:space="preserve"> centuries)</w:t>
+            </w:r>
+          </w:p>
+        </w:tc>
+        <w:tc>
+          <w:tcPr>
+            <w:tcW w:w="2254" w:type="dxa"/>
+          </w:tcPr>
+          <w:p>
+            <w:pPr>
+              <w:rPr>
+                <w:rFonts w:eastAsia="Yu Mincho"/>
+                <w:lang w:val="en-US" w:eastAsia="ja-JP"/>
+              </w:rPr>
+            </w:pPr>
+            <w:r>
+              <w:rPr>
+                <w:rFonts w:eastAsia="Yu Mincho"/>
+                <w:lang w:val="en-US" w:eastAsia="ja-JP"/>
+              </w:rPr>
+              <w:t>Empire</w:t>
+            </w:r>
+          </w:p>
+        </w:tc>
+        <w:tc>
+          <w:tcPr>
+            <w:tcW w:w="2254" w:type="dxa"/>
+          </w:tcPr>
+          <w:p>
+            <w:pPr>
+              <w:rPr>
+                <w:rFonts w:eastAsia="Yu Mincho"/>
+                <w:lang w:val="en-US" w:eastAsia="ja-JP"/>
+              </w:rPr>
+            </w:pPr>
+            <w:r>
+              <w:rPr>
+                <w:rFonts w:eastAsia="Yu Mincho"/>
+                <w:lang w:val="en-US" w:eastAsia="ja-JP"/>
+              </w:rPr>
+              <w:t>Unipolar</w:t>
+            </w:r>
+          </w:p>
+        </w:tc>
+        <w:tc>
+          <w:tcPr>
+            <w:tcW w:w="2254" w:type="dxa"/>
+          </w:tcPr>
+          <w:p>
+            <w:pPr>
+              <w:rPr>
+                <w:rFonts w:eastAsia="Yu Mincho"/>
+                <w:lang w:val="en-US" w:eastAsia="ja-JP"/>
+              </w:rPr>
+            </w:pPr>
+            <w:r>
+              <w:rPr>
+                <w:rFonts w:eastAsia="Yu Mincho"/>
+                <w:lang w:val="en-US" w:eastAsia="ja-JP"/>
+              </w:rPr>
+              <w:t>Annexation</w:t>
+            </w:r>
+          </w:p>
+        </w:tc>
+      </w:tr>
+      <w:tr>
+        <w:tc>
+          <w:tcPr>
+            <w:tcW w:w="9016" w:type="dxa"/>
+            <w:gridSpan w:val="4"/>
+          </w:tcPr>
+          <w:p>
+            <w:pPr>
+              <w:rPr>
+                <w:rFonts w:eastAsia="Yu Mincho"/>
+                <w:lang w:val="en-US" w:eastAsia="ja-JP"/>
+              </w:rPr>
+            </w:pPr>
+            <w:r>
+              <w:rPr>
+                <w:rFonts w:eastAsia="Yu Mincho"/>
+                <w:lang w:val="en-US" w:eastAsia="ja-JP"/>
+              </w:rPr>
+              <w:t>GLOBAL</w:t>
+            </w:r>
+          </w:p>
+        </w:tc>
+      </w:tr>
+      <w:tr>
+        <w:tc>
+          <w:tcPr>
+            <w:tcW w:w="2254" w:type="dxa"/>
+          </w:tcPr>
+          <w:p>
+            <w:pPr>
+              <w:rPr>
+                <w:rFonts w:eastAsia="Yu Mincho"/>
+                <w:lang w:val="en-US" w:eastAsia="ja-JP"/>
+              </w:rPr>
+            </w:pPr>
+            <w:r>
+              <w:rPr>
+                <w:rFonts w:eastAsia="Yu Mincho"/>
+                <w:lang w:val="en-US" w:eastAsia="ja-JP"/>
+              </w:rPr>
+              <w:t>Versalies-Washington system (1919-39)</w:t>
+            </w:r>
+          </w:p>
+        </w:tc>
+        <w:tc>
+          <w:tcPr>
+            <w:tcW w:w="2254" w:type="dxa"/>
+          </w:tcPr>
+          <w:p>
+            <w:pPr>
+              <w:rPr>
+                <w:rFonts w:eastAsia="Yu Mincho"/>
+                <w:lang w:val="en-US" w:eastAsia="ja-JP"/>
+              </w:rPr>
+            </w:pPr>
+            <w:r>
+              <w:rPr>
+                <w:rFonts w:eastAsia="Yu Mincho"/>
+                <w:lang w:val="en-US" w:eastAsia="ja-JP"/>
+              </w:rPr>
+              <w:t>Nation-states</w:t>
+            </w:r>
+          </w:p>
+        </w:tc>
+        <w:tc>
+          <w:tcPr>
+            <w:tcW w:w="2254" w:type="dxa"/>
+          </w:tcPr>
+          <w:p>
+            <w:pPr>
+              <w:rPr>
+                <w:rFonts w:eastAsia="Yu Mincho"/>
+                <w:lang w:val="en-US" w:eastAsia="ja-JP"/>
+              </w:rPr>
+            </w:pPr>
+            <w:r>
+              <w:rPr>
+                <w:rFonts w:eastAsia="Yu Mincho"/>
+                <w:lang w:val="en-US" w:eastAsia="ja-JP"/>
+              </w:rPr>
+              <w:t>Multipolar</w:t>
+            </w:r>
+          </w:p>
+        </w:tc>
+        <w:tc>
+          <w:tcPr>
+            <w:tcW w:w="2254" w:type="dxa"/>
+          </w:tcPr>
+          <w:p>
+            <w:pPr>
+              <w:rPr>
+                <w:rFonts w:eastAsia="Yu Mincho"/>
+                <w:lang w:val="en-US" w:eastAsia="ja-JP"/>
+              </w:rPr>
+            </w:pPr>
+            <w:r>
+              <w:rPr>
+                <w:rFonts w:eastAsia="Yu Mincho"/>
+                <w:lang w:val="en-US" w:eastAsia="ja-JP"/>
+              </w:rPr>
+              <w:t>Occupation and annexation?? (annexation?)</w:t>
+            </w:r>
+          </w:p>
+        </w:tc>
+      </w:tr>
+      <w:tr>
+        <w:tc>
+          <w:tcPr>
+            <w:tcW w:w="2254" w:type="dxa"/>
+          </w:tcPr>
+          <w:p>
+            <w:pPr>
+              <w:rPr>
+                <w:rFonts w:eastAsia="Yu Mincho"/>
+                <w:lang w:val="en-US" w:eastAsia="ja-JP"/>
+              </w:rPr>
+            </w:pPr>
+            <w:r>
+              <w:rPr>
+                <w:rFonts w:eastAsia="Yu Mincho"/>
+                <w:lang w:val="en-US" w:eastAsia="ja-JP"/>
+              </w:rPr>
+              <w:t>Yalta system (1945-)</w:t>
+            </w:r>
+          </w:p>
+        </w:tc>
+        <w:tc>
+          <w:tcPr>
+            <w:tcW w:w="2254" w:type="dxa"/>
+          </w:tcPr>
+          <w:p>
+            <w:pPr>
+              <w:rPr>
+                <w:rFonts w:eastAsia="Yu Mincho"/>
+                <w:lang w:val="en-US" w:eastAsia="ja-JP"/>
+              </w:rPr>
+            </w:pPr>
+            <w:r>
+              <w:rPr>
+                <w:rFonts w:eastAsia="Yu Mincho"/>
+                <w:lang w:val="en-US" w:eastAsia="ja-JP"/>
+              </w:rPr>
+              <w:t>Nation-states</w:t>
+            </w:r>
+          </w:p>
+        </w:tc>
+        <w:tc>
+          <w:tcPr>
+            <w:tcW w:w="2254" w:type="dxa"/>
+          </w:tcPr>
+          <w:p>
+            <w:pPr>
+              <w:rPr>
+                <w:rFonts w:eastAsia="Yu Mincho"/>
+                <w:lang w:val="en-US" w:eastAsia="ja-JP"/>
+              </w:rPr>
+            </w:pPr>
+            <w:r>
+              <w:rPr>
+                <w:rFonts w:eastAsia="Yu Mincho"/>
+                <w:lang w:val="en-US" w:eastAsia="ja-JP"/>
+              </w:rPr>
+              <w:t>Bipolar</w:t>
+            </w:r>
+          </w:p>
+        </w:tc>
+        <w:tc>
+          <w:tcPr>
+            <w:tcW w:w="2254" w:type="dxa"/>
+          </w:tcPr>
+          <w:p>
+            <w:pPr>
+              <w:rPr>
+                <w:rFonts w:eastAsia="Yu Mincho"/>
+                <w:lang w:val="en-US" w:eastAsia="ja-JP"/>
+              </w:rPr>
+            </w:pPr>
+            <w:r>
+              <w:rPr>
+                <w:rFonts w:eastAsia="Yu Mincho"/>
+                <w:lang w:val="en-US" w:eastAsia="ja-JP"/>
+              </w:rPr>
+              <w:t>Noninterference and nonannexation</w:t>
+            </w:r>
+          </w:p>
+        </w:tc>
+      </w:tr>
+    </w:tbl>
+    <w:p>
+      <w:pPr>
+        <w:ind w:left="360"/>
+        <w:rPr>
+          <w:rFonts w:eastAsia="Yu Mincho"/>
+          <w:lang w:val="en-US" w:eastAsia="ja-JP"/>
+        </w:rPr>
+      </w:pPr>
+      <w:r>
+        <w:rPr>
+          <w:rFonts w:eastAsia="Yu Mincho"/>
+          <w:lang w:val="en-US" w:eastAsia="ja-JP"/>
+        </w:rPr>
+        <w:t>*</w:t>
+      </w:r>
+      <w:r>
+        <w:rPr>
+          <w:rFonts w:eastAsia="Yu Mincho"/>
+          <w:lang w:val="en-US" w:eastAsia="ja-JP"/>
+        </w:rPr>
+        <w:t>Those systems are… disputable??</w:t>
+      </w:r>
+      <w:r>
+        <w:rPr>
+          <w:rFonts w:eastAsia="Yu Mincho"/>
+          <w:lang w:val="en-US" w:eastAsia="ja-JP"/>
+        </w:rPr>
+        <w:t xml:space="preserve"> (Anti-napolleonic system as the disturbance/transitional period… but we could laso call a versalies-washington system as transitional)</w:t>
+      </w:r>
+    </w:p>
+    <w:p>
+      <w:pPr>
+        <w:rPr>
+          <w:rFonts w:eastAsia="Yu Mincho"/>
+          <w:lang w:val="en-US" w:eastAsia="ja-JP"/>
+        </w:rPr>
+      </w:pPr>
+      <w:r>
+        <w:rPr>
+          <w:rFonts w:eastAsia="Yu Mincho"/>
+          <w:lang w:val="en-US" w:eastAsia="ja-JP"/>
+        </w:rPr>
+        <w:t>Actors here are understood as the mayor players, not all players.</w:t>
+      </w:r>
+    </w:p>
+    <w:p>
+      <w:pPr>
+        <w:rPr>
+          <w:rFonts w:eastAsia="Yu Mincho"/>
+          <w:lang w:val="en-US" w:eastAsia="ja-JP"/>
+        </w:rPr>
+      </w:pPr>
+      <w:r>
+        <w:rPr>
+          <w:rFonts w:eastAsia="Yu Mincho"/>
+          <w:lang w:val="en-US" w:eastAsia="ja-JP"/>
+        </w:rPr>
+        <w:t>Change in one of the categories doesn’t indicate change in system but change in at least two cateogires usually means that.</w:t>
+      </w:r>
+    </w:p>
+    <w:p>
+      <w:pPr>
+        <w:rPr>
+          <w:rFonts w:eastAsia="Yu Mincho"/>
+          <w:lang w:val="en-US" w:eastAsia="ja-JP"/>
+        </w:rPr>
+      </w:pPr>
+      <w:r>
+        <w:rPr>
+          <w:rFonts w:eastAsia="Yu Mincho"/>
+          <w:lang w:val="en-US" w:eastAsia="ja-JP"/>
+        </w:rPr>
+        <w:t>Power configuration changes faster than norms and normas changes fater than actors types.</w:t>
+      </w:r>
+    </w:p>
+    <w:p>
+      <w:pPr>
+        <w:pBdr>
+          <w:bottom w:val="single" w:sz="6" w:space="1" w:color="auto"/>
+        </w:pBdr>
+        <w:rPr>
+          <w:rFonts w:eastAsia="Yu Mincho"/>
+          <w:lang w:val="en-US" w:eastAsia="ja-JP"/>
+        </w:rPr>
+      </w:pPr>
+      <w:r>
+        <w:rPr>
+          <w:rFonts w:eastAsia="Yu Mincho"/>
+          <w:lang w:val="en-US" w:eastAsia="ja-JP"/>
+        </w:rPr>
+        <w:lastRenderedPageBreak/>
+        <w:t>‘It is a lot easier for a leadership to undermine capacity of the own state, than to increasy it’ thus weakening of the dominant power is usually the reason for changes in the international system, not the rise of a new power.</w:t>
+      </w:r>
+    </w:p>
+    <w:p>
+      <w:pPr>
+        <w:rPr>
+          <w:rFonts w:eastAsia="Yu Mincho"/>
+          <w:lang w:val="en-US" w:eastAsia="ja-JP"/>
+        </w:rPr>
+      </w:pPr>
+      <w:r>
+        <w:rPr>
+          <w:rFonts w:eastAsia="Yu Mincho"/>
+          <w:lang w:val="en-US" w:eastAsia="ja-JP"/>
+        </w:rPr>
+        <w:t>Chapter 8</w:t>
+      </w:r>
+    </w:p>
+    <w:p>
+      <w:pPr>
+        <w:rPr>
+          <w:rFonts w:eastAsia="Yu Mincho"/>
+          <w:lang w:val="en-US" w:eastAsia="ja-JP"/>
+        </w:rPr>
+      </w:pPr>
+      <w:r>
+        <w:rPr>
+          <w:rFonts w:eastAsia="Yu Mincho"/>
+          <w:lang w:val="en-US" w:eastAsia="ja-JP"/>
+        </w:rPr>
+        <w:t>Historical Cases of System Transformation</w:t>
+      </w:r>
+    </w:p>
+    <w:p>
+      <w:pPr>
+        <w:rPr>
+          <w:rFonts w:eastAsia="Yu Mincho"/>
+          <w:lang w:val="en-US" w:eastAsia="ja-JP"/>
+        </w:rPr>
+      </w:pPr>
+      <w:r>
+        <w:rPr>
+          <w:rFonts w:eastAsia="Yu Mincho"/>
+          <w:lang w:val="en-US" w:eastAsia="ja-JP"/>
+        </w:rPr>
+        <w:t>Western Zhou Dynasty – from human authority -&gt; hegemony -&gt; tyranny</w:t>
+      </w:r>
+    </w:p>
+    <w:p>
+      <w:pPr>
+        <w:rPr>
+          <w:rFonts w:eastAsia="Yu Mincho"/>
+          <w:lang w:val="en-US" w:eastAsia="ja-JP"/>
+        </w:rPr>
+      </w:pPr>
+      <w:r>
+        <w:rPr>
+          <w:rFonts w:eastAsia="Yu Mincho"/>
+          <w:lang w:val="en-US" w:eastAsia="ja-JP"/>
+        </w:rPr>
+        <w:t>Interaction between states changed from moral -&gt; double standards -&gt; realpolitik -&gt; coward-bully.</w:t>
+      </w:r>
+    </w:p>
+    <w:p>
+      <w:pPr>
+        <w:rPr>
+          <w:rFonts w:eastAsia="Yu Mincho"/>
+          <w:lang w:val="en-US" w:eastAsia="ja-JP"/>
+        </w:rPr>
+      </w:pPr>
+    </w:p>
+    <w:p>
+      <w:pPr>
+        <w:rPr>
+          <w:rFonts w:eastAsia="Yu Mincho"/>
+          <w:lang w:val="en-US" w:eastAsia="ja-JP"/>
+        </w:rPr>
+      </w:pPr>
+      <w:r>
+        <w:rPr>
+          <w:rFonts w:eastAsia="Yu Mincho"/>
+          <w:lang w:val="en-US" w:eastAsia="ja-JP"/>
+        </w:rPr>
+        <w:t>The system starter to falter when one of the Zhous Kings (Mu) decided to attack one of the northern states over tribute that they did not provided (accordiong to the law, they did not had to do that)l Mu won the w</w:t>
+      </w:r>
+      <w:r>
+        <w:rPr>
+          <w:rFonts w:eastAsia="Yu Mincho"/>
+          <w:lang w:val="en-US" w:eastAsia="ja-JP"/>
+        </w:rPr>
+        <w:t>a</w:t>
+      </w:r>
+      <w:r>
+        <w:rPr>
+          <w:rFonts w:eastAsia="Yu Mincho"/>
+          <w:lang w:val="en-US" w:eastAsia="ja-JP"/>
+        </w:rPr>
+        <w:t>r bust demaged system.</w:t>
+      </w:r>
+      <w:r>
+        <w:rPr>
+          <w:rFonts w:eastAsia="Yu Mincho"/>
+          <w:lang w:val="en-US" w:eastAsia="ja-JP"/>
+        </w:rPr>
+        <w:t xml:space="preserve"> Moreover, he did not waged wars (for a tribute) against tribes with a similar cultural background to his.</w:t>
+      </w:r>
+      <w:r>
+        <w:rPr>
+          <w:rFonts w:eastAsia="Yu Mincho"/>
+          <w:lang w:val="en-US" w:eastAsia="ja-JP"/>
+        </w:rPr>
+        <w:t xml:space="preserve"> </w:t>
+      </w:r>
+    </w:p>
+    <w:p>
+      <w:pPr>
+        <w:rPr>
+          <w:rFonts w:eastAsia="Yu Mincho"/>
+          <w:lang w:val="en-US" w:eastAsia="ja-JP"/>
+        </w:rPr>
+      </w:pPr>
+    </w:p>
+    <w:p>
+      <w:pPr>
+        <w:rPr>
+          <w:rFonts w:eastAsia="Yu Mincho"/>
+          <w:lang w:val="en-US" w:eastAsia="ja-JP"/>
+        </w:rPr>
+      </w:pPr>
+      <w:r>
+        <w:rPr>
+          <w:rFonts w:eastAsia="Yu Mincho"/>
+          <w:lang w:val="en-US" w:eastAsia="ja-JP"/>
+        </w:rPr>
+        <w:t>When the Zhou Dynasty stopped being dominant, other mayor states begined the hegemonistic rule. Non of them tried to establish new moral rules. It started on the (flawed?) double-standard premise. System got stabilized by the system of alliances, but not norms. However, the alliance itself also demanded, from its members, to respected some laws, including showing respect to the Zhou king even if he was only a nominal king. Yet, this period was chaotic and violent in comparison to the Western Zhou period.</w:t>
+      </w:r>
+    </w:p>
+    <w:p>
+      <w:pPr>
+        <w:rPr>
+          <w:rFonts w:eastAsia="Yu Mincho"/>
+          <w:lang w:val="en-US" w:eastAsia="ja-JP"/>
+        </w:rPr>
+      </w:pPr>
+    </w:p>
+    <w:p>
+      <w:pPr>
+        <w:rPr>
+          <w:rFonts w:eastAsia="Yu Mincho"/>
+          <w:lang w:val="en-US" w:eastAsia="ja-JP"/>
+        </w:rPr>
+      </w:pPr>
+      <w:r>
+        <w:rPr>
+          <w:rFonts w:eastAsia="Yu Mincho"/>
+          <w:lang w:val="en-US" w:eastAsia="ja-JP"/>
+        </w:rPr>
+        <w:t>Warring state period wasbased around realpolitik.</w:t>
+      </w:r>
+    </w:p>
+    <w:p>
+      <w:pPr>
+        <w:rPr>
+          <w:rFonts w:eastAsia="Yu Mincho"/>
+          <w:lang w:val="en-US" w:eastAsia="ja-JP"/>
+        </w:rPr>
+      </w:pPr>
+      <w:r>
+        <w:rPr>
+          <w:rFonts w:eastAsia="Yu Mincho"/>
+          <w:lang w:val="en-US" w:eastAsia="ja-JP"/>
+        </w:rPr>
+        <w:t>Warring state period resulted with a victory of the Qin dynasty and establishing the hierarchical order under a singular empire.</w:t>
+      </w:r>
+    </w:p>
+    <w:p>
+      <w:pPr>
+        <w:rPr>
+          <w:rFonts w:eastAsia="Yu Mincho"/>
+          <w:lang w:val="en-US" w:eastAsia="ja-JP"/>
+        </w:rPr>
+      </w:pPr>
+      <w:r>
+        <w:rPr>
+          <w:rFonts w:eastAsia="Yu Mincho"/>
+          <w:lang w:val="en-US" w:eastAsia="ja-JP"/>
+        </w:rPr>
+        <w:br/>
+        <w:t>It is interesting that Yan Xuetong sees British Empire mercantile policy as the implementation of realipolitik.</w:t>
+      </w:r>
+    </w:p>
+    <w:p>
+      <w:pPr>
+        <w:rPr>
+          <w:rFonts w:eastAsia="Yu Mincho"/>
+          <w:lang w:val="en-US" w:eastAsia="ja-JP"/>
+        </w:rPr>
+      </w:pPr>
+      <w:r>
+        <w:rPr>
+          <w:rFonts w:eastAsia="Yu Mincho"/>
+          <w:lang w:val="en-US" w:eastAsia="ja-JP"/>
+        </w:rPr>
+        <w:t>In 1896 GB acknowledged ‘glorious isolation’ policy, signifying that its foreign policy would never be bound by international treaties under any circumstances???</w:t>
+      </w:r>
+      <w:r>
+        <w:rPr>
+          <w:rFonts w:eastAsia="Yu Mincho"/>
+          <w:lang w:val="en-US" w:eastAsia="ja-JP"/>
+        </w:rPr>
+        <w:t xml:space="preserve"> (in practice, this policy was used between 1870 and early 1900 as the imperial overstreatched put a demand on GB to seek for allies.</w:t>
+      </w:r>
+    </w:p>
+    <w:p>
+      <w:pPr>
+        <w:rPr>
+          <w:rFonts w:eastAsia="Yu Mincho"/>
+          <w:lang w:val="en-US" w:eastAsia="ja-JP"/>
+        </w:rPr>
+      </w:pPr>
+      <w:r>
+        <w:rPr>
+          <w:rFonts w:eastAsia="Yu Mincho"/>
+          <w:lang w:val="en-US" w:eastAsia="ja-JP"/>
+        </w:rPr>
+        <w:t xml:space="preserve">GB at first made an agreement with Gemrany that they will divide portugeese colonies only to 1 year later make an agreement with Portugal where they said that they wont do </w:t>
+      </w:r>
+      <w:r>
+        <w:rPr>
+          <w:rFonts w:eastAsia="Yu Mincho"/>
+          <w:lang w:val="en-US" w:eastAsia="ja-JP"/>
+        </w:rPr>
+        <w:lastRenderedPageBreak/>
+        <w:t>it. They made the agreement with France in 1904 and with Russia in 1907, against Gemrany but in 1909 they startet to negotiate with Germany the naval force limits.</w:t>
+      </w:r>
+    </w:p>
+    <w:p>
+      <w:pPr>
+        <w:rPr>
+          <w:rFonts w:eastAsia="Yu Mincho"/>
+          <w:lang w:val="en-US" w:eastAsia="ja-JP"/>
+        </w:rPr>
+      </w:pPr>
+      <w:r>
+        <w:rPr>
+          <w:rFonts w:eastAsia="Yu Mincho"/>
+          <w:lang w:val="en-US" w:eastAsia="ja-JP"/>
+        </w:rPr>
+        <w:t>On July 9 GB notified the German ambassador that GB is no ally to neither France of Rusia??</w:t>
+      </w:r>
+      <w:r>
+        <w:rPr>
+          <w:rFonts w:eastAsia="Yu Mincho"/>
+          <w:lang w:val="en-US" w:eastAsia="ja-JP"/>
+        </w:rPr>
+        <w:t xml:space="preserve"> And 2 days before war they stated that they will remain neutral.</w:t>
+      </w:r>
+    </w:p>
+    <w:p>
+      <w:pPr>
+        <w:rPr>
+          <w:rFonts w:eastAsia="Yu Mincho"/>
+          <w:lang w:val="en-US" w:eastAsia="ja-JP"/>
+        </w:rPr>
+      </w:pPr>
+    </w:p>
+    <w:p>
+      <w:pPr>
+        <w:rPr>
+          <w:rFonts w:eastAsia="Yu Mincho"/>
+          <w:lang w:val="en-US" w:eastAsia="ja-JP"/>
+        </w:rPr>
+      </w:pPr>
+      <w:r>
+        <w:rPr>
+          <w:rFonts w:eastAsia="Yu Mincho"/>
+          <w:lang w:val="en-US" w:eastAsia="ja-JP"/>
+        </w:rPr>
+        <w:t xml:space="preserve">US in a cold war era was acting like a hegemon but when they declared theirs intensions and created alliance, they decided to keep theirs promieses (hmmm, maybe I nEurope but also not always). However USSR have broken its alliance with Yugoslavia, canceled aid for China (air support), attacked Hungary and Chechoslovakia, something tha US never (YET) did to its allies. </w:t>
+      </w:r>
+    </w:p>
+    <w:p>
+      <w:pPr>
+        <w:rPr>
+          <w:rFonts w:eastAsia="Yu Mincho"/>
+          <w:lang w:val="en-US" w:eastAsia="ja-JP"/>
+        </w:rPr>
+      </w:pPr>
+      <w:r>
+        <w:rPr>
+          <w:rFonts w:eastAsia="Yu Mincho"/>
+          <w:lang w:val="en-US" w:eastAsia="ja-JP"/>
+        </w:rPr>
+        <w:t>“Democratic Peace” theory is the example of double standards in dealings on international stage.</w:t>
+      </w:r>
+    </w:p>
+    <w:p>
+      <w:pPr>
+        <w:pBdr>
+          <w:bottom w:val="single" w:sz="6" w:space="1" w:color="auto"/>
+        </w:pBdr>
+        <w:rPr>
+          <w:rFonts w:eastAsia="Yu Mincho"/>
+          <w:lang w:val="en-US" w:eastAsia="ja-JP"/>
+        </w:rPr>
+      </w:pPr>
+    </w:p>
+    <w:p>
+      <w:pPr>
+        <w:rPr>
+          <w:rFonts w:eastAsia="Yu Mincho"/>
+          <w:lang w:val="en-US" w:eastAsia="ja-JP"/>
+        </w:rPr>
+      </w:pPr>
+      <w:r>
+        <w:rPr>
+          <w:rFonts w:eastAsia="Yu Mincho"/>
+          <w:lang w:val="en-US" w:eastAsia="ja-JP"/>
+        </w:rPr>
+        <w:t xml:space="preserve">Chapter 9 </w:t>
+      </w:r>
+    </w:p>
+    <w:p>
+      <w:pPr>
+        <w:rPr>
+          <w:rFonts w:eastAsia="Yu Mincho"/>
+          <w:lang w:val="en-US" w:eastAsia="ja-JP"/>
+        </w:rPr>
+      </w:pPr>
+      <w:r>
+        <w:rPr>
+          <w:rFonts w:eastAsia="Yu Mincho"/>
+          <w:lang w:val="en-US" w:eastAsia="ja-JP"/>
+        </w:rPr>
+        <w:t>Conclusion</w:t>
       </w:r>
     </w:p>
     <w:sectPr>
@@ -3943,6 +5886,126 @@
     </w:sectPr>
   </w:body>
 </w:document>
+</file>
+
+<file path=word/numbering.xml><?xml version="1.0" encoding="utf-8"?>
+<w:numbering xmlns:wpc="http://schemas.microsoft.com/office/word/2010/wordprocessingCanvas" xmlns:cx="http://schemas.microsoft.com/office/drawing/2014/chartex" xmlns:cx1="http://schemas.microsoft.com/office/drawing/2015/9/8/chartex" xmlns:cx2="http://schemas.microsoft.com/office/drawing/2015/10/21/chartex" xmlns:cx3="http://schemas.microsoft.com/office/drawing/2016/5/9/chartex" xmlns:cx4="http://schemas.microsoft.com/office/drawing/2016/5/10/chartex" xmlns:cx5="http://schemas.microsoft.com/office/drawing/2016/5/11/chartex" xmlns:cx6="http://schemas.microsoft.com/office/drawing/2016/5/12/chartex" xmlns:cx7="http://schemas.microsoft.com/office/drawing/2016/5/13/chartex" xmlns:cx8="http://schemas.microsoft.com/office/drawing/2016/5/14/chartex" xmlns:mc="http://schemas.openxmlformats.org/markup-compatibility/2006" xmlns:aink="http://schemas.microsoft.com/office/drawing/2016/ink" xmlns:am3d="http://schemas.microsoft.com/office/drawing/2017/model3d" xmlns:o="urn:schemas-microsoft-com:office:office" xmlns:oel="http://schemas.microsoft.com/office/2019/extlst" xmlns:r="http://schemas.openxmlformats.org/officeDocument/2006/relationships" xmlns:m="http://schemas.openxmlformats.org/officeDocument/2006/math" xmlns:v="urn:schemas-microsoft-com:vml" xmlns:wp14="http://schemas.microsoft.com/office/word/2010/wordprocessingDrawing" xmlns:wp="http://schemas.openxmlformats.org/drawingml/2006/wordprocessingDrawing" xmlns:w10="urn:schemas-microsoft-com:office:word" xmlns:w="http://schemas.openxmlformats.org/wordprocessingml/2006/main" xmlns:w14="http://schemas.microsoft.com/office/word/2010/wordml" xmlns:w15="http://schemas.microsoft.com/office/word/2012/wordml" xmlns:w16cex="http://schemas.microsoft.com/office/word/2018/wordml/cex" xmlns:w16cid="http://schemas.microsoft.com/office/word/2016/wordml/cid" xmlns:w16="http://schemas.microsoft.com/office/word/2018/wordml" xmlns:w16du="http://schemas.microsoft.com/office/word/2023/wordml/word16du" xmlns:w16sdtdh="http://schemas.microsoft.com/office/word/2020/wordml/sdtdatahash" xmlns:w16sdtfl="http://schemas.microsoft.com/office/word/2024/wordml/sdtformatlock" xmlns:w16se="http://schemas.microsoft.com/office/word/2015/wordml/symex" xmlns:wpg="http://schemas.microsoft.com/office/word/2010/wordprocessingGroup" xmlns:wpi="http://schemas.microsoft.com/office/word/2010/wordprocessingInk" xmlns:wne="http://schemas.microsoft.com/office/word/2006/wordml" xmlns:wps="http://schemas.microsoft.com/office/word/2010/wordprocessingShape" mc:Ignorable="w14 w15 w16se w16cid w16 w16cex w16sdtdh w16sdtfl w16du wp14">
+  <w:abstractNum w:abstractNumId="0" w15:restartNumberingAfterBreak="0">
+    <w:nsid w:val="03446945"/>
+    <w:multiLevelType w:val="hybridMultilevel"/>
+    <w:tmpl w:val="2F6E0100"/>
+    <w:lvl w:ilvl="0" w:tplc="CF742B72">
+      <w:numFmt w:val="bullet"/>
+      <w:lvlText w:val=""/>
+      <w:lvlJc w:val="left"/>
+      <w:pPr>
+        <w:ind w:left="720" w:hanging="360"/>
+      </w:pPr>
+      <w:rPr>
+        <w:rFonts w:ascii="Symbol" w:eastAsia="Yu Mincho" w:hAnsi="Symbol" w:cstheme="minorBidi" w:hint="default"/>
+      </w:rPr>
+    </w:lvl>
+    <w:lvl w:ilvl="1" w:tplc="04150003" w:tentative="1">
+      <w:start w:val="1"/>
+      <w:numFmt w:val="bullet"/>
+      <w:lvlText w:val="o"/>
+      <w:lvlJc w:val="left"/>
+      <w:pPr>
+        <w:ind w:left="1440" w:hanging="360"/>
+      </w:pPr>
+      <w:rPr>
+        <w:rFonts w:ascii="Courier New" w:hAnsi="Courier New" w:cs="Courier New" w:hint="default"/>
+      </w:rPr>
+    </w:lvl>
+    <w:lvl w:ilvl="2" w:tplc="04150005" w:tentative="1">
+      <w:start w:val="1"/>
+      <w:numFmt w:val="bullet"/>
+      <w:lvlText w:val=""/>
+      <w:lvlJc w:val="left"/>
+      <w:pPr>
+        <w:ind w:left="2160" w:hanging="360"/>
+      </w:pPr>
+      <w:rPr>
+        <w:rFonts w:ascii="Wingdings" w:hAnsi="Wingdings" w:hint="default"/>
+      </w:rPr>
+    </w:lvl>
+    <w:lvl w:ilvl="3" w:tplc="04150001" w:tentative="1">
+      <w:start w:val="1"/>
+      <w:numFmt w:val="bullet"/>
+      <w:lvlText w:val=""/>
+      <w:lvlJc w:val="left"/>
+      <w:pPr>
+        <w:ind w:left="2880" w:hanging="360"/>
+      </w:pPr>
+      <w:rPr>
+        <w:rFonts w:ascii="Symbol" w:hAnsi="Symbol" w:hint="default"/>
+      </w:rPr>
+    </w:lvl>
+    <w:lvl w:ilvl="4" w:tplc="04150003" w:tentative="1">
+      <w:start w:val="1"/>
+      <w:numFmt w:val="bullet"/>
+      <w:lvlText w:val="o"/>
+      <w:lvlJc w:val="left"/>
+      <w:pPr>
+        <w:ind w:left="3600" w:hanging="360"/>
+      </w:pPr>
+      <w:rPr>
+        <w:rFonts w:ascii="Courier New" w:hAnsi="Courier New" w:cs="Courier New" w:hint="default"/>
+      </w:rPr>
+    </w:lvl>
+    <w:lvl w:ilvl="5" w:tplc="04150005" w:tentative="1">
+      <w:start w:val="1"/>
+      <w:numFmt w:val="bullet"/>
+      <w:lvlText w:val=""/>
+      <w:lvlJc w:val="left"/>
+      <w:pPr>
+        <w:ind w:left="4320" w:hanging="360"/>
+      </w:pPr>
+      <w:rPr>
+        <w:rFonts w:ascii="Wingdings" w:hAnsi="Wingdings" w:hint="default"/>
+      </w:rPr>
+    </w:lvl>
+    <w:lvl w:ilvl="6" w:tplc="04150001" w:tentative="1">
+      <w:start w:val="1"/>
+      <w:numFmt w:val="bullet"/>
+      <w:lvlText w:val=""/>
+      <w:lvlJc w:val="left"/>
+      <w:pPr>
+        <w:ind w:left="5040" w:hanging="360"/>
+      </w:pPr>
+      <w:rPr>
+        <w:rFonts w:ascii="Symbol" w:hAnsi="Symbol" w:hint="default"/>
+      </w:rPr>
+    </w:lvl>
+    <w:lvl w:ilvl="7" w:tplc="04150003" w:tentative="1">
+      <w:start w:val="1"/>
+      <w:numFmt w:val="bullet"/>
+      <w:lvlText w:val="o"/>
+      <w:lvlJc w:val="left"/>
+      <w:pPr>
+        <w:ind w:left="5760" w:hanging="360"/>
+      </w:pPr>
+      <w:rPr>
+        <w:rFonts w:ascii="Courier New" w:hAnsi="Courier New" w:cs="Courier New" w:hint="default"/>
+      </w:rPr>
+    </w:lvl>
+    <w:lvl w:ilvl="8" w:tplc="04150005" w:tentative="1">
+      <w:start w:val="1"/>
+      <w:numFmt w:val="bullet"/>
+      <w:lvlText w:val=""/>
+      <w:lvlJc w:val="left"/>
+      <w:pPr>
+        <w:ind w:left="6480" w:hanging="360"/>
+      </w:pPr>
+      <w:rPr>
+        <w:rFonts w:ascii="Wingdings" w:hAnsi="Wingdings" w:hint="default"/>
+      </w:rPr>
+    </w:lvl>
+  </w:abstractNum>
+  <w:num w:numId="1" w16cid:durableId="1548948690">
+    <w:abstractNumId w:val="0"/>
+  </w:num>
+</w:numbering>
 </file>
 
 <file path=word/styles.xml><?xml version="1.0" encoding="utf-8"?>

</xml_diff>